<commit_message>
Add STM32 flight project and FreeRTOS study notes
- Add CubeMX-generated flight controller project (Core, HAL drivers, Keil MDK-ARM)
- Add common module (Com_debug) and custom driver source
- Add FreeRTOS porting notes and study markdown
- Update README Com_filter description and 配置操作.docx
- Exclude unused CMSIS components and Word temp files from git

Co-Authored-By: Claude Opus 4.8 (1M context) <noreply@anthropic.com>
</commit_message>
<xml_diff>
--- a/配置操作.docx
+++ b/配置操作.docx
@@ -1,19 +1,19 @@
 
 <file path=word/document.xml><?xml version="1.0" encoding="utf-8"?>
-<w:document xmlns:wpc="http://schemas.microsoft.com/office/word/2010/wordprocessingCanvas" xmlns:cx="http://schemas.microsoft.com/office/drawing/2014/chartex" xmlns:cx1="http://schemas.microsoft.com/office/drawing/2015/9/8/chartex" xmlns:cx2="http://schemas.microsoft.com/office/drawing/2015/10/21/chartex" xmlns:cx3="http://schemas.microsoft.com/office/drawing/2016/5/9/chartex" xmlns:cx4="http://schemas.microsoft.com/office/drawing/2016/5/10/chartex" xmlns:cx5="http://schemas.microsoft.com/office/drawing/2016/5/11/chartex" xmlns:cx6="http://schemas.microsoft.com/office/drawing/2016/5/12/chartex" xmlns:cx7="http://schemas.microsoft.com/office/drawing/2016/5/13/chartex" xmlns:cx8="http://schemas.microsoft.com/office/drawing/2016/5/14/chartex" xmlns:mc="http://schemas.openxmlformats.org/markup-compatibility/2006" xmlns:aink="http://schemas.microsoft.com/office/drawing/2016/ink" xmlns:am3d="http://schemas.microsoft.com/office/drawing/2017/model3d" xmlns:o="urn:schemas-microsoft-com:office:office" xmlns:oel="http://schemas.microsoft.com/office/2019/extlst" xmlns:r="http://schemas.openxmlformats.org/officeDocument/2006/relationships" xmlns:m="http://schemas.openxmlformats.org/officeDocument/2006/math" xmlns:v="urn:schemas-microsoft-com:vml" xmlns:wp14="http://schemas.microsoft.com/office/word/2010/wordprocessingDrawing" xmlns:wp="http://schemas.openxmlformats.org/drawingml/2006/wordprocessingDrawing" xmlns:w10="urn:schemas-microsoft-com:office:word" xmlns:w="http://schemas.openxmlformats.org/wordprocessingml/2006/main" xmlns:w14="http://schemas.microsoft.com/office/word/2010/wordml" xmlns:w15="http://schemas.microsoft.com/office/word/2012/wordml" xmlns:w16cex="http://schemas.microsoft.com/office/word/2018/wordml/cex" xmlns:w16cid="http://schemas.microsoft.com/office/word/2016/wordml/cid" xmlns:w16="http://schemas.microsoft.com/office/word/2018/wordml" xmlns:w16du="http://schemas.microsoft.com/office/word/2023/wordml/word16du" xmlns:w16sdtdh="http://schemas.microsoft.com/office/word/2020/wordml/sdtdatahash" xmlns:w16sdtfl="http://schemas.microsoft.com/office/word/2024/wordml/sdtformatlock" xmlns:w16se="http://schemas.microsoft.com/office/word/2015/wordml/symex" xmlns:wpg="http://schemas.microsoft.com/office/word/2010/wordprocessingGroup" xmlns:wpi="http://schemas.microsoft.com/office/word/2010/wordprocessingInk" xmlns:wne="http://schemas.microsoft.com/office/word/2006/wordml" xmlns:wps="http://schemas.microsoft.com/office/word/2010/wordprocessingShape" mc:Ignorable="w14 w15 w16se w16cid w16 w16cex w16sdtdh w16sdtfl w16du wp14">
+<w:document xmlns:wpc="http://schemas.microsoft.com/office/word/2010/wordprocessingCanvas" xmlns:cx="http://schemas.microsoft.com/office/drawing/2014/chartex" xmlns:cx1="http://schemas.microsoft.com/office/drawing/2015/9/8/chartex" xmlns:cx2="http://schemas.microsoft.com/office/drawing/2015/10/21/chartex" xmlns:cx3="http://schemas.microsoft.com/office/drawing/2016/5/9/chartex" xmlns:cx4="http://schemas.microsoft.com/office/drawing/2016/5/10/chartex" xmlns:cx5="http://schemas.microsoft.com/office/drawing/2016/5/11/chartex" xmlns:cx6="http://schemas.microsoft.com/office/drawing/2016/5/12/chartex" xmlns:cx7="http://schemas.microsoft.com/office/drawing/2016/5/13/chartex" xmlns:cx8="http://schemas.microsoft.com/office/drawing/2016/5/14/chartex" xmlns:mc="http://schemas.openxmlformats.org/markup-compatibility/2006" xmlns:o="urn:schemas-microsoft-com:office:office" xmlns:r="http://schemas.openxmlformats.org/officeDocument/2006/relationships" xmlns:m="http://schemas.openxmlformats.org/officeDocument/2006/math" xmlns:v="urn:schemas-microsoft-com:vml" xmlns:wp14="http://schemas.microsoft.com/office/word/2010/wordprocessingDrawing" xmlns:wp="http://schemas.openxmlformats.org/drawingml/2006/wordprocessingDrawing" xmlns:w="http://schemas.openxmlformats.org/wordprocessingml/2006/main" xmlns:w14="http://schemas.microsoft.com/office/word/2010/wordml" xmlns:w10="urn:schemas-microsoft-com:office:word" xmlns:w15="http://schemas.microsoft.com/office/word/2012/wordml" xmlns:wpg="http://schemas.microsoft.com/office/word/2010/wordprocessingGroup" xmlns:wpi="http://schemas.microsoft.com/office/word/2010/wordprocessingInk" xmlns:wne="http://schemas.microsoft.com/office/word/2006/wordml" xmlns:wps="http://schemas.microsoft.com/office/word/2010/wordprocessingShape" xmlns:wpsCustomData="http://www.wps.cn/officeDocument/2013/wpsCustomData" mc:Ignorable="w14 w15 wp14">
   <w:body>
     <w:p>
       <w:pPr>
         <w:spacing w:line="400" w:lineRule="exact"/>
         <w:rPr>
-          <w:rFonts w:ascii="宋体" w:eastAsia="宋体" w:hAnsi="宋体" w:hint="eastAsia"/>
+          <w:rFonts w:hint="eastAsia" w:ascii="宋体" w:hAnsi="宋体" w:eastAsia="宋体"/>
           <w:sz w:val="24"/>
           <w:szCs w:val="24"/>
         </w:rPr>
       </w:pPr>
       <w:r>
         <w:rPr>
-          <w:rFonts w:ascii="宋体" w:eastAsia="宋体" w:hAnsi="宋体" w:hint="eastAsia"/>
+          <w:rFonts w:hint="eastAsia" w:ascii="宋体" w:hAnsi="宋体" w:eastAsia="宋体"/>
           <w:sz w:val="24"/>
           <w:szCs w:val="24"/>
         </w:rPr>
@@ -21,7 +21,7 @@
       </w:r>
       <w:r>
         <w:rPr>
-          <w:rFonts w:ascii="宋体" w:eastAsia="宋体" w:hAnsi="宋体"/>
+          <w:rFonts w:ascii="宋体" w:hAnsi="宋体" w:eastAsia="宋体"/>
           <w:sz w:val="24"/>
           <w:szCs w:val="24"/>
         </w:rPr>
@@ -29,7 +29,7 @@
       </w:r>
       <w:r>
         <w:rPr>
-          <w:rFonts w:ascii="宋体" w:eastAsia="宋体" w:hAnsi="宋体" w:hint="eastAsia"/>
+          <w:rFonts w:hint="eastAsia" w:ascii="宋体" w:hAnsi="宋体" w:eastAsia="宋体"/>
           <w:sz w:val="24"/>
           <w:szCs w:val="24"/>
         </w:rPr>
@@ -40,14 +40,14 @@
       <w:pPr>
         <w:spacing w:line="400" w:lineRule="exact"/>
         <w:rPr>
-          <w:rFonts w:ascii="宋体" w:eastAsia="宋体" w:hAnsi="宋体" w:hint="eastAsia"/>
+          <w:rFonts w:hint="eastAsia" w:ascii="宋体" w:hAnsi="宋体" w:eastAsia="宋体"/>
           <w:sz w:val="24"/>
           <w:szCs w:val="24"/>
         </w:rPr>
       </w:pPr>
       <w:r>
         <w:rPr>
-          <w:rFonts w:ascii="宋体" w:eastAsia="宋体" w:hAnsi="宋体"/>
+          <w:rFonts w:ascii="宋体" w:hAnsi="宋体" w:eastAsia="宋体"/>
           <w:sz w:val="24"/>
           <w:szCs w:val="24"/>
         </w:rPr>
@@ -62,14 +62,14 @@
         </w:numPr>
         <w:spacing w:line="400" w:lineRule="exact"/>
         <w:rPr>
-          <w:rFonts w:ascii="宋体" w:eastAsia="宋体" w:hAnsi="宋体" w:hint="eastAsia"/>
+          <w:rFonts w:hint="eastAsia" w:ascii="宋体" w:hAnsi="宋体" w:eastAsia="宋体"/>
           <w:sz w:val="24"/>
           <w:szCs w:val="24"/>
         </w:rPr>
       </w:pPr>
       <w:r>
         <w:rPr>
-          <w:rFonts w:ascii="宋体" w:eastAsia="宋体" w:hAnsi="宋体"/>
+          <w:rFonts w:ascii="宋体" w:hAnsi="宋体" w:eastAsia="宋体"/>
           <w:sz w:val="24"/>
           <w:szCs w:val="24"/>
         </w:rPr>
@@ -84,14 +84,14 @@
         </w:numPr>
         <w:spacing w:line="400" w:lineRule="exact"/>
         <w:rPr>
-          <w:rFonts w:ascii="宋体" w:eastAsia="宋体" w:hAnsi="宋体" w:hint="eastAsia"/>
+          <w:rFonts w:hint="eastAsia" w:ascii="宋体" w:hAnsi="宋体" w:eastAsia="宋体"/>
           <w:sz w:val="24"/>
           <w:szCs w:val="24"/>
         </w:rPr>
       </w:pPr>
       <w:r>
         <w:rPr>
-          <w:rFonts w:ascii="宋体" w:eastAsia="宋体" w:hAnsi="宋体"/>
+          <w:rFonts w:ascii="宋体" w:hAnsi="宋体" w:eastAsia="宋体"/>
           <w:sz w:val="24"/>
           <w:szCs w:val="24"/>
         </w:rPr>
@@ -102,14 +102,14 @@
       <w:pPr>
         <w:spacing w:line="400" w:lineRule="exact"/>
         <w:rPr>
-          <w:rFonts w:ascii="宋体" w:eastAsia="宋体" w:hAnsi="宋体" w:hint="eastAsia"/>
+          <w:rFonts w:hint="eastAsia" w:ascii="宋体" w:hAnsi="宋体" w:eastAsia="宋体"/>
           <w:sz w:val="24"/>
           <w:szCs w:val="24"/>
         </w:rPr>
       </w:pPr>
       <w:r>
         <w:rPr>
-          <w:rFonts w:ascii="宋体" w:eastAsia="宋体" w:hAnsi="宋体"/>
+          <w:rFonts w:ascii="宋体" w:hAnsi="宋体" w:eastAsia="宋体"/>
           <w:sz w:val="24"/>
           <w:szCs w:val="24"/>
         </w:rPr>
@@ -119,21 +119,20 @@
     <w:p>
       <w:pPr>
         <w:rPr>
-          <w:rFonts w:ascii="宋体" w:eastAsia="宋体" w:hAnsi="宋体" w:hint="eastAsia"/>
+          <w:rFonts w:hint="eastAsia" w:ascii="宋体" w:hAnsi="宋体" w:eastAsia="宋体"/>
           <w:sz w:val="24"/>
           <w:szCs w:val="24"/>
         </w:rPr>
       </w:pPr>
       <w:r>
         <w:rPr>
-          <w:rFonts w:ascii="宋体" w:eastAsia="宋体" w:hAnsi="宋体" w:hint="eastAsia"/>
-          <w:noProof/>
+          <w:rFonts w:hint="eastAsia" w:ascii="宋体" w:hAnsi="宋体" w:eastAsia="宋体"/>
           <w:sz w:val="24"/>
           <w:szCs w:val="24"/>
         </w:rPr>
         <w:drawing>
-          <wp:inline distT="0" distB="0" distL="0" distR="0" wp14:anchorId="301B5B03" wp14:editId="5AAEA00A">
-            <wp:extent cx="4926890" cy="3402957"/>
+          <wp:inline distT="0" distB="0" distL="0" distR="0">
+            <wp:extent cx="4926330" cy="3402330"/>
             <wp:effectExtent l="0" t="0" r="7620" b="7620"/>
             <wp:docPr id="492288763" name="图片 1"/>
             <wp:cNvGraphicFramePr>
@@ -143,13 +142,13 @@
               <a:graphicData uri="http://schemas.openxmlformats.org/drawingml/2006/picture">
                 <pic:pic xmlns:pic="http://schemas.openxmlformats.org/drawingml/2006/picture">
                   <pic:nvPicPr>
-                    <pic:cNvPr id="0" name="Picture 2"/>
+                    <pic:cNvPr id="492288763" name="图片 1"/>
                     <pic:cNvPicPr>
                       <a:picLocks noChangeAspect="1" noChangeArrowheads="1"/>
                     </pic:cNvPicPr>
                   </pic:nvPicPr>
                   <pic:blipFill>
-                    <a:blip r:embed="rId8">
+                    <a:blip r:embed="rId4">
                       <a:extLst>
                         <a:ext uri="{28A0092B-C50C-407E-A947-70E740481C1C}">
                           <a14:useLocalDpi xmlns:a14="http://schemas.microsoft.com/office/drawing/2010/main" val="0"/>
@@ -161,7 +160,7 @@
                       <a:fillRect/>
                     </a:stretch>
                   </pic:blipFill>
-                  <pic:spPr bwMode="auto">
+                  <pic:spPr>
                     <a:xfrm>
                       <a:off x="0" y="0"/>
                       <a:ext cx="4954620" cy="3422110"/>
@@ -183,14 +182,14 @@
         <w:spacing w:line="400" w:lineRule="exact"/>
         <w:jc w:val="left"/>
         <w:rPr>
-          <w:rFonts w:ascii="宋体" w:eastAsia="宋体" w:hAnsi="宋体" w:hint="eastAsia"/>
+          <w:rFonts w:hint="eastAsia" w:ascii="宋体" w:hAnsi="宋体" w:eastAsia="宋体"/>
           <w:sz w:val="24"/>
           <w:szCs w:val="24"/>
         </w:rPr>
       </w:pPr>
       <w:r>
         <w:rPr>
-          <w:rFonts w:ascii="宋体" w:eastAsia="宋体" w:hAnsi="宋体"/>
+          <w:rFonts w:ascii="宋体" w:hAnsi="宋体" w:eastAsia="宋体"/>
           <w:sz w:val="24"/>
           <w:szCs w:val="24"/>
         </w:rPr>
@@ -202,52 +201,49 @@
         <w:spacing w:line="400" w:lineRule="exact"/>
         <w:jc w:val="left"/>
         <w:rPr>
-          <w:rFonts w:ascii="宋体" w:eastAsia="宋体" w:hAnsi="宋体" w:hint="eastAsia"/>
+          <w:rFonts w:hint="eastAsia" w:ascii="宋体" w:hAnsi="宋体" w:eastAsia="宋体"/>
           <w:sz w:val="24"/>
           <w:szCs w:val="24"/>
         </w:rPr>
       </w:pPr>
-      <w:proofErr w:type="spellStart"/>
-      <w:r>
-        <w:rPr>
-          <w:rFonts w:ascii="宋体" w:eastAsia="宋体" w:hAnsi="宋体"/>
+      <w:r>
+        <w:rPr>
+          <w:rFonts w:ascii="宋体" w:hAnsi="宋体" w:eastAsia="宋体"/>
           <w:sz w:val="24"/>
           <w:szCs w:val="24"/>
         </w:rPr>
-        <w:t>PendSV</w:t>
-      </w:r>
-      <w:proofErr w:type="spellEnd"/>
-      <w:r>
-        <w:rPr>
-          <w:rFonts w:ascii="宋体" w:eastAsia="宋体" w:hAnsi="宋体"/>
+        <w:t>PendSV可挂起系统服务异常</w:t>
+      </w:r>
+      <w:r>
+        <w:rPr>
+          <w:rFonts w:hint="eastAsia" w:ascii="宋体" w:hAnsi="宋体" w:eastAsia="宋体"/>
           <w:sz w:val="24"/>
           <w:szCs w:val="24"/>
         </w:rPr>
-        <w:t>可挂起系统服务异常</w:t>
-      </w:r>
-      <w:r>
-        <w:rPr>
-          <w:rFonts w:ascii="宋体" w:eastAsia="宋体" w:hAnsi="宋体" w:hint="eastAsia"/>
+        <w:t>。</w:t>
+      </w:r>
+      <w:r>
+        <w:rPr>
+          <w:rFonts w:ascii="宋体" w:hAnsi="宋体" w:eastAsia="宋体"/>
           <w:sz w:val="24"/>
           <w:szCs w:val="24"/>
         </w:rPr>
-        <w:t>。</w:t>
-      </w:r>
-      <w:r>
-        <w:rPr>
-          <w:rFonts w:ascii="宋体" w:eastAsia="宋体" w:hAnsi="宋体"/>
+        <w:t>Cortex</w:t>
+      </w:r>
+      <w:r>
+        <w:rPr>
+          <w:rFonts w:ascii="宋体" w:hAnsi="宋体" w:eastAsia="宋体"/>
           <w:sz w:val="24"/>
           <w:szCs w:val="24"/>
         </w:rPr>
-        <w:t>Cortex</w:t>
-      </w:r>
-      <w:r>
-        <w:rPr>
-          <w:rFonts w:ascii="宋体" w:eastAsia="宋体" w:hAnsi="宋体"/>
+        <w:noBreakHyphen/>
+      </w:r>
+      <w:r>
+        <w:rPr>
+          <w:rFonts w:ascii="宋体" w:hAnsi="宋体" w:eastAsia="宋体"/>
           <w:sz w:val="24"/>
           <w:szCs w:val="24"/>
         </w:rPr>
-        <w:noBreakHyphen/>
         <w:t>M 专门用来做任务上下文切换的异常；</w:t>
       </w:r>
     </w:p>
@@ -256,14 +252,14 @@
         <w:spacing w:line="400" w:lineRule="exact"/>
         <w:jc w:val="left"/>
         <w:rPr>
-          <w:rFonts w:ascii="宋体" w:eastAsia="宋体" w:hAnsi="宋体" w:hint="eastAsia"/>
+          <w:rFonts w:hint="eastAsia" w:ascii="宋体" w:hAnsi="宋体" w:eastAsia="宋体"/>
           <w:sz w:val="24"/>
           <w:szCs w:val="24"/>
         </w:rPr>
       </w:pPr>
       <w:r>
         <w:rPr>
-          <w:rFonts w:ascii="宋体" w:eastAsia="宋体" w:hAnsi="宋体"/>
+          <w:rFonts w:ascii="宋体" w:hAnsi="宋体" w:eastAsia="宋体"/>
           <w:sz w:val="24"/>
           <w:szCs w:val="24"/>
         </w:rPr>
@@ -272,8 +268,8 @@
     </w:p>
     <w:p>
       <w:pPr>
-        <w:pStyle w:val="1"/>
-        <w:ind w:leftChars="0" w:left="0" w:right="210"/>
+        <w:pStyle w:val="2"/>
+        <w:ind w:left="0" w:leftChars="0" w:right="210"/>
         <w:rPr>
           <w:rFonts w:hint="eastAsia"/>
           <w:sz w:val="24"/>
@@ -284,13 +280,7 @@
         <w:rPr>
           <w:rFonts w:hint="eastAsia"/>
         </w:rPr>
-        <w:t>CubeMx</w:t>
-      </w:r>
-      <w:r>
-        <w:rPr>
-          <w:rFonts w:hint="eastAsia"/>
-        </w:rPr>
-        <w:t>基础配置</w:t>
+        <w:t>CubeMx基础配置</w:t>
       </w:r>
     </w:p>
     <w:p>
@@ -298,20 +288,63 @@
         <w:widowControl/>
         <w:jc w:val="left"/>
         <w:rPr>
-          <w:rFonts w:ascii="宋体" w:eastAsia="宋体" w:hAnsi="宋体" w:hint="eastAsia"/>
+          <w:rFonts w:ascii="宋体" w:hAnsi="宋体" w:eastAsia="宋体"/>
           <w:sz w:val="24"/>
           <w:szCs w:val="24"/>
         </w:rPr>
       </w:pPr>
       <w:r>
         <w:rPr>
-          <w:rFonts w:ascii="宋体" w:eastAsia="宋体" w:hAnsi="宋体"/>
-          <w:noProof/>
+          <w:rFonts w:ascii="宋体" w:hAnsi="宋体" w:eastAsia="宋体"/>
           <w:sz w:val="24"/>
           <w:szCs w:val="24"/>
         </w:rPr>
         <w:drawing>
-          <wp:inline distT="0" distB="0" distL="0" distR="0" wp14:anchorId="700F3447" wp14:editId="2870518A">
+          <wp:inline distT="0" distB="0" distL="0" distR="0">
+            <wp:extent cx="5274310" cy="1995805"/>
+            <wp:effectExtent l="0" t="0" r="8890" b="10795"/>
+            <wp:docPr id="862804469" name="图片 1"/>
+            <wp:cNvGraphicFramePr>
+              <a:graphicFrameLocks xmlns:a="http://schemas.openxmlformats.org/drawingml/2006/main" noChangeAspect="1"/>
+            </wp:cNvGraphicFramePr>
+            <a:graphic xmlns:a="http://schemas.openxmlformats.org/drawingml/2006/main">
+              <a:graphicData uri="http://schemas.openxmlformats.org/drawingml/2006/picture">
+                <pic:pic xmlns:pic="http://schemas.openxmlformats.org/drawingml/2006/picture">
+                  <pic:nvPicPr>
+                    <pic:cNvPr id="862804469" name="图片 1"/>
+                    <pic:cNvPicPr>
+                      <a:picLocks noChangeAspect="1"/>
+                    </pic:cNvPicPr>
+                  </pic:nvPicPr>
+                  <pic:blipFill>
+                    <a:blip r:embed="rId5"/>
+                    <a:stretch>
+                      <a:fillRect/>
+                    </a:stretch>
+                  </pic:blipFill>
+                  <pic:spPr>
+                    <a:xfrm>
+                      <a:off x="0" y="0"/>
+                      <a:ext cx="5274310" cy="1995805"/>
+                    </a:xfrm>
+                    <a:prstGeom prst="rect">
+                      <a:avLst/>
+                    </a:prstGeom>
+                  </pic:spPr>
+                </pic:pic>
+              </a:graphicData>
+            </a:graphic>
+          </wp:inline>
+        </w:drawing>
+      </w:r>
+      <w:r>
+        <w:rPr>
+          <w:rFonts w:ascii="宋体" w:hAnsi="宋体" w:eastAsia="宋体"/>
+          <w:sz w:val="24"/>
+          <w:szCs w:val="24"/>
+        </w:rPr>
+        <w:drawing>
+          <wp:inline distT="0" distB="0" distL="0" distR="0">
             <wp:extent cx="5274310" cy="1758315"/>
             <wp:effectExtent l="0" t="0" r="2540" b="0"/>
             <wp:docPr id="21838101" name="图片 1"/>
@@ -322,11 +355,13 @@
               <a:graphicData uri="http://schemas.openxmlformats.org/drawingml/2006/picture">
                 <pic:pic xmlns:pic="http://schemas.openxmlformats.org/drawingml/2006/picture">
                   <pic:nvPicPr>
-                    <pic:cNvPr id="21838101" name=""/>
-                    <pic:cNvPicPr/>
+                    <pic:cNvPr id="21838101" name="图片 1"/>
+                    <pic:cNvPicPr>
+                      <a:picLocks noChangeAspect="1"/>
+                    </pic:cNvPicPr>
                   </pic:nvPicPr>
                   <pic:blipFill>
-                    <a:blip r:embed="rId9"/>
+                    <a:blip r:embed="rId6"/>
                     <a:stretch>
                       <a:fillRect/>
                     </a:stretch>
@@ -347,20 +382,16 @@
         </w:drawing>
       </w:r>
       <w:r>
-        <w:rPr>
-          <w:noProof/>
-        </w:rPr>
         <w:t xml:space="preserve"> </w:t>
       </w:r>
       <w:r>
         <w:rPr>
-          <w:rFonts w:ascii="宋体" w:eastAsia="宋体" w:hAnsi="宋体"/>
-          <w:noProof/>
+          <w:rFonts w:ascii="宋体" w:hAnsi="宋体" w:eastAsia="宋体"/>
           <w:sz w:val="24"/>
           <w:szCs w:val="24"/>
         </w:rPr>
         <w:drawing>
-          <wp:inline distT="0" distB="0" distL="0" distR="0" wp14:anchorId="2F4AFCFD" wp14:editId="599C06E4">
+          <wp:inline distT="0" distB="0" distL="0" distR="0">
             <wp:extent cx="5274310" cy="2565400"/>
             <wp:effectExtent l="0" t="0" r="2540" b="6350"/>
             <wp:docPr id="1313358380" name="图片 1"/>
@@ -371,11 +402,13 @@
               <a:graphicData uri="http://schemas.openxmlformats.org/drawingml/2006/picture">
                 <pic:pic xmlns:pic="http://schemas.openxmlformats.org/drawingml/2006/picture">
                   <pic:nvPicPr>
-                    <pic:cNvPr id="1313358380" name=""/>
-                    <pic:cNvPicPr/>
+                    <pic:cNvPr id="1313358380" name="图片 1"/>
+                    <pic:cNvPicPr>
+                      <a:picLocks noChangeAspect="1"/>
+                    </pic:cNvPicPr>
                   </pic:nvPicPr>
                   <pic:blipFill>
-                    <a:blip r:embed="rId10"/>
+                    <a:blip r:embed="rId7"/>
                     <a:stretch>
                       <a:fillRect/>
                     </a:stretch>
@@ -397,13 +430,75 @@
       </w:r>
       <w:r>
         <w:rPr>
-          <w:rFonts w:ascii="宋体" w:eastAsia="宋体" w:hAnsi="宋体"/>
-          <w:noProof/>
+          <w:rFonts w:hint="eastAsia" w:ascii="宋体" w:hAnsi="宋体" w:eastAsia="宋体"/>
           <w:sz w:val="24"/>
           <w:szCs w:val="24"/>
-        </w:rPr>
+          <w:lang w:val="en-US" w:eastAsia="zh-CN"/>
+        </w:rPr>
+        <w:t>时钟树配置原理</w:t>
+      </w:r>
+      <w:r>
         <w:drawing>
-          <wp:inline distT="0" distB="0" distL="0" distR="0" wp14:anchorId="7C9D52A0" wp14:editId="34DA9EC0">
+          <wp:inline distT="0" distB="0" distL="114300" distR="114300">
+            <wp:extent cx="5269230" cy="4411345"/>
+            <wp:effectExtent l="0" t="0" r="1270" b="8255"/>
+            <wp:docPr id="23" name="图片 1"/>
+            <wp:cNvGraphicFramePr>
+              <a:graphicFrameLocks xmlns:a="http://schemas.openxmlformats.org/drawingml/2006/main" noChangeAspect="1"/>
+            </wp:cNvGraphicFramePr>
+            <a:graphic xmlns:a="http://schemas.openxmlformats.org/drawingml/2006/main">
+              <a:graphicData uri="http://schemas.openxmlformats.org/drawingml/2006/picture">
+                <pic:pic xmlns:pic="http://schemas.openxmlformats.org/drawingml/2006/picture">
+                  <pic:nvPicPr>
+                    <pic:cNvPr id="23" name="图片 1"/>
+                    <pic:cNvPicPr>
+                      <a:picLocks noChangeAspect="1"/>
+                    </pic:cNvPicPr>
+                  </pic:nvPicPr>
+                  <pic:blipFill>
+                    <a:blip r:embed="rId8"/>
+                    <a:stretch>
+                      <a:fillRect/>
+                    </a:stretch>
+                  </pic:blipFill>
+                  <pic:spPr>
+                    <a:xfrm>
+                      <a:off x="0" y="0"/>
+                      <a:ext cx="5269230" cy="4411345"/>
+                    </a:xfrm>
+                    <a:prstGeom prst="rect">
+                      <a:avLst/>
+                    </a:prstGeom>
+                    <a:noFill/>
+                    <a:ln>
+                      <a:noFill/>
+                    </a:ln>
+                  </pic:spPr>
+                </pic:pic>
+              </a:graphicData>
+            </a:graphic>
+          </wp:inline>
+        </w:drawing>
+      </w:r>
+    </w:p>
+    <w:p>
+      <w:pPr>
+        <w:widowControl/>
+        <w:jc w:val="left"/>
+        <w:rPr>
+          <w:rFonts w:ascii="宋体" w:hAnsi="宋体" w:eastAsia="宋体"/>
+          <w:sz w:val="24"/>
+          <w:szCs w:val="24"/>
+        </w:rPr>
+      </w:pPr>
+      <w:r>
+        <w:rPr>
+          <w:rFonts w:ascii="宋体" w:hAnsi="宋体" w:eastAsia="宋体"/>
+          <w:sz w:val="24"/>
+          <w:szCs w:val="24"/>
+        </w:rPr>
+        <w:drawing>
+          <wp:inline distT="0" distB="0" distL="0" distR="0">
             <wp:extent cx="5274310" cy="3728085"/>
             <wp:effectExtent l="0" t="0" r="2540" b="5715"/>
             <wp:docPr id="452657654" name="图片 1"/>
@@ -414,11 +509,13 @@
               <a:graphicData uri="http://schemas.openxmlformats.org/drawingml/2006/picture">
                 <pic:pic xmlns:pic="http://schemas.openxmlformats.org/drawingml/2006/picture">
                   <pic:nvPicPr>
-                    <pic:cNvPr id="452657654" name=""/>
-                    <pic:cNvPicPr/>
+                    <pic:cNvPr id="452657654" name="图片 1"/>
+                    <pic:cNvPicPr>
+                      <a:picLocks noChangeAspect="1"/>
+                    </pic:cNvPicPr>
                   </pic:nvPicPr>
                   <pic:blipFill>
-                    <a:blip r:embed="rId11"/>
+                    <a:blip r:embed="rId9"/>
                     <a:stretch>
                       <a:fillRect/>
                     </a:stretch>
@@ -439,17 +536,11 @@
         </w:drawing>
       </w:r>
       <w:r>
-        <w:rPr>
-          <w:rFonts w:ascii="宋体" w:eastAsia="宋体" w:hAnsi="宋体"/>
-          <w:noProof/>
-          <w:sz w:val="24"/>
-          <w:szCs w:val="24"/>
-        </w:rPr>
         <w:drawing>
-          <wp:inline distT="0" distB="0" distL="0" distR="0" wp14:anchorId="417A08BB" wp14:editId="4DD7E12C">
-            <wp:extent cx="5274310" cy="1995805"/>
-            <wp:effectExtent l="0" t="0" r="2540" b="4445"/>
-            <wp:docPr id="862804469" name="图片 1"/>
+          <wp:inline distT="0" distB="0" distL="114300" distR="114300">
+            <wp:extent cx="5272405" cy="1831975"/>
+            <wp:effectExtent l="0" t="0" r="10795" b="9525"/>
+            <wp:docPr id="1" name="图片 1"/>
             <wp:cNvGraphicFramePr>
               <a:graphicFrameLocks xmlns:a="http://schemas.openxmlformats.org/drawingml/2006/main" noChangeAspect="1"/>
             </wp:cNvGraphicFramePr>
@@ -457,11 +548,13 @@
               <a:graphicData uri="http://schemas.openxmlformats.org/drawingml/2006/picture">
                 <pic:pic xmlns:pic="http://schemas.openxmlformats.org/drawingml/2006/picture">
                   <pic:nvPicPr>
-                    <pic:cNvPr id="862804469" name=""/>
-                    <pic:cNvPicPr/>
+                    <pic:cNvPr id="1" name="图片 1"/>
+                    <pic:cNvPicPr>
+                      <a:picLocks noChangeAspect="1"/>
+                    </pic:cNvPicPr>
                   </pic:nvPicPr>
                   <pic:blipFill>
-                    <a:blip r:embed="rId12"/>
+                    <a:blip r:embed="rId10"/>
                     <a:stretch>
                       <a:fillRect/>
                     </a:stretch>
@@ -469,11 +562,15 @@
                   <pic:spPr>
                     <a:xfrm>
                       <a:off x="0" y="0"/>
-                      <a:ext cx="5274310" cy="1995805"/>
+                      <a:ext cx="5272405" cy="1831975"/>
                     </a:xfrm>
                     <a:prstGeom prst="rect">
                       <a:avLst/>
                     </a:prstGeom>
+                    <a:noFill/>
+                    <a:ln>
+                      <a:noFill/>
+                    </a:ln>
                   </pic:spPr>
                 </pic:pic>
               </a:graphicData>
@@ -482,65 +579,18 @@
         </w:drawing>
       </w:r>
       <w:r>
-        <w:rPr>
-          <w:rFonts w:ascii="宋体" w:eastAsia="宋体" w:hAnsi="宋体"/>
-          <w:noProof/>
+        <w:t xml:space="preserve"> </w:t>
+      </w:r>
+      <w:r>
+        <w:rPr>
+          <w:rFonts w:ascii="宋体" w:hAnsi="宋体" w:eastAsia="宋体"/>
           <w:sz w:val="24"/>
           <w:szCs w:val="24"/>
         </w:rPr>
         <w:drawing>
-          <wp:inline distT="0" distB="0" distL="0" distR="0" wp14:anchorId="2C841F52" wp14:editId="7DB33476">
-            <wp:extent cx="5274310" cy="1350645"/>
-            <wp:effectExtent l="0" t="0" r="2540" b="1905"/>
-            <wp:docPr id="1995539767" name="图片 1"/>
-            <wp:cNvGraphicFramePr>
-              <a:graphicFrameLocks xmlns:a="http://schemas.openxmlformats.org/drawingml/2006/main" noChangeAspect="1"/>
-            </wp:cNvGraphicFramePr>
-            <a:graphic xmlns:a="http://schemas.openxmlformats.org/drawingml/2006/main">
-              <a:graphicData uri="http://schemas.openxmlformats.org/drawingml/2006/picture">
-                <pic:pic xmlns:pic="http://schemas.openxmlformats.org/drawingml/2006/picture">
-                  <pic:nvPicPr>
-                    <pic:cNvPr id="1995539767" name=""/>
-                    <pic:cNvPicPr/>
-                  </pic:nvPicPr>
-                  <pic:blipFill>
-                    <a:blip r:embed="rId13"/>
-                    <a:stretch>
-                      <a:fillRect/>
-                    </a:stretch>
-                  </pic:blipFill>
-                  <pic:spPr>
-                    <a:xfrm>
-                      <a:off x="0" y="0"/>
-                      <a:ext cx="5274310" cy="1350645"/>
-                    </a:xfrm>
-                    <a:prstGeom prst="rect">
-                      <a:avLst/>
-                    </a:prstGeom>
-                  </pic:spPr>
-                </pic:pic>
-              </a:graphicData>
-            </a:graphic>
-          </wp:inline>
-        </w:drawing>
-      </w:r>
-      <w:r>
-        <w:rPr>
-          <w:noProof/>
-        </w:rPr>
-        <w:t xml:space="preserve"> </w:t>
-      </w:r>
-      <w:r>
-        <w:rPr>
-          <w:rFonts w:ascii="宋体" w:eastAsia="宋体" w:hAnsi="宋体"/>
-          <w:noProof/>
-          <w:sz w:val="24"/>
-          <w:szCs w:val="24"/>
-        </w:rPr>
-        <w:drawing>
-          <wp:inline distT="0" distB="0" distL="0" distR="0" wp14:anchorId="43C7F736" wp14:editId="54BFE6ED">
+          <wp:inline distT="0" distB="0" distL="0" distR="0">
             <wp:extent cx="5274310" cy="1673860"/>
-            <wp:effectExtent l="0" t="0" r="2540" b="2540"/>
+            <wp:effectExtent l="0" t="0" r="8890" b="2540"/>
             <wp:docPr id="76744017" name="图片 1"/>
             <wp:cNvGraphicFramePr>
               <a:graphicFrameLocks xmlns:a="http://schemas.openxmlformats.org/drawingml/2006/main" noChangeAspect="1"/>
@@ -549,11 +599,13 @@
               <a:graphicData uri="http://schemas.openxmlformats.org/drawingml/2006/picture">
                 <pic:pic xmlns:pic="http://schemas.openxmlformats.org/drawingml/2006/picture">
                   <pic:nvPicPr>
-                    <pic:cNvPr id="76744017" name=""/>
-                    <pic:cNvPicPr/>
+                    <pic:cNvPr id="76744017" name="图片 1"/>
+                    <pic:cNvPicPr>
+                      <a:picLocks noChangeAspect="1"/>
+                    </pic:cNvPicPr>
                   </pic:nvPicPr>
                   <pic:blipFill>
-                    <a:blip r:embed="rId14"/>
+                    <a:blip r:embed="rId11"/>
                     <a:stretch>
                       <a:fillRect/>
                     </a:stretch>
@@ -576,16 +628,158 @@
     </w:p>
     <w:p>
       <w:pPr>
-        <w:pStyle w:val="1"/>
+        <w:widowControl/>
+        <w:jc w:val="left"/>
+        <w:rPr>
+          <w:rFonts w:hint="eastAsia" w:ascii="宋体" w:hAnsi="宋体" w:eastAsia="宋体"/>
+          <w:sz w:val="24"/>
+          <w:szCs w:val="24"/>
+        </w:rPr>
+      </w:pPr>
+      <w:r>
+        <w:drawing>
+          <wp:inline distT="0" distB="0" distL="114300" distR="114300">
+            <wp:extent cx="5266690" cy="1593850"/>
+            <wp:effectExtent l="0" t="0" r="3810" b="6350"/>
+            <wp:docPr id="2" name="图片 2"/>
+            <wp:cNvGraphicFramePr>
+              <a:graphicFrameLocks xmlns:a="http://schemas.openxmlformats.org/drawingml/2006/main" noChangeAspect="1"/>
+            </wp:cNvGraphicFramePr>
+            <a:graphic xmlns:a="http://schemas.openxmlformats.org/drawingml/2006/main">
+              <a:graphicData uri="http://schemas.openxmlformats.org/drawingml/2006/picture">
+                <pic:pic xmlns:pic="http://schemas.openxmlformats.org/drawingml/2006/picture">
+                  <pic:nvPicPr>
+                    <pic:cNvPr id="2" name="图片 2"/>
+                    <pic:cNvPicPr>
+                      <a:picLocks noChangeAspect="1"/>
+                    </pic:cNvPicPr>
+                  </pic:nvPicPr>
+                  <pic:blipFill>
+                    <a:blip r:embed="rId12"/>
+                    <a:stretch>
+                      <a:fillRect/>
+                    </a:stretch>
+                  </pic:blipFill>
+                  <pic:spPr>
+                    <a:xfrm>
+                      <a:off x="0" y="0"/>
+                      <a:ext cx="5266690" cy="1593850"/>
+                    </a:xfrm>
+                    <a:prstGeom prst="rect">
+                      <a:avLst/>
+                    </a:prstGeom>
+                    <a:noFill/>
+                    <a:ln>
+                      <a:noFill/>
+                    </a:ln>
+                  </pic:spPr>
+                </pic:pic>
+              </a:graphicData>
+            </a:graphic>
+          </wp:inline>
+        </w:drawing>
+      </w:r>
+      <w:r>
+        <w:drawing>
+          <wp:inline distT="0" distB="0" distL="114300" distR="114300">
+            <wp:extent cx="5272405" cy="3620135"/>
+            <wp:effectExtent l="0" t="0" r="10795" b="12065"/>
+            <wp:docPr id="3" name="图片 3"/>
+            <wp:cNvGraphicFramePr>
+              <a:graphicFrameLocks xmlns:a="http://schemas.openxmlformats.org/drawingml/2006/main" noChangeAspect="1"/>
+            </wp:cNvGraphicFramePr>
+            <a:graphic xmlns:a="http://schemas.openxmlformats.org/drawingml/2006/main">
+              <a:graphicData uri="http://schemas.openxmlformats.org/drawingml/2006/picture">
+                <pic:pic xmlns:pic="http://schemas.openxmlformats.org/drawingml/2006/picture">
+                  <pic:nvPicPr>
+                    <pic:cNvPr id="3" name="图片 3"/>
+                    <pic:cNvPicPr>
+                      <a:picLocks noChangeAspect="1"/>
+                    </pic:cNvPicPr>
+                  </pic:nvPicPr>
+                  <pic:blipFill>
+                    <a:blip r:embed="rId13"/>
+                    <a:stretch>
+                      <a:fillRect/>
+                    </a:stretch>
+                  </pic:blipFill>
+                  <pic:spPr>
+                    <a:xfrm>
+                      <a:off x="0" y="0"/>
+                      <a:ext cx="5272405" cy="3620135"/>
+                    </a:xfrm>
+                    <a:prstGeom prst="rect">
+                      <a:avLst/>
+                    </a:prstGeom>
+                    <a:noFill/>
+                    <a:ln>
+                      <a:noFill/>
+                    </a:ln>
+                  </pic:spPr>
+                </pic:pic>
+              </a:graphicData>
+            </a:graphic>
+          </wp:inline>
+        </w:drawing>
+      </w:r>
+      <w:r>
+        <w:drawing>
+          <wp:inline distT="0" distB="0" distL="114300" distR="114300">
+            <wp:extent cx="5264785" cy="2190115"/>
+            <wp:effectExtent l="0" t="0" r="5715" b="6985"/>
+            <wp:docPr id="4" name="图片 4"/>
+            <wp:cNvGraphicFramePr>
+              <a:graphicFrameLocks xmlns:a="http://schemas.openxmlformats.org/drawingml/2006/main" noChangeAspect="1"/>
+            </wp:cNvGraphicFramePr>
+            <a:graphic xmlns:a="http://schemas.openxmlformats.org/drawingml/2006/main">
+              <a:graphicData uri="http://schemas.openxmlformats.org/drawingml/2006/picture">
+                <pic:pic xmlns:pic="http://schemas.openxmlformats.org/drawingml/2006/picture">
+                  <pic:nvPicPr>
+                    <pic:cNvPr id="4" name="图片 4"/>
+                    <pic:cNvPicPr>
+                      <a:picLocks noChangeAspect="1"/>
+                    </pic:cNvPicPr>
+                  </pic:nvPicPr>
+                  <pic:blipFill>
+                    <a:blip r:embed="rId14"/>
+                    <a:stretch>
+                      <a:fillRect/>
+                    </a:stretch>
+                  </pic:blipFill>
+                  <pic:spPr>
+                    <a:xfrm>
+                      <a:off x="0" y="0"/>
+                      <a:ext cx="5264785" cy="2190115"/>
+                    </a:xfrm>
+                    <a:prstGeom prst="rect">
+                      <a:avLst/>
+                    </a:prstGeom>
+                    <a:noFill/>
+                    <a:ln>
+                      <a:noFill/>
+                    </a:ln>
+                  </pic:spPr>
+                </pic:pic>
+              </a:graphicData>
+            </a:graphic>
+          </wp:inline>
+        </w:drawing>
+      </w:r>
+      <w:bookmarkStart w:id="0" w:name="_GoBack"/>
+      <w:bookmarkEnd w:id="0"/>
+    </w:p>
+    <w:p>
+      <w:pPr>
+        <w:pStyle w:val="2"/>
         <w:ind w:left="210" w:right="210"/>
         <w:rPr>
-          <w:rFonts w:ascii="宋体" w:hAnsi="宋体" w:hint="eastAsia"/>
+          <w:rFonts w:hint="eastAsia" w:ascii="宋体" w:hAnsi="宋体"/>
           <w:szCs w:val="28"/>
         </w:rPr>
       </w:pPr>
       <w:r>
         <w:rPr>
-          <w:rFonts w:ascii="宋体" w:hAnsi="宋体" w:hint="eastAsia"/>
+          <w:rFonts w:hint="eastAsia" w:ascii="宋体" w:hAnsi="宋体"/>
           <w:szCs w:val="28"/>
         </w:rPr>
         <w:t>电源控制模块</w:t>
@@ -593,20 +787,20 @@
     </w:p>
     <w:p>
       <w:pPr>
-        <w:pStyle w:val="2"/>
+        <w:pStyle w:val="3"/>
         <w:numPr>
           <w:ilvl w:val="0"/>
           <w:numId w:val="2"/>
         </w:numPr>
         <w:ind w:leftChars="0" w:right="210"/>
         <w:rPr>
-          <w:rFonts w:ascii="宋体" w:hAnsi="宋体" w:hint="eastAsia"/>
+          <w:rFonts w:hint="eastAsia" w:ascii="宋体" w:hAnsi="宋体"/>
           <w:szCs w:val="28"/>
         </w:rPr>
       </w:pPr>
       <w:r>
         <w:rPr>
-          <w:rFonts w:ascii="宋体" w:hAnsi="宋体" w:hint="eastAsia"/>
+          <w:rFonts w:hint="eastAsia" w:ascii="宋体" w:hAnsi="宋体"/>
           <w:szCs w:val="28"/>
         </w:rPr>
         <w:t>配置CubeMX</w:t>
@@ -632,11 +826,8 @@
         </w:rPr>
       </w:pPr>
       <w:r>
-        <w:rPr>
-          <w:noProof/>
-        </w:rPr>
         <w:drawing>
-          <wp:inline distT="0" distB="0" distL="0" distR="0" wp14:anchorId="5A353036" wp14:editId="5849101D">
+          <wp:inline distT="0" distB="0" distL="0" distR="0">
             <wp:extent cx="5274310" cy="3016885"/>
             <wp:effectExtent l="0" t="0" r="2540" b="0"/>
             <wp:docPr id="1559660613" name="图片 1"/>
@@ -647,8 +838,10 @@
               <a:graphicData uri="http://schemas.openxmlformats.org/drawingml/2006/picture">
                 <pic:pic xmlns:pic="http://schemas.openxmlformats.org/drawingml/2006/picture">
                   <pic:nvPicPr>
-                    <pic:cNvPr id="1559660613" name=""/>
-                    <pic:cNvPicPr/>
+                    <pic:cNvPr id="1559660613" name="图片 1"/>
+                    <pic:cNvPicPr>
+                      <a:picLocks noChangeAspect="1"/>
+                    </pic:cNvPicPr>
                   </pic:nvPicPr>
                   <pic:blipFill>
                     <a:blip r:embed="rId15"/>
@@ -682,39 +875,18 @@
         <w:rPr>
           <w:rFonts w:hint="eastAsia"/>
         </w:rPr>
-        <w:t>PB2配置为输出模式才可以</w:t>
-      </w:r>
-      <w:r>
-        <w:rPr>
-          <w:rFonts w:hint="eastAsia"/>
-        </w:rPr>
-        <w:t>驱动电平</w:t>
-      </w:r>
-      <w:r>
-        <w:rPr>
-          <w:rFonts w:hint="eastAsia"/>
-        </w:rPr>
-        <w:t>控制POWER-KEYA按键</w:t>
-      </w:r>
-      <w:r>
-        <w:rPr>
-          <w:rFonts w:hint="eastAsia"/>
-        </w:rPr>
-        <w:t>，默认高电平断开按键</w:t>
-      </w:r>
-    </w:p>
-    <w:p>
-      <w:pPr>
-        <w:rPr>
-          <w:rFonts w:hint="eastAsia"/>
-        </w:rPr>
-      </w:pPr>
-      <w:r>
-        <w:rPr>
-          <w:noProof/>
-        </w:rPr>
+        <w:t>PB2配置为输出模式才可以驱动电平控制POWER-KEYA按键，默认高电平断开按键</w:t>
+      </w:r>
+    </w:p>
+    <w:p>
+      <w:pPr>
+        <w:rPr>
+          <w:rFonts w:hint="eastAsia"/>
+        </w:rPr>
+      </w:pPr>
+      <w:r>
         <w:drawing>
-          <wp:inline distT="0" distB="0" distL="0" distR="0" wp14:anchorId="297D03AB" wp14:editId="51FAE51A">
+          <wp:inline distT="0" distB="0" distL="0" distR="0">
             <wp:extent cx="5274310" cy="2696845"/>
             <wp:effectExtent l="0" t="0" r="2540" b="8255"/>
             <wp:docPr id="1537574299" name="图片 1"/>
@@ -725,8 +897,10 @@
               <a:graphicData uri="http://schemas.openxmlformats.org/drawingml/2006/picture">
                 <pic:pic xmlns:pic="http://schemas.openxmlformats.org/drawingml/2006/picture">
                   <pic:nvPicPr>
-                    <pic:cNvPr id="1537574299" name=""/>
-                    <pic:cNvPicPr/>
+                    <pic:cNvPr id="1537574299" name="图片 1"/>
+                    <pic:cNvPicPr>
+                      <a:picLocks noChangeAspect="1"/>
+                    </pic:cNvPicPr>
                   </pic:nvPicPr>
                   <pic:blipFill>
                     <a:blip r:embed="rId16"/>
@@ -752,34 +926,34 @@
     </w:p>
     <w:p>
       <w:pPr>
-        <w:pStyle w:val="1"/>
-        <w:ind w:left="210" w:right="210"/>
-        <w:rPr>
-          <w:rFonts w:hint="eastAsia"/>
-        </w:rPr>
-      </w:pPr>
-      <w:r>
-        <w:rPr>
-          <w:rFonts w:ascii="宋体" w:hAnsi="宋体" w:hint="eastAsia"/>
-          <w:szCs w:val="28"/>
-        </w:rPr>
-        <w:t>电机控制模块</w:t>
-      </w:r>
-    </w:p>
-    <w:p>
-      <w:pPr>
         <w:pStyle w:val="2"/>
         <w:ind w:left="210" w:right="210"/>
         <w:rPr>
-          <w:rFonts w:ascii="宋体" w:hAnsi="宋体" w:hint="eastAsia"/>
+          <w:rFonts w:hint="eastAsia"/>
+        </w:rPr>
+      </w:pPr>
+      <w:r>
+        <w:rPr>
+          <w:rFonts w:hint="eastAsia" w:ascii="宋体" w:hAnsi="宋体"/>
           <w:szCs w:val="28"/>
         </w:rPr>
-      </w:pPr>
-      <w:r>
-        <w:rPr>
-          <w:rFonts w:ascii="宋体" w:hAnsi="宋体" w:hint="eastAsia"/>
+        <w:t>电机控制模块</w:t>
+      </w:r>
+    </w:p>
+    <w:p>
+      <w:pPr>
+        <w:pStyle w:val="3"/>
+        <w:ind w:left="210" w:right="210"/>
+        <w:rPr>
+          <w:rFonts w:hint="eastAsia" w:ascii="宋体" w:hAnsi="宋体"/>
           <w:szCs w:val="28"/>
         </w:rPr>
+      </w:pPr>
+      <w:r>
+        <w:rPr>
+          <w:rFonts w:hint="eastAsia" w:ascii="宋体" w:hAnsi="宋体"/>
+          <w:szCs w:val="28"/>
+        </w:rPr>
         <w:t>一.配置CubeMX</w:t>
       </w:r>
     </w:p>
@@ -803,12 +977,9 @@
         </w:rPr>
       </w:pPr>
       <w:r>
-        <w:rPr>
-          <w:noProof/>
-        </w:rPr>
         <w:drawing>
-          <wp:inline distT="0" distB="0" distL="0" distR="0" wp14:anchorId="11981587" wp14:editId="127E8D59">
-            <wp:extent cx="4439270" cy="1276528"/>
+          <wp:inline distT="0" distB="0" distL="0" distR="0">
+            <wp:extent cx="4438650" cy="1276350"/>
             <wp:effectExtent l="0" t="0" r="0" b="0"/>
             <wp:docPr id="804254242" name="图片 1"/>
             <wp:cNvGraphicFramePr>
@@ -818,8 +989,10 @@
               <a:graphicData uri="http://schemas.openxmlformats.org/drawingml/2006/picture">
                 <pic:pic xmlns:pic="http://schemas.openxmlformats.org/drawingml/2006/picture">
                   <pic:nvPicPr>
-                    <pic:cNvPr id="1548286323" name=""/>
-                    <pic:cNvPicPr/>
+                    <pic:cNvPr id="804254242" name="图片 1"/>
+                    <pic:cNvPicPr>
+                      <a:picLocks noChangeAspect="1"/>
+                    </pic:cNvPicPr>
                   </pic:nvPicPr>
                   <pic:blipFill>
                     <a:blip r:embed="rId17"/>
@@ -863,11 +1036,8 @@
         </w:rPr>
       </w:pPr>
       <w:r>
-        <w:rPr>
-          <w:noProof/>
-        </w:rPr>
         <w:drawing>
-          <wp:inline distT="0" distB="0" distL="0" distR="0" wp14:anchorId="1C0156BE" wp14:editId="7A696E78">
+          <wp:inline distT="0" distB="0" distL="0" distR="0">
             <wp:extent cx="5274310" cy="3923030"/>
             <wp:effectExtent l="0" t="0" r="2540" b="1270"/>
             <wp:docPr id="535531337" name="图片 1"/>
@@ -878,8 +1048,10 @@
               <a:graphicData uri="http://schemas.openxmlformats.org/drawingml/2006/picture">
                 <pic:pic xmlns:pic="http://schemas.openxmlformats.org/drawingml/2006/picture">
                   <pic:nvPicPr>
-                    <pic:cNvPr id="1719322220" name=""/>
-                    <pic:cNvPicPr/>
+                    <pic:cNvPr id="535531337" name="图片 1"/>
+                    <pic:cNvPicPr>
+                      <a:picLocks noChangeAspect="1"/>
+                    </pic:cNvPicPr>
                   </pic:nvPicPr>
                   <pic:blipFill>
                     <a:blip r:embed="rId18"/>
@@ -930,11 +1102,8 @@
         </w:rPr>
       </w:pPr>
       <w:r>
-        <w:rPr>
-          <w:noProof/>
-        </w:rPr>
         <w:drawing>
-          <wp:inline distT="0" distB="0" distL="0" distR="0" wp14:anchorId="39BFDB51" wp14:editId="104D97A8">
+          <wp:inline distT="0" distB="0" distL="0" distR="0">
             <wp:extent cx="5274310" cy="4689475"/>
             <wp:effectExtent l="0" t="0" r="2540" b="0"/>
             <wp:docPr id="1045875445" name="图片 1"/>
@@ -945,8 +1114,10 @@
               <a:graphicData uri="http://schemas.openxmlformats.org/drawingml/2006/picture">
                 <pic:pic xmlns:pic="http://schemas.openxmlformats.org/drawingml/2006/picture">
                   <pic:nvPicPr>
-                    <pic:cNvPr id="823186294" name=""/>
-                    <pic:cNvPicPr/>
+                    <pic:cNvPr id="1045875445" name="图片 1"/>
+                    <pic:cNvPicPr>
+                      <a:picLocks noChangeAspect="1"/>
+                    </pic:cNvPicPr>
                   </pic:nvPicPr>
                   <pic:blipFill>
                     <a:blip r:embed="rId19"/>
@@ -972,7 +1143,7 @@
     </w:p>
     <w:p>
       <w:pPr>
-        <w:pStyle w:val="1"/>
+        <w:pStyle w:val="2"/>
         <w:ind w:left="210" w:right="210"/>
         <w:rPr>
           <w:rFonts w:hint="eastAsia"/>
@@ -982,35 +1153,28 @@
         <w:rPr>
           <w:rFonts w:hint="eastAsia"/>
         </w:rPr>
-        <w:lastRenderedPageBreak/>
-        <w:t>LED</w:t>
-      </w:r>
-      <w:r>
-        <w:rPr>
-          <w:rFonts w:hint="eastAsia"/>
-        </w:rPr>
-        <w:t>灯模块</w:t>
-      </w:r>
-    </w:p>
-    <w:p>
-      <w:pPr>
-        <w:pStyle w:val="2"/>
+        <w:t>LED灯模块</w:t>
+      </w:r>
+    </w:p>
+    <w:p>
+      <w:pPr>
+        <w:pStyle w:val="3"/>
         <w:numPr>
           <w:ilvl w:val="0"/>
           <w:numId w:val="2"/>
         </w:numPr>
         <w:tabs>
-          <w:tab w:val="num" w:pos="720"/>
+          <w:tab w:val="left" w:pos="720"/>
         </w:tabs>
-        <w:ind w:leftChars="0" w:left="720" w:right="210" w:hanging="360"/>
-        <w:rPr>
-          <w:rFonts w:ascii="宋体" w:hAnsi="宋体" w:hint="eastAsia"/>
+        <w:ind w:left="720" w:leftChars="0" w:right="210" w:hanging="360"/>
+        <w:rPr>
+          <w:rFonts w:hint="eastAsia" w:ascii="宋体" w:hAnsi="宋体"/>
           <w:szCs w:val="28"/>
         </w:rPr>
       </w:pPr>
       <w:r>
         <w:rPr>
-          <w:rFonts w:ascii="宋体" w:hAnsi="宋体" w:hint="eastAsia"/>
+          <w:rFonts w:hint="eastAsia" w:ascii="宋体" w:hAnsi="宋体"/>
           <w:szCs w:val="28"/>
         </w:rPr>
         <w:t>配置CubeMX</w:t>
@@ -1018,7 +1182,7 @@
     </w:p>
     <w:p>
       <w:pPr>
-        <w:pStyle w:val="a9"/>
+        <w:pStyle w:val="31"/>
         <w:numPr>
           <w:ilvl w:val="0"/>
           <w:numId w:val="2"/>
@@ -1041,11 +1205,8 @@
         </w:rPr>
       </w:pPr>
       <w:r>
-        <w:rPr>
-          <w:noProof/>
-        </w:rPr>
         <w:drawing>
-          <wp:inline distT="0" distB="0" distL="0" distR="0" wp14:anchorId="52F91822" wp14:editId="391FB73B">
+          <wp:inline distT="0" distB="0" distL="0" distR="0">
             <wp:extent cx="5274310" cy="7234555"/>
             <wp:effectExtent l="0" t="0" r="2540" b="4445"/>
             <wp:docPr id="1943839528" name="图片 1"/>
@@ -1056,8 +1217,10 @@
               <a:graphicData uri="http://schemas.openxmlformats.org/drawingml/2006/picture">
                 <pic:pic xmlns:pic="http://schemas.openxmlformats.org/drawingml/2006/picture">
                   <pic:nvPicPr>
-                    <pic:cNvPr id="548479917" name=""/>
-                    <pic:cNvPicPr/>
+                    <pic:cNvPr id="1943839528" name="图片 1"/>
+                    <pic:cNvPicPr>
+                      <a:picLocks noChangeAspect="1"/>
+                    </pic:cNvPicPr>
                   </pic:nvPicPr>
                   <pic:blipFill>
                     <a:blip r:embed="rId20"/>
@@ -1098,15 +1261,11 @@
       <w:pPr>
         <w:rPr>
           <w:rFonts w:hint="eastAsia"/>
-          <w:noProof/>
-        </w:rPr>
-      </w:pPr>
-      <w:r>
-        <w:rPr>
-          <w:noProof/>
-        </w:rPr>
+        </w:rPr>
+      </w:pPr>
+      <w:r>
         <w:drawing>
-          <wp:inline distT="0" distB="0" distL="0" distR="0" wp14:anchorId="10C514F9" wp14:editId="73C25352">
+          <wp:inline distT="0" distB="0" distL="0" distR="0">
             <wp:extent cx="5274310" cy="4695825"/>
             <wp:effectExtent l="0" t="0" r="2540" b="9525"/>
             <wp:docPr id="1121640656" name="图片 1"/>
@@ -1117,8 +1276,10 @@
               <a:graphicData uri="http://schemas.openxmlformats.org/drawingml/2006/picture">
                 <pic:pic xmlns:pic="http://schemas.openxmlformats.org/drawingml/2006/picture">
                   <pic:nvPicPr>
-                    <pic:cNvPr id="28992317" name=""/>
-                    <pic:cNvPicPr/>
+                    <pic:cNvPr id="1121640656" name="图片 1"/>
+                    <pic:cNvPicPr>
+                      <a:picLocks noChangeAspect="1"/>
+                    </pic:cNvPicPr>
                   </pic:nvPicPr>
                   <pic:blipFill>
                     <a:blip r:embed="rId21"/>
@@ -1142,17 +1303,11 @@
         </w:drawing>
       </w:r>
       <w:r>
-        <w:rPr>
-          <w:noProof/>
-        </w:rPr>
         <w:t xml:space="preserve"> </w:t>
       </w:r>
       <w:r>
-        <w:rPr>
-          <w:noProof/>
-        </w:rPr>
         <w:drawing>
-          <wp:inline distT="0" distB="0" distL="0" distR="0" wp14:anchorId="010359D8" wp14:editId="789A5A0E">
+          <wp:inline distT="0" distB="0" distL="0" distR="0">
             <wp:extent cx="5274310" cy="4590415"/>
             <wp:effectExtent l="0" t="0" r="2540" b="635"/>
             <wp:docPr id="1432187969" name="图片 1"/>
@@ -1163,8 +1318,10 @@
               <a:graphicData uri="http://schemas.openxmlformats.org/drawingml/2006/picture">
                 <pic:pic xmlns:pic="http://schemas.openxmlformats.org/drawingml/2006/picture">
                   <pic:nvPicPr>
-                    <pic:cNvPr id="280433118" name=""/>
-                    <pic:cNvPicPr/>
+                    <pic:cNvPr id="1432187969" name="图片 1"/>
+                    <pic:cNvPicPr>
+                      <a:picLocks noChangeAspect="1"/>
+                    </pic:cNvPicPr>
                   </pic:nvPicPr>
                   <pic:blipFill>
                     <a:blip r:embed="rId22"/>
@@ -1197,7 +1354,7 @@
     </w:p>
     <w:p>
       <w:pPr>
-        <w:pStyle w:val="1"/>
+        <w:pStyle w:val="2"/>
         <w:ind w:left="210" w:right="210"/>
         <w:rPr>
           <w:rFonts w:hint="eastAsia"/>
@@ -1207,34 +1364,28 @@
         <w:rPr>
           <w:rFonts w:hint="eastAsia"/>
         </w:rPr>
-        <w:t>2.4G</w:t>
-      </w:r>
-      <w:r>
-        <w:rPr>
-          <w:rFonts w:hint="eastAsia"/>
-        </w:rPr>
-        <w:t>无线通信模块</w:t>
-      </w:r>
-    </w:p>
-    <w:p>
-      <w:pPr>
-        <w:pStyle w:val="2"/>
+        <w:t>2.4G无线通信模块</w:t>
+      </w:r>
+    </w:p>
+    <w:p>
+      <w:pPr>
+        <w:pStyle w:val="3"/>
         <w:numPr>
           <w:ilvl w:val="0"/>
           <w:numId w:val="2"/>
         </w:numPr>
         <w:tabs>
-          <w:tab w:val="num" w:pos="720"/>
+          <w:tab w:val="left" w:pos="720"/>
         </w:tabs>
-        <w:ind w:leftChars="0" w:left="720" w:right="210" w:hanging="360"/>
-        <w:rPr>
-          <w:rFonts w:ascii="宋体" w:hAnsi="宋体" w:hint="eastAsia"/>
+        <w:ind w:left="720" w:leftChars="0" w:right="210" w:hanging="360"/>
+        <w:rPr>
+          <w:rFonts w:hint="eastAsia" w:ascii="宋体" w:hAnsi="宋体"/>
           <w:szCs w:val="28"/>
         </w:rPr>
       </w:pPr>
       <w:r>
         <w:rPr>
-          <w:rFonts w:ascii="宋体" w:hAnsi="宋体" w:hint="eastAsia"/>
+          <w:rFonts w:hint="eastAsia" w:ascii="宋体" w:hAnsi="宋体"/>
           <w:szCs w:val="28"/>
         </w:rPr>
         <w:t>配置CubeMX</w:t>
@@ -1242,7 +1393,7 @@
     </w:p>
     <w:p>
       <w:pPr>
-        <w:pStyle w:val="a9"/>
+        <w:pStyle w:val="31"/>
         <w:numPr>
           <w:ilvl w:val="0"/>
           <w:numId w:val="2"/>
@@ -1266,11 +1417,8 @@
         </w:rPr>
       </w:pPr>
       <w:r>
-        <w:rPr>
-          <w:noProof/>
-        </w:rPr>
         <w:drawing>
-          <wp:inline distT="0" distB="0" distL="0" distR="0" wp14:anchorId="05004C99" wp14:editId="77873723">
+          <wp:inline distT="0" distB="0" distL="0" distR="0">
             <wp:extent cx="5274310" cy="3739515"/>
             <wp:effectExtent l="0" t="0" r="2540" b="0"/>
             <wp:docPr id="804628036" name="图片 1"/>
@@ -1281,8 +1429,10 @@
               <a:graphicData uri="http://schemas.openxmlformats.org/drawingml/2006/picture">
                 <pic:pic xmlns:pic="http://schemas.openxmlformats.org/drawingml/2006/picture">
                   <pic:nvPicPr>
-                    <pic:cNvPr id="1464185912" name=""/>
-                    <pic:cNvPicPr/>
+                    <pic:cNvPr id="804628036" name="图片 1"/>
+                    <pic:cNvPicPr>
+                      <a:picLocks noChangeAspect="1"/>
+                    </pic:cNvPicPr>
                   </pic:nvPicPr>
                   <pic:blipFill>
                     <a:blip r:embed="rId23"/>
@@ -1323,15 +1473,11 @@
       <w:pPr>
         <w:rPr>
           <w:rFonts w:hint="eastAsia"/>
-          <w:noProof/>
-        </w:rPr>
-      </w:pPr>
-      <w:r>
-        <w:rPr>
-          <w:noProof/>
-        </w:rPr>
+        </w:rPr>
+      </w:pPr>
+      <w:r>
         <w:drawing>
-          <wp:inline distT="0" distB="0" distL="0" distR="0" wp14:anchorId="195B2457" wp14:editId="588DE35D">
+          <wp:inline distT="0" distB="0" distL="0" distR="0">
             <wp:extent cx="5274310" cy="3724910"/>
             <wp:effectExtent l="0" t="0" r="2540" b="8890"/>
             <wp:docPr id="1608876251" name="图片 1"/>
@@ -1342,8 +1488,10 @@
               <a:graphicData uri="http://schemas.openxmlformats.org/drawingml/2006/picture">
                 <pic:pic xmlns:pic="http://schemas.openxmlformats.org/drawingml/2006/picture">
                   <pic:nvPicPr>
-                    <pic:cNvPr id="131245128" name=""/>
-                    <pic:cNvPicPr/>
+                    <pic:cNvPr id="1608876251" name="图片 1"/>
+                    <pic:cNvPicPr>
+                      <a:picLocks noChangeAspect="1"/>
+                    </pic:cNvPicPr>
                   </pic:nvPicPr>
                   <pic:blipFill>
                     <a:blip r:embed="rId24"/>
@@ -1371,13 +1519,11 @@
       <w:pPr>
         <w:rPr>
           <w:rFonts w:hint="eastAsia"/>
-          <w:noProof/>
-        </w:rPr>
-      </w:pPr>
-      <w:r>
-        <w:rPr>
-          <w:rFonts w:hint="eastAsia"/>
-          <w:noProof/>
+        </w:rPr>
+      </w:pPr>
+      <w:r>
+        <w:rPr>
+          <w:rFonts w:hint="eastAsia"/>
         </w:rPr>
         <w:t>完成硬件SPI1对应的配置后PA5，PA6，PA7引脚自动配置完成</w:t>
       </w:r>
@@ -1386,15 +1532,11 @@
       <w:pPr>
         <w:rPr>
           <w:rFonts w:hint="eastAsia"/>
-          <w:noProof/>
-        </w:rPr>
-      </w:pPr>
-      <w:r>
-        <w:rPr>
-          <w:noProof/>
-        </w:rPr>
+        </w:rPr>
+      </w:pPr>
+      <w:r>
         <w:drawing>
-          <wp:inline distT="0" distB="0" distL="0" distR="0" wp14:anchorId="565844BF" wp14:editId="135224B0">
+          <wp:inline distT="0" distB="0" distL="0" distR="0">
             <wp:extent cx="1028700" cy="2505075"/>
             <wp:effectExtent l="4762" t="0" r="4763" b="4762"/>
             <wp:docPr id="797657499" name="图片 1"/>
@@ -1405,8 +1547,10 @@
               <a:graphicData uri="http://schemas.openxmlformats.org/drawingml/2006/picture">
                 <pic:pic xmlns:pic="http://schemas.openxmlformats.org/drawingml/2006/picture">
                   <pic:nvPicPr>
-                    <pic:cNvPr id="856138098" name=""/>
-                    <pic:cNvPicPr/>
+                    <pic:cNvPr id="797657499" name="图片 1"/>
+                    <pic:cNvPicPr>
+                      <a:picLocks noChangeAspect="1"/>
+                    </pic:cNvPicPr>
                   </pic:nvPicPr>
                   <pic:blipFill>
                     <a:blip r:embed="rId25"/>
@@ -1432,15 +1576,46 @@
     </w:p>
     <w:tbl>
       <w:tblPr>
-        <w:tblStyle w:val="af3"/>
+        <w:tblStyle w:val="16"/>
         <w:tblW w:w="0" w:type="auto"/>
-        <w:tblLook w:val="04A0" w:firstRow="1" w:lastRow="0" w:firstColumn="1" w:lastColumn="0" w:noHBand="0" w:noVBand="1"/>
+        <w:tblInd w:w="0" w:type="dxa"/>
+        <w:tblBorders>
+          <w:top w:val="single" w:color="auto" w:sz="4" w:space="0"/>
+          <w:left w:val="single" w:color="auto" w:sz="4" w:space="0"/>
+          <w:bottom w:val="single" w:color="auto" w:sz="4" w:space="0"/>
+          <w:right w:val="single" w:color="auto" w:sz="4" w:space="0"/>
+          <w:insideH w:val="single" w:color="auto" w:sz="4" w:space="0"/>
+          <w:insideV w:val="single" w:color="auto" w:sz="4" w:space="0"/>
+        </w:tblBorders>
+        <w:tblLayout w:type="autofit"/>
+        <w:tblCellMar>
+          <w:top w:w="0" w:type="dxa"/>
+          <w:left w:w="108" w:type="dxa"/>
+          <w:bottom w:w="0" w:type="dxa"/>
+          <w:right w:w="108" w:type="dxa"/>
+        </w:tblCellMar>
       </w:tblPr>
       <w:tblGrid>
         <w:gridCol w:w="3964"/>
         <w:gridCol w:w="3969"/>
       </w:tblGrid>
       <w:tr>
+        <w:tblPrEx>
+          <w:tblBorders>
+            <w:top w:val="single" w:color="auto" w:sz="4" w:space="0"/>
+            <w:left w:val="single" w:color="auto" w:sz="4" w:space="0"/>
+            <w:bottom w:val="single" w:color="auto" w:sz="4" w:space="0"/>
+            <w:right w:val="single" w:color="auto" w:sz="4" w:space="0"/>
+            <w:insideH w:val="single" w:color="auto" w:sz="4" w:space="0"/>
+            <w:insideV w:val="single" w:color="auto" w:sz="4" w:space="0"/>
+          </w:tblBorders>
+          <w:tblCellMar>
+            <w:top w:w="0" w:type="dxa"/>
+            <w:left w:w="108" w:type="dxa"/>
+            <w:bottom w:w="0" w:type="dxa"/>
+            <w:right w:w="108" w:type="dxa"/>
+          </w:tblCellMar>
+        </w:tblPrEx>
         <w:tc>
           <w:tcPr>
             <w:tcW w:w="3964" w:type="dxa"/>
@@ -1449,15 +1624,11 @@
             <w:pPr>
               <w:rPr>
                 <w:rFonts w:hint="eastAsia"/>
-                <w:noProof/>
               </w:rPr>
             </w:pPr>
             <w:r>
-              <w:rPr>
-                <w:noProof/>
-              </w:rPr>
               <w:drawing>
-                <wp:inline distT="0" distB="0" distL="0" distR="0" wp14:anchorId="51562A7C" wp14:editId="71A8B9E0">
+                <wp:inline distT="0" distB="0" distL="0" distR="0">
                   <wp:extent cx="2257425" cy="3505200"/>
                   <wp:effectExtent l="0" t="0" r="9525" b="0"/>
                   <wp:docPr id="1355454100" name="图片 1"/>
@@ -1468,8 +1639,10 @@
                     <a:graphicData uri="http://schemas.openxmlformats.org/drawingml/2006/picture">
                       <pic:pic xmlns:pic="http://schemas.openxmlformats.org/drawingml/2006/picture">
                         <pic:nvPicPr>
-                          <pic:cNvPr id="1392631470" name=""/>
-                          <pic:cNvPicPr/>
+                          <pic:cNvPr id="1355454100" name="图片 1"/>
+                          <pic:cNvPicPr>
+                            <a:picLocks noChangeAspect="1"/>
+                          </pic:cNvPicPr>
                         </pic:nvPicPr>
                         <pic:blipFill>
                           <a:blip r:embed="rId26"/>
@@ -1502,16 +1675,12 @@
             <w:pPr>
               <w:rPr>
                 <w:rFonts w:hint="eastAsia"/>
-                <w:noProof/>
               </w:rPr>
             </w:pPr>
             <w:r>
-              <w:rPr>
-                <w:noProof/>
-              </w:rPr>
               <w:drawing>
-                <wp:inline distT="0" distB="0" distL="0" distR="0" wp14:anchorId="70EFB69D" wp14:editId="373DA922">
-                  <wp:extent cx="1800225" cy="3510987"/>
+                <wp:inline distT="0" distB="0" distL="0" distR="0">
+                  <wp:extent cx="1800225" cy="3510915"/>
                   <wp:effectExtent l="0" t="0" r="0" b="0"/>
                   <wp:docPr id="1341782078" name="图片 1"/>
                   <wp:cNvGraphicFramePr>
@@ -1521,8 +1690,10 @@
                     <a:graphicData uri="http://schemas.openxmlformats.org/drawingml/2006/picture">
                       <pic:pic xmlns:pic="http://schemas.openxmlformats.org/drawingml/2006/picture">
                         <pic:nvPicPr>
-                          <pic:cNvPr id="1085044766" name=""/>
-                          <pic:cNvPicPr/>
+                          <pic:cNvPr id="1341782078" name="图片 1"/>
+                          <pic:cNvPicPr>
+                            <a:picLocks noChangeAspect="1"/>
+                          </pic:cNvPicPr>
                         </pic:nvPicPr>
                         <pic:blipFill>
                           <a:blip r:embed="rId27"/>
@@ -1553,15 +1724,11 @@
       <w:pPr>
         <w:rPr>
           <w:rFonts w:hint="eastAsia"/>
-          <w:noProof/>
-        </w:rPr>
-      </w:pPr>
-      <w:r>
-        <w:rPr>
-          <w:noProof/>
-        </w:rPr>
+        </w:rPr>
+      </w:pPr>
+      <w:r>
         <w:drawing>
-          <wp:inline distT="0" distB="0" distL="0" distR="0" wp14:anchorId="538E602E" wp14:editId="180CB4F5">
+          <wp:inline distT="0" distB="0" distL="0" distR="0">
             <wp:extent cx="5274310" cy="3002280"/>
             <wp:effectExtent l="0" t="0" r="2540" b="7620"/>
             <wp:docPr id="790671085" name="图片 1"/>
@@ -1572,8 +1739,10 @@
               <a:graphicData uri="http://schemas.openxmlformats.org/drawingml/2006/picture">
                 <pic:pic xmlns:pic="http://schemas.openxmlformats.org/drawingml/2006/picture">
                   <pic:nvPicPr>
-                    <pic:cNvPr id="1812742494" name=""/>
-                    <pic:cNvPicPr/>
+                    <pic:cNvPr id="790671085" name="图片 1"/>
+                    <pic:cNvPicPr>
+                      <a:picLocks noChangeAspect="1"/>
+                    </pic:cNvPicPr>
                   </pic:nvPicPr>
                   <pic:blipFill>
                     <a:blip r:embed="rId28"/>
@@ -1601,13 +1770,12 @@
       <w:pPr>
         <w:rPr>
           <w:rFonts w:hint="eastAsia"/>
-          <w:noProof/>
-        </w:rPr>
-      </w:pPr>
-    </w:p>
-    <w:p>
-      <w:pPr>
-        <w:pStyle w:val="1"/>
+        </w:rPr>
+      </w:pPr>
+    </w:p>
+    <w:p>
+      <w:pPr>
+        <w:pStyle w:val="2"/>
         <w:ind w:left="210" w:right="210"/>
         <w:rPr>
           <w:rFonts w:hint="eastAsia"/>
@@ -1622,23 +1790,23 @@
     </w:p>
     <w:p>
       <w:pPr>
-        <w:pStyle w:val="2"/>
+        <w:pStyle w:val="3"/>
         <w:numPr>
           <w:ilvl w:val="0"/>
           <w:numId w:val="2"/>
         </w:numPr>
         <w:tabs>
-          <w:tab w:val="num" w:pos="720"/>
+          <w:tab w:val="left" w:pos="720"/>
         </w:tabs>
-        <w:ind w:leftChars="0" w:left="720" w:right="210" w:hanging="360"/>
-        <w:rPr>
-          <w:rFonts w:ascii="宋体" w:hAnsi="宋体" w:hint="eastAsia"/>
+        <w:ind w:left="720" w:leftChars="0" w:right="210" w:hanging="360"/>
+        <w:rPr>
+          <w:rFonts w:hint="eastAsia" w:ascii="宋体" w:hAnsi="宋体"/>
           <w:szCs w:val="28"/>
         </w:rPr>
       </w:pPr>
       <w:r>
         <w:rPr>
-          <w:rFonts w:ascii="宋体" w:hAnsi="宋体" w:hint="eastAsia"/>
+          <w:rFonts w:hint="eastAsia" w:ascii="宋体" w:hAnsi="宋体"/>
           <w:szCs w:val="28"/>
         </w:rPr>
         <w:t>配置CubeMX</w:t>
@@ -1646,7 +1814,7 @@
     </w:p>
     <w:p>
       <w:pPr>
-        <w:pStyle w:val="a9"/>
+        <w:pStyle w:val="31"/>
         <w:numPr>
           <w:ilvl w:val="0"/>
           <w:numId w:val="2"/>
@@ -1670,11 +1838,8 @@
         </w:rPr>
       </w:pPr>
       <w:r>
-        <w:rPr>
-          <w:noProof/>
-        </w:rPr>
         <w:drawing>
-          <wp:inline distT="0" distB="0" distL="0" distR="0" wp14:anchorId="27F8AC02" wp14:editId="09EBA1D2">
+          <wp:inline distT="0" distB="0" distL="0" distR="0">
             <wp:extent cx="3114675" cy="2305050"/>
             <wp:effectExtent l="0" t="0" r="9525" b="0"/>
             <wp:docPr id="77486376" name="图片 1"/>
@@ -1685,8 +1850,10 @@
               <a:graphicData uri="http://schemas.openxmlformats.org/drawingml/2006/picture">
                 <pic:pic xmlns:pic="http://schemas.openxmlformats.org/drawingml/2006/picture">
                   <pic:nvPicPr>
-                    <pic:cNvPr id="1099470636" name=""/>
-                    <pic:cNvPicPr/>
+                    <pic:cNvPr id="77486376" name="图片 1"/>
+                    <pic:cNvPicPr>
+                      <a:picLocks noChangeAspect="1"/>
+                    </pic:cNvPicPr>
                   </pic:nvPicPr>
                   <pic:blipFill>
                     <a:blip r:embed="rId29"/>
@@ -1718,11 +1885,8 @@
         </w:rPr>
       </w:pPr>
       <w:r>
-        <w:rPr>
-          <w:noProof/>
-        </w:rPr>
         <w:drawing>
-          <wp:inline distT="0" distB="0" distL="0" distR="0" wp14:anchorId="2FABA7A4" wp14:editId="674B1AD0">
+          <wp:inline distT="0" distB="0" distL="0" distR="0">
             <wp:extent cx="5274310" cy="3527425"/>
             <wp:effectExtent l="0" t="0" r="2540" b="0"/>
             <wp:docPr id="1474636597" name="图片 1"/>
@@ -1733,8 +1897,10 @@
               <a:graphicData uri="http://schemas.openxmlformats.org/drawingml/2006/picture">
                 <pic:pic xmlns:pic="http://schemas.openxmlformats.org/drawingml/2006/picture">
                   <pic:nvPicPr>
-                    <pic:cNvPr id="1610163936" name=""/>
-                    <pic:cNvPicPr/>
+                    <pic:cNvPr id="1474636597" name="图片 1"/>
+                    <pic:cNvPicPr>
+                      <a:picLocks noChangeAspect="1"/>
+                    </pic:cNvPicPr>
                   </pic:nvPicPr>
                   <pic:blipFill>
                     <a:blip r:embed="rId30"/>
@@ -1780,11 +1946,8 @@
         </w:rPr>
       </w:pPr>
       <w:r>
-        <w:rPr>
-          <w:noProof/>
-        </w:rPr>
         <w:drawing>
-          <wp:inline distT="0" distB="0" distL="0" distR="0" wp14:anchorId="47508E68" wp14:editId="7873F462">
+          <wp:inline distT="0" distB="0" distL="0" distR="0">
             <wp:extent cx="5274310" cy="3162935"/>
             <wp:effectExtent l="0" t="0" r="2540" b="0"/>
             <wp:docPr id="1304792490" name="图片 1"/>
@@ -1795,8 +1958,10 @@
               <a:graphicData uri="http://schemas.openxmlformats.org/drawingml/2006/picture">
                 <pic:pic xmlns:pic="http://schemas.openxmlformats.org/drawingml/2006/picture">
                   <pic:nvPicPr>
-                    <pic:cNvPr id="1266986051" name=""/>
-                    <pic:cNvPicPr/>
+                    <pic:cNvPr id="1304792490" name="图片 1"/>
+                    <pic:cNvPicPr>
+                      <a:picLocks noChangeAspect="1"/>
+                    </pic:cNvPicPr>
                   </pic:nvPicPr>
                   <pic:blipFill>
                     <a:blip r:embed="rId31"/>
@@ -1822,7 +1987,7 @@
     </w:p>
     <w:p>
       <w:pPr>
-        <w:pStyle w:val="1"/>
+        <w:pStyle w:val="2"/>
         <w:ind w:left="210" w:right="210"/>
         <w:rPr>
           <w:rFonts w:hint="eastAsia"/>
@@ -1832,40 +1997,28 @@
         <w:rPr>
           <w:rFonts w:hint="eastAsia"/>
         </w:rPr>
-        <w:t>遥控器摇杆</w:t>
-      </w:r>
-      <w:r>
-        <w:rPr>
-          <w:rFonts w:hint="eastAsia"/>
-        </w:rPr>
-        <w:t>ADC</w:t>
-      </w:r>
-      <w:r>
-        <w:rPr>
-          <w:rFonts w:hint="eastAsia"/>
-        </w:rPr>
-        <w:t>模块</w:t>
-      </w:r>
-    </w:p>
-    <w:p>
-      <w:pPr>
-        <w:pStyle w:val="2"/>
+        <w:t>遥控器摇杆ADC模块</w:t>
+      </w:r>
+    </w:p>
+    <w:p>
+      <w:pPr>
+        <w:pStyle w:val="3"/>
         <w:numPr>
           <w:ilvl w:val="0"/>
           <w:numId w:val="2"/>
         </w:numPr>
         <w:tabs>
-          <w:tab w:val="num" w:pos="720"/>
+          <w:tab w:val="left" w:pos="720"/>
         </w:tabs>
-        <w:ind w:leftChars="0" w:left="720" w:right="210" w:hanging="360"/>
-        <w:rPr>
-          <w:rFonts w:ascii="宋体" w:hAnsi="宋体" w:hint="eastAsia"/>
+        <w:ind w:left="720" w:leftChars="0" w:right="210" w:hanging="360"/>
+        <w:rPr>
+          <w:rFonts w:hint="eastAsia" w:ascii="宋体" w:hAnsi="宋体"/>
           <w:szCs w:val="28"/>
         </w:rPr>
       </w:pPr>
       <w:r>
         <w:rPr>
-          <w:rFonts w:ascii="宋体" w:hAnsi="宋体" w:hint="eastAsia"/>
+          <w:rFonts w:hint="eastAsia" w:ascii="宋体" w:hAnsi="宋体"/>
           <w:szCs w:val="28"/>
         </w:rPr>
         <w:t>配置CubeMX</w:t>
@@ -1873,7 +2026,7 @@
     </w:p>
     <w:p>
       <w:pPr>
-        <w:pStyle w:val="a9"/>
+        <w:pStyle w:val="31"/>
         <w:numPr>
           <w:ilvl w:val="0"/>
           <w:numId w:val="2"/>
@@ -1896,11 +2049,8 @@
         </w:rPr>
       </w:pPr>
       <w:r>
-        <w:rPr>
-          <w:noProof/>
-        </w:rPr>
         <w:drawing>
-          <wp:inline distT="0" distB="0" distL="0" distR="0" wp14:anchorId="51336C0A" wp14:editId="3CC4AC40">
+          <wp:inline distT="0" distB="0" distL="0" distR="0">
             <wp:extent cx="5274310" cy="4153535"/>
             <wp:effectExtent l="0" t="0" r="2540" b="0"/>
             <wp:docPr id="600455232" name="图片 1"/>
@@ -1911,8 +2061,10 @@
               <a:graphicData uri="http://schemas.openxmlformats.org/drawingml/2006/picture">
                 <pic:pic xmlns:pic="http://schemas.openxmlformats.org/drawingml/2006/picture">
                   <pic:nvPicPr>
-                    <pic:cNvPr id="1731301991" name=""/>
-                    <pic:cNvPicPr/>
+                    <pic:cNvPr id="600455232" name="图片 1"/>
+                    <pic:cNvPicPr>
+                      <a:picLocks noChangeAspect="1"/>
+                    </pic:cNvPicPr>
                   </pic:nvPicPr>
                   <pic:blipFill>
                     <a:blip r:embed="rId32"/>
@@ -1958,11 +2110,8 @@
         </w:rPr>
       </w:pPr>
       <w:r>
-        <w:rPr>
-          <w:noProof/>
-        </w:rPr>
         <w:drawing>
-          <wp:inline distT="0" distB="0" distL="0" distR="0" wp14:anchorId="6010ED50" wp14:editId="046CFCA5">
+          <wp:inline distT="0" distB="0" distL="0" distR="0">
             <wp:extent cx="5274310" cy="3081655"/>
             <wp:effectExtent l="0" t="0" r="2540" b="4445"/>
             <wp:docPr id="509973182" name="图片 1"/>
@@ -1973,8 +2122,10 @@
               <a:graphicData uri="http://schemas.openxmlformats.org/drawingml/2006/picture">
                 <pic:pic xmlns:pic="http://schemas.openxmlformats.org/drawingml/2006/picture">
                   <pic:nvPicPr>
-                    <pic:cNvPr id="1437936737" name=""/>
-                    <pic:cNvPicPr/>
+                    <pic:cNvPr id="509973182" name="图片 1"/>
+                    <pic:cNvPicPr>
+                      <a:picLocks noChangeAspect="1"/>
+                    </pic:cNvPicPr>
                   </pic:nvPicPr>
                   <pic:blipFill>
                     <a:blip r:embed="rId33"/>
@@ -1998,17 +2149,11 @@
         </w:drawing>
       </w:r>
       <w:r>
-        <w:rPr>
-          <w:noProof/>
-        </w:rPr>
         <w:t xml:space="preserve"> </w:t>
       </w:r>
       <w:r>
-        <w:rPr>
-          <w:noProof/>
-        </w:rPr>
         <w:drawing>
-          <wp:inline distT="0" distB="0" distL="0" distR="0" wp14:anchorId="6424EC9A" wp14:editId="7795C5A8">
+          <wp:inline distT="0" distB="0" distL="0" distR="0">
             <wp:extent cx="5274310" cy="3822700"/>
             <wp:effectExtent l="0" t="0" r="2540" b="6350"/>
             <wp:docPr id="558116508" name="图片 1"/>
@@ -2019,8 +2164,10 @@
               <a:graphicData uri="http://schemas.openxmlformats.org/drawingml/2006/picture">
                 <pic:pic xmlns:pic="http://schemas.openxmlformats.org/drawingml/2006/picture">
                   <pic:nvPicPr>
-                    <pic:cNvPr id="370721620" name=""/>
-                    <pic:cNvPicPr/>
+                    <pic:cNvPr id="558116508" name="图片 1"/>
+                    <pic:cNvPicPr>
+                      <a:picLocks noChangeAspect="1"/>
+                    </pic:cNvPicPr>
                   </pic:nvPicPr>
                   <pic:blipFill>
                     <a:blip r:embed="rId34"/>
@@ -2044,17 +2191,11 @@
         </w:drawing>
       </w:r>
       <w:r>
-        <w:rPr>
-          <w:noProof/>
-        </w:rPr>
         <w:t xml:space="preserve"> </w:t>
       </w:r>
       <w:r>
-        <w:rPr>
-          <w:noProof/>
-        </w:rPr>
         <w:drawing>
-          <wp:inline distT="0" distB="0" distL="0" distR="0" wp14:anchorId="47CCA595" wp14:editId="10F9202C">
+          <wp:inline distT="0" distB="0" distL="0" distR="0">
             <wp:extent cx="5274310" cy="2336800"/>
             <wp:effectExtent l="0" t="0" r="2540" b="6350"/>
             <wp:docPr id="892904286" name="图片 1"/>
@@ -2065,8 +2206,10 @@
               <a:graphicData uri="http://schemas.openxmlformats.org/drawingml/2006/picture">
                 <pic:pic xmlns:pic="http://schemas.openxmlformats.org/drawingml/2006/picture">
                   <pic:nvPicPr>
-                    <pic:cNvPr id="174670126" name=""/>
-                    <pic:cNvPicPr/>
+                    <pic:cNvPr id="892904286" name="图片 1"/>
+                    <pic:cNvPicPr>
+                      <a:picLocks noChangeAspect="1"/>
+                    </pic:cNvPicPr>
                   </pic:nvPicPr>
                   <pic:blipFill>
                     <a:blip r:embed="rId35"/>
@@ -2090,17 +2233,11 @@
         </w:drawing>
       </w:r>
       <w:r>
-        <w:rPr>
-          <w:noProof/>
-        </w:rPr>
         <w:t xml:space="preserve"> </w:t>
       </w:r>
       <w:r>
-        <w:rPr>
-          <w:noProof/>
-        </w:rPr>
         <w:drawing>
-          <wp:inline distT="0" distB="0" distL="0" distR="0" wp14:anchorId="4053DFB2" wp14:editId="6CB993D7">
+          <wp:inline distT="0" distB="0" distL="0" distR="0">
             <wp:extent cx="5274310" cy="3284220"/>
             <wp:effectExtent l="0" t="0" r="2540" b="0"/>
             <wp:docPr id="1430425733" name="图片 1"/>
@@ -2111,8 +2248,10 @@
               <a:graphicData uri="http://schemas.openxmlformats.org/drawingml/2006/picture">
                 <pic:pic xmlns:pic="http://schemas.openxmlformats.org/drawingml/2006/picture">
                   <pic:nvPicPr>
-                    <pic:cNvPr id="125574799" name=""/>
-                    <pic:cNvPicPr/>
+                    <pic:cNvPr id="1430425733" name="图片 1"/>
+                    <pic:cNvPicPr>
+                      <a:picLocks noChangeAspect="1"/>
+                    </pic:cNvPicPr>
                   </pic:nvPicPr>
                   <pic:blipFill>
                     <a:blip r:embed="rId36"/>
@@ -2138,7 +2277,7 @@
     </w:p>
     <w:p>
       <w:pPr>
-        <w:pStyle w:val="1"/>
+        <w:pStyle w:val="2"/>
         <w:ind w:left="210" w:right="210"/>
         <w:rPr>
           <w:rFonts w:hint="eastAsia"/>
@@ -2148,34 +2287,28 @@
         <w:rPr>
           <w:rFonts w:hint="eastAsia"/>
         </w:rPr>
-        <w:t>MPU6050</w:t>
-      </w:r>
-      <w:r>
-        <w:rPr>
-          <w:rFonts w:hint="eastAsia"/>
-        </w:rPr>
-        <w:t>模块</w:t>
-      </w:r>
-    </w:p>
-    <w:p>
-      <w:pPr>
-        <w:pStyle w:val="2"/>
+        <w:t>MPU6050模块</w:t>
+      </w:r>
+    </w:p>
+    <w:p>
+      <w:pPr>
+        <w:pStyle w:val="3"/>
         <w:numPr>
           <w:ilvl w:val="0"/>
           <w:numId w:val="2"/>
         </w:numPr>
         <w:tabs>
-          <w:tab w:val="num" w:pos="720"/>
+          <w:tab w:val="left" w:pos="720"/>
         </w:tabs>
-        <w:ind w:leftChars="0" w:left="720" w:right="210" w:hanging="360"/>
-        <w:rPr>
-          <w:rFonts w:ascii="宋体" w:hAnsi="宋体" w:hint="eastAsia"/>
+        <w:ind w:left="720" w:leftChars="0" w:right="210" w:hanging="360"/>
+        <w:rPr>
+          <w:rFonts w:hint="eastAsia" w:ascii="宋体" w:hAnsi="宋体"/>
           <w:szCs w:val="28"/>
         </w:rPr>
       </w:pPr>
       <w:r>
         <w:rPr>
-          <w:rFonts w:ascii="宋体" w:hAnsi="宋体" w:hint="eastAsia"/>
+          <w:rFonts w:hint="eastAsia" w:ascii="宋体" w:hAnsi="宋体"/>
           <w:szCs w:val="28"/>
         </w:rPr>
         <w:t>配置CubeMX</w:t>
@@ -2183,7 +2316,7 @@
     </w:p>
     <w:p>
       <w:pPr>
-        <w:pStyle w:val="a9"/>
+        <w:pStyle w:val="31"/>
         <w:numPr>
           <w:ilvl w:val="0"/>
           <w:numId w:val="2"/>
@@ -2206,11 +2339,8 @@
         </w:rPr>
       </w:pPr>
       <w:r>
-        <w:rPr>
-          <w:noProof/>
-        </w:rPr>
         <w:drawing>
-          <wp:inline distT="0" distB="0" distL="0" distR="0" wp14:anchorId="271994B3" wp14:editId="1B6A5FC9">
+          <wp:inline distT="0" distB="0" distL="0" distR="0">
             <wp:extent cx="3800475" cy="1200150"/>
             <wp:effectExtent l="0" t="0" r="9525" b="0"/>
             <wp:docPr id="1559541119" name="图片 1"/>
@@ -2221,8 +2351,10 @@
               <a:graphicData uri="http://schemas.openxmlformats.org/drawingml/2006/picture">
                 <pic:pic xmlns:pic="http://schemas.openxmlformats.org/drawingml/2006/picture">
                   <pic:nvPicPr>
-                    <pic:cNvPr id="528997533" name=""/>
-                    <pic:cNvPicPr/>
+                    <pic:cNvPr id="1559541119" name="图片 1"/>
+                    <pic:cNvPicPr>
+                      <a:picLocks noChangeAspect="1"/>
+                    </pic:cNvPicPr>
                   </pic:nvPicPr>
                   <pic:blipFill>
                     <a:blip r:embed="rId37"/>
@@ -2268,23 +2400,11 @@
         </w:rPr>
       </w:pPr>
       <w:r>
-        <w:rPr>
-          <w:noProof/>
-        </w:rPr>
-        <w:t xml:space="preserve"> </w:t>
-      </w:r>
-      <w:r>
-        <w:rPr>
-          <w:noProof/>
-        </w:rPr>
-        <w:t xml:space="preserve">  </w:t>
-      </w:r>
-      <w:r>
-        <w:rPr>
-          <w:noProof/>
-        </w:rPr>
+        <w:t xml:space="preserve">   </w:t>
+      </w:r>
+      <w:r>
         <w:drawing>
-          <wp:inline distT="0" distB="0" distL="0" distR="0" wp14:anchorId="5AE963CE" wp14:editId="46A6C21B">
+          <wp:inline distT="0" distB="0" distL="0" distR="0">
             <wp:extent cx="5274310" cy="4109720"/>
             <wp:effectExtent l="0" t="0" r="2540" b="5080"/>
             <wp:docPr id="1229927056" name="图片 1"/>
@@ -2295,8 +2415,10 @@
               <a:graphicData uri="http://schemas.openxmlformats.org/drawingml/2006/picture">
                 <pic:pic xmlns:pic="http://schemas.openxmlformats.org/drawingml/2006/picture">
                   <pic:nvPicPr>
-                    <pic:cNvPr id="1016318225" name=""/>
-                    <pic:cNvPicPr/>
+                    <pic:cNvPr id="1229927056" name="图片 1"/>
+                    <pic:cNvPicPr>
+                      <a:picLocks noChangeAspect="1"/>
+                    </pic:cNvPicPr>
                   </pic:nvPicPr>
                   <pic:blipFill>
                     <a:blip r:embed="rId38"/>
@@ -2322,7 +2444,7 @@
     </w:p>
     <w:p>
       <w:pPr>
-        <w:pStyle w:val="1"/>
+        <w:pStyle w:val="2"/>
         <w:ind w:left="210" w:right="210"/>
         <w:rPr>
           <w:rFonts w:hint="eastAsia"/>
@@ -2337,20 +2459,20 @@
     </w:p>
     <w:p>
       <w:pPr>
-        <w:pStyle w:val="2"/>
+        <w:pStyle w:val="3"/>
         <w:numPr>
           <w:ilvl w:val="0"/>
           <w:numId w:val="2"/>
         </w:numPr>
         <w:ind w:leftChars="0" w:right="210"/>
         <w:rPr>
-          <w:rFonts w:ascii="宋体" w:hAnsi="宋体" w:hint="eastAsia"/>
+          <w:rFonts w:hint="eastAsia" w:ascii="宋体" w:hAnsi="宋体"/>
           <w:szCs w:val="28"/>
         </w:rPr>
       </w:pPr>
       <w:r>
         <w:rPr>
-          <w:rFonts w:ascii="宋体" w:hAnsi="宋体" w:hint="eastAsia"/>
+          <w:rFonts w:hint="eastAsia" w:ascii="宋体" w:hAnsi="宋体"/>
           <w:szCs w:val="28"/>
         </w:rPr>
         <w:t>配置CubeMX</w:t>
@@ -2358,7 +2480,7 @@
     </w:p>
     <w:p>
       <w:pPr>
-        <w:pStyle w:val="a9"/>
+        <w:pStyle w:val="31"/>
         <w:numPr>
           <w:ilvl w:val="0"/>
           <w:numId w:val="2"/>
@@ -2371,27 +2493,18 @@
         <w:rPr>
           <w:rFonts w:hint="eastAsia"/>
         </w:rPr>
-        <w:t>原理图</w:t>
-      </w:r>
-      <w:r>
-        <w:rPr>
-          <w:rFonts w:hint="eastAsia"/>
-        </w:rPr>
-        <w:t>引脚分布</w:t>
-      </w:r>
-    </w:p>
-    <w:p>
-      <w:pPr>
-        <w:rPr>
-          <w:rFonts w:hint="eastAsia"/>
-        </w:rPr>
-      </w:pPr>
-      <w:r>
-        <w:rPr>
-          <w:noProof/>
-        </w:rPr>
+        <w:t>原理图引脚分布</w:t>
+      </w:r>
+    </w:p>
+    <w:p>
+      <w:pPr>
+        <w:rPr>
+          <w:rFonts w:hint="eastAsia"/>
+        </w:rPr>
+      </w:pPr>
+      <w:r>
         <w:drawing>
-          <wp:inline distT="0" distB="0" distL="0" distR="0" wp14:anchorId="1C282312" wp14:editId="3A8F1A93">
+          <wp:inline distT="0" distB="0" distL="0" distR="0">
             <wp:extent cx="5274310" cy="2129155"/>
             <wp:effectExtent l="0" t="0" r="2540" b="4445"/>
             <wp:docPr id="1232356885" name="图片 1"/>
@@ -2402,8 +2515,10 @@
               <a:graphicData uri="http://schemas.openxmlformats.org/drawingml/2006/picture">
                 <pic:pic xmlns:pic="http://schemas.openxmlformats.org/drawingml/2006/picture">
                   <pic:nvPicPr>
-                    <pic:cNvPr id="1232356885" name=""/>
-                    <pic:cNvPicPr/>
+                    <pic:cNvPr id="1232356885" name="图片 1"/>
+                    <pic:cNvPicPr>
+                      <a:picLocks noChangeAspect="1"/>
+                    </pic:cNvPicPr>
                   </pic:nvPicPr>
                   <pic:blipFill>
                     <a:blip r:embed="rId39"/>
@@ -2446,27 +2561,14 @@
         <w:ind w:left="210"/>
         <w:rPr>
           <w:rFonts w:hint="eastAsia"/>
-          <w:noProof/>
-        </w:rPr>
-      </w:pPr>
-      <w:r>
-        <w:rPr>
-          <w:noProof/>
-        </w:rPr>
-        <w:t xml:space="preserve"> </w:t>
-      </w:r>
-      <w:r>
-        <w:rPr>
-          <w:noProof/>
-        </w:rPr>
-        <w:t xml:space="preserve">  </w:t>
-      </w:r>
-      <w:r>
-        <w:rPr>
-          <w:noProof/>
-        </w:rPr>
+        </w:rPr>
+      </w:pPr>
+      <w:r>
+        <w:t xml:space="preserve">   </w:t>
+      </w:r>
+      <w:r>
         <w:drawing>
-          <wp:inline distT="0" distB="0" distL="0" distR="0" wp14:anchorId="0F78089C" wp14:editId="13BA32BE">
+          <wp:inline distT="0" distB="0" distL="0" distR="0">
             <wp:extent cx="5274310" cy="3542030"/>
             <wp:effectExtent l="0" t="0" r="2540" b="1270"/>
             <wp:docPr id="1566500277" name="图片 1"/>
@@ -2477,8 +2579,10 @@
               <a:graphicData uri="http://schemas.openxmlformats.org/drawingml/2006/picture">
                 <pic:pic xmlns:pic="http://schemas.openxmlformats.org/drawingml/2006/picture">
                   <pic:nvPicPr>
-                    <pic:cNvPr id="1566500277" name=""/>
-                    <pic:cNvPicPr/>
+                    <pic:cNvPr id="1566500277" name="图片 1"/>
+                    <pic:cNvPicPr>
+                      <a:picLocks noChangeAspect="1"/>
+                    </pic:cNvPicPr>
                   </pic:nvPicPr>
                   <pic:blipFill>
                     <a:blip r:embed="rId40"/>
@@ -2510,11 +2614,8 @@
         </w:rPr>
       </w:pPr>
       <w:r>
-        <w:rPr>
-          <w:noProof/>
-        </w:rPr>
         <w:drawing>
-          <wp:inline distT="0" distB="0" distL="0" distR="0" wp14:anchorId="5EA52174" wp14:editId="73DCDA7D">
+          <wp:inline distT="0" distB="0" distL="0" distR="0">
             <wp:extent cx="5274310" cy="1936750"/>
             <wp:effectExtent l="0" t="0" r="2540" b="6350"/>
             <wp:docPr id="577301138" name="图片 1"/>
@@ -2525,8 +2626,10 @@
               <a:graphicData uri="http://schemas.openxmlformats.org/drawingml/2006/picture">
                 <pic:pic xmlns:pic="http://schemas.openxmlformats.org/drawingml/2006/picture">
                   <pic:nvPicPr>
-                    <pic:cNvPr id="577301138" name=""/>
-                    <pic:cNvPicPr/>
+                    <pic:cNvPr id="577301138" name="图片 1"/>
+                    <pic:cNvPicPr>
+                      <a:picLocks noChangeAspect="1"/>
+                    </pic:cNvPicPr>
                   </pic:nvPicPr>
                   <pic:blipFill>
                     <a:blip r:embed="rId41"/>
@@ -2550,17 +2653,11 @@
         </w:drawing>
       </w:r>
       <w:r>
-        <w:rPr>
-          <w:noProof/>
-        </w:rPr>
         <w:t xml:space="preserve"> </w:t>
       </w:r>
       <w:r>
-        <w:rPr>
-          <w:noProof/>
-        </w:rPr>
         <w:drawing>
-          <wp:inline distT="0" distB="0" distL="0" distR="0" wp14:anchorId="70959CD6" wp14:editId="7881F292">
+          <wp:inline distT="0" distB="0" distL="0" distR="0">
             <wp:extent cx="5274310" cy="2494915"/>
             <wp:effectExtent l="0" t="0" r="2540" b="635"/>
             <wp:docPr id="124725008" name="图片 1"/>
@@ -2571,8 +2668,10 @@
               <a:graphicData uri="http://schemas.openxmlformats.org/drawingml/2006/picture">
                 <pic:pic xmlns:pic="http://schemas.openxmlformats.org/drawingml/2006/picture">
                   <pic:nvPicPr>
-                    <pic:cNvPr id="124725008" name=""/>
-                    <pic:cNvPicPr/>
+                    <pic:cNvPr id="124725008" name="图片 1"/>
+                    <pic:cNvPicPr>
+                      <a:picLocks noChangeAspect="1"/>
+                    </pic:cNvPicPr>
                   </pic:nvPicPr>
                   <pic:blipFill>
                     <a:blip r:embed="rId42"/>
@@ -2599,78 +2698,20 @@
     <w:sectPr>
       <w:pgSz w:w="11906" w:h="16838"/>
       <w:pgMar w:top="1440" w:right="1800" w:bottom="1440" w:left="1800" w:header="851" w:footer="992" w:gutter="0"/>
-      <w:cols w:space="425"/>
-      <w:docGrid w:type="lines" w:linePitch="312"/>
+      <w:cols w:space="425" w:num="1"/>
+      <w:docGrid w:type="lines" w:linePitch="312" w:charSpace="0"/>
     </w:sectPr>
   </w:body>
 </w:document>
 </file>
 
-<file path=word/endnotes.xml><?xml version="1.0" encoding="utf-8"?>
-<w:endnotes xmlns:wpc="http://schemas.microsoft.com/office/word/2010/wordprocessingCanvas" xmlns:cx="http://schemas.microsoft.com/office/drawing/2014/chartex" xmlns:cx1="http://schemas.microsoft.com/office/drawing/2015/9/8/chartex" xmlns:cx2="http://schemas.microsoft.com/office/drawing/2015/10/21/chartex" xmlns:cx3="http://schemas.microsoft.com/office/drawing/2016/5/9/chartex" xmlns:cx4="http://schemas.microsoft.com/office/drawing/2016/5/10/chartex" xmlns:cx5="http://schemas.microsoft.com/office/drawing/2016/5/11/chartex" xmlns:cx6="http://schemas.microsoft.com/office/drawing/2016/5/12/chartex" xmlns:cx7="http://schemas.microsoft.com/office/drawing/2016/5/13/chartex" xmlns:cx8="http://schemas.microsoft.com/office/drawing/2016/5/14/chartex" xmlns:mc="http://schemas.openxmlformats.org/markup-compatibility/2006" xmlns:aink="http://schemas.microsoft.com/office/drawing/2016/ink" xmlns:am3d="http://schemas.microsoft.com/office/drawing/2017/model3d" xmlns:o="urn:schemas-microsoft-com:office:office" xmlns:oel="http://schemas.microsoft.com/office/2019/extlst" xmlns:r="http://schemas.openxmlformats.org/officeDocument/2006/relationships" xmlns:m="http://schemas.openxmlformats.org/officeDocument/2006/math" xmlns:v="urn:schemas-microsoft-com:vml" xmlns:wp14="http://schemas.microsoft.com/office/word/2010/wordprocessingDrawing" xmlns:wp="http://schemas.openxmlformats.org/drawingml/2006/wordprocessingDrawing" xmlns:w10="urn:schemas-microsoft-com:office:word" xmlns:w="http://schemas.openxmlformats.org/wordprocessingml/2006/main" xmlns:w14="http://schemas.microsoft.com/office/word/2010/wordml" xmlns:w15="http://schemas.microsoft.com/office/word/2012/wordml" xmlns:w16cex="http://schemas.microsoft.com/office/word/2018/wordml/cex" xmlns:w16cid="http://schemas.microsoft.com/office/word/2016/wordml/cid" xmlns:w16="http://schemas.microsoft.com/office/word/2018/wordml" xmlns:w16du="http://schemas.microsoft.com/office/word/2023/wordml/word16du" xmlns:w16sdtdh="http://schemas.microsoft.com/office/word/2020/wordml/sdtdatahash" xmlns:w16sdtfl="http://schemas.microsoft.com/office/word/2024/wordml/sdtformatlock" xmlns:w16se="http://schemas.microsoft.com/office/word/2015/wordml/symex" xmlns:wpg="http://schemas.microsoft.com/office/word/2010/wordprocessingGroup" xmlns:wpi="http://schemas.microsoft.com/office/word/2010/wordprocessingInk" xmlns:wne="http://schemas.microsoft.com/office/word/2006/wordml" xmlns:wps="http://schemas.microsoft.com/office/word/2010/wordprocessingShape" mc:Ignorable="w14 w15 w16se w16cid w16 w16cex w16sdtdh w16sdtfl w16du wp14">
-  <w:endnote w:type="separator" w:id="-1">
-    <w:p>
-      <w:pPr>
-        <w:rPr>
-          <w:rFonts w:hint="eastAsia"/>
-        </w:rPr>
-      </w:pPr>
-      <w:r>
-        <w:separator/>
-      </w:r>
-    </w:p>
-  </w:endnote>
-  <w:endnote w:type="continuationSeparator" w:id="0">
-    <w:p>
-      <w:pPr>
-        <w:rPr>
-          <w:rFonts w:hint="eastAsia"/>
-        </w:rPr>
-      </w:pPr>
-      <w:r>
-        <w:continuationSeparator/>
-      </w:r>
-    </w:p>
-  </w:endnote>
-</w:endnotes>
-</file>
-
-<file path=word/footnotes.xml><?xml version="1.0" encoding="utf-8"?>
-<w:footnotes xmlns:wpc="http://schemas.microsoft.com/office/word/2010/wordprocessingCanvas" xmlns:cx="http://schemas.microsoft.com/office/drawing/2014/chartex" xmlns:cx1="http://schemas.microsoft.com/office/drawing/2015/9/8/chartex" xmlns:cx2="http://schemas.microsoft.com/office/drawing/2015/10/21/chartex" xmlns:cx3="http://schemas.microsoft.com/office/drawing/2016/5/9/chartex" xmlns:cx4="http://schemas.microsoft.com/office/drawing/2016/5/10/chartex" xmlns:cx5="http://schemas.microsoft.com/office/drawing/2016/5/11/chartex" xmlns:cx6="http://schemas.microsoft.com/office/drawing/2016/5/12/chartex" xmlns:cx7="http://schemas.microsoft.com/office/drawing/2016/5/13/chartex" xmlns:cx8="http://schemas.microsoft.com/office/drawing/2016/5/14/chartex" xmlns:mc="http://schemas.openxmlformats.org/markup-compatibility/2006" xmlns:aink="http://schemas.microsoft.com/office/drawing/2016/ink" xmlns:am3d="http://schemas.microsoft.com/office/drawing/2017/model3d" xmlns:o="urn:schemas-microsoft-com:office:office" xmlns:oel="http://schemas.microsoft.com/office/2019/extlst" xmlns:r="http://schemas.openxmlformats.org/officeDocument/2006/relationships" xmlns:m="http://schemas.openxmlformats.org/officeDocument/2006/math" xmlns:v="urn:schemas-microsoft-com:vml" xmlns:wp14="http://schemas.microsoft.com/office/word/2010/wordprocessingDrawing" xmlns:wp="http://schemas.openxmlformats.org/drawingml/2006/wordprocessingDrawing" xmlns:w10="urn:schemas-microsoft-com:office:word" xmlns:w="http://schemas.openxmlformats.org/wordprocessingml/2006/main" xmlns:w14="http://schemas.microsoft.com/office/word/2010/wordml" xmlns:w15="http://schemas.microsoft.com/office/word/2012/wordml" xmlns:w16cex="http://schemas.microsoft.com/office/word/2018/wordml/cex" xmlns:w16cid="http://schemas.microsoft.com/office/word/2016/wordml/cid" xmlns:w16="http://schemas.microsoft.com/office/word/2018/wordml" xmlns:w16du="http://schemas.microsoft.com/office/word/2023/wordml/word16du" xmlns:w16sdtdh="http://schemas.microsoft.com/office/word/2020/wordml/sdtdatahash" xmlns:w16sdtfl="http://schemas.microsoft.com/office/word/2024/wordml/sdtformatlock" xmlns:w16se="http://schemas.microsoft.com/office/word/2015/wordml/symex" xmlns:wpg="http://schemas.microsoft.com/office/word/2010/wordprocessingGroup" xmlns:wpi="http://schemas.microsoft.com/office/word/2010/wordprocessingInk" xmlns:wne="http://schemas.microsoft.com/office/word/2006/wordml" xmlns:wps="http://schemas.microsoft.com/office/word/2010/wordprocessingShape" mc:Ignorable="w14 w15 w16se w16cid w16 w16cex w16sdtdh w16sdtfl w16du wp14">
-  <w:footnote w:type="separator" w:id="-1">
-    <w:p>
-      <w:pPr>
-        <w:rPr>
-          <w:rFonts w:hint="eastAsia"/>
-        </w:rPr>
-      </w:pPr>
-      <w:r>
-        <w:separator/>
-      </w:r>
-    </w:p>
-  </w:footnote>
-  <w:footnote w:type="continuationSeparator" w:id="0">
-    <w:p>
-      <w:pPr>
-        <w:rPr>
-          <w:rFonts w:hint="eastAsia"/>
-        </w:rPr>
-      </w:pPr>
-      <w:r>
-        <w:continuationSeparator/>
-      </w:r>
-    </w:p>
-  </w:footnote>
-</w:footnotes>
-</file>
-
 <file path=word/numbering.xml><?xml version="1.0" encoding="utf-8"?>
-<w:numbering xmlns:wpc="http://schemas.microsoft.com/office/word/2010/wordprocessingCanvas" xmlns:cx="http://schemas.microsoft.com/office/drawing/2014/chartex" xmlns:cx1="http://schemas.microsoft.com/office/drawing/2015/9/8/chartex" xmlns:cx2="http://schemas.microsoft.com/office/drawing/2015/10/21/chartex" xmlns:cx3="http://schemas.microsoft.com/office/drawing/2016/5/9/chartex" xmlns:cx4="http://schemas.microsoft.com/office/drawing/2016/5/10/chartex" xmlns:cx5="http://schemas.microsoft.com/office/drawing/2016/5/11/chartex" xmlns:cx6="http://schemas.microsoft.com/office/drawing/2016/5/12/chartex" xmlns:cx7="http://schemas.microsoft.com/office/drawing/2016/5/13/chartex" xmlns:cx8="http://schemas.microsoft.com/office/drawing/2016/5/14/chartex" xmlns:mc="http://schemas.openxmlformats.org/markup-compatibility/2006" xmlns:aink="http://schemas.microsoft.com/office/drawing/2016/ink" xmlns:am3d="http://schemas.microsoft.com/office/drawing/2017/model3d" xmlns:o="urn:schemas-microsoft-com:office:office" xmlns:oel="http://schemas.microsoft.com/office/2019/extlst" xmlns:r="http://schemas.openxmlformats.org/officeDocument/2006/relationships" xmlns:m="http://schemas.openxmlformats.org/officeDocument/2006/math" xmlns:v="urn:schemas-microsoft-com:vml" xmlns:wp14="http://schemas.microsoft.com/office/word/2010/wordprocessingDrawing" xmlns:wp="http://schemas.openxmlformats.org/drawingml/2006/wordprocessingDrawing" xmlns:w10="urn:schemas-microsoft-com:office:word" xmlns:w="http://schemas.openxmlformats.org/wordprocessingml/2006/main" xmlns:w14="http://schemas.microsoft.com/office/word/2010/wordml" xmlns:w15="http://schemas.microsoft.com/office/word/2012/wordml" xmlns:w16cex="http://schemas.microsoft.com/office/word/2018/wordml/cex" xmlns:w16cid="http://schemas.microsoft.com/office/word/2016/wordml/cid" xmlns:w16="http://schemas.microsoft.com/office/word/2018/wordml" xmlns:w16du="http://schemas.microsoft.com/office/word/2023/wordml/word16du" xmlns:w16sdtdh="http://schemas.microsoft.com/office/word/2020/wordml/sdtdatahash" xmlns:w16sdtfl="http://schemas.microsoft.com/office/word/2024/wordml/sdtformatlock" xmlns:w16se="http://schemas.microsoft.com/office/word/2015/wordml/symex" xmlns:wpg="http://schemas.microsoft.com/office/word/2010/wordprocessingGroup" xmlns:wpi="http://schemas.microsoft.com/office/word/2010/wordprocessingInk" xmlns:wne="http://schemas.microsoft.com/office/word/2006/wordml" xmlns:wps="http://schemas.microsoft.com/office/word/2010/wordprocessingShape" mc:Ignorable="w14 w15 w16se w16cid w16 w16cex w16sdtdh w16sdtfl w16du wp14">
-  <w:abstractNum w:abstractNumId="0" w15:restartNumberingAfterBreak="0">
+<w:numbering xmlns:wpc="http://schemas.microsoft.com/office/word/2010/wordprocessingCanvas" xmlns:mc="http://schemas.openxmlformats.org/markup-compatibility/2006" xmlns:o="urn:schemas-microsoft-com:office:office" xmlns:r="http://schemas.openxmlformats.org/officeDocument/2006/relationships" xmlns:m="http://schemas.openxmlformats.org/officeDocument/2006/math" xmlns:v="urn:schemas-microsoft-com:vml" xmlns:wp14="http://schemas.microsoft.com/office/word/2010/wordprocessingDrawing" xmlns:wp="http://schemas.openxmlformats.org/drawingml/2006/wordprocessingDrawing" xmlns:w10="urn:schemas-microsoft-com:office:word" xmlns:w="http://schemas.openxmlformats.org/wordprocessingml/2006/main" xmlns:w14="http://schemas.microsoft.com/office/word/2010/wordml" xmlns:wpg="http://schemas.microsoft.com/office/word/2010/wordprocessingGroup" xmlns:wpi="http://schemas.microsoft.com/office/word/2010/wordprocessingInk" xmlns:wne="http://schemas.microsoft.com/office/word/2006/wordml" xmlns:wps="http://schemas.microsoft.com/office/word/2010/wordprocessingShape" xmlns:wpsCustomData="http://www.wps.cn/officeDocument/2013/wpsCustomData" mc:Ignorable="w14 wp14">
+  <w:abstractNum w:abstractNumId="0">
     <w:nsid w:val="37184EC5"/>
-    <w:multiLevelType w:val="hybridMultilevel"/>
-    <w:tmpl w:val="B9DCB7E0"/>
-    <w:lvl w:ilvl="0" w:tplc="D868864C">
+    <w:multiLevelType w:val="multilevel"/>
+    <w:tmpl w:val="37184EC5"/>
+    <w:lvl w:ilvl="0" w:tentative="0">
       <w:start w:val="1"/>
       <w:numFmt w:val="none"/>
       <w:lvlText w:val="一."/>
@@ -2682,7 +2723,7 @@
         <w:rFonts w:hint="default"/>
       </w:rPr>
     </w:lvl>
-    <w:lvl w:ilvl="1" w:tplc="04090019" w:tentative="1">
+    <w:lvl w:ilvl="1" w:tentative="0">
       <w:start w:val="1"/>
       <w:numFmt w:val="lowerLetter"/>
       <w:lvlText w:val="%2)"/>
@@ -2691,7 +2732,7 @@
         <w:ind w:left="1090" w:hanging="440"/>
       </w:pPr>
     </w:lvl>
-    <w:lvl w:ilvl="2" w:tplc="0409001B" w:tentative="1">
+    <w:lvl w:ilvl="2" w:tentative="0">
       <w:start w:val="1"/>
       <w:numFmt w:val="lowerRoman"/>
       <w:lvlText w:val="%3."/>
@@ -2700,7 +2741,7 @@
         <w:ind w:left="1530" w:hanging="440"/>
       </w:pPr>
     </w:lvl>
-    <w:lvl w:ilvl="3" w:tplc="0409000F" w:tentative="1">
+    <w:lvl w:ilvl="3" w:tentative="0">
       <w:start w:val="1"/>
       <w:numFmt w:val="decimal"/>
       <w:lvlText w:val="%4."/>
@@ -2709,7 +2750,7 @@
         <w:ind w:left="1970" w:hanging="440"/>
       </w:pPr>
     </w:lvl>
-    <w:lvl w:ilvl="4" w:tplc="04090019" w:tentative="1">
+    <w:lvl w:ilvl="4" w:tentative="0">
       <w:start w:val="1"/>
       <w:numFmt w:val="lowerLetter"/>
       <w:lvlText w:val="%5)"/>
@@ -2718,7 +2759,7 @@
         <w:ind w:left="2410" w:hanging="440"/>
       </w:pPr>
     </w:lvl>
-    <w:lvl w:ilvl="5" w:tplc="0409001B" w:tentative="1">
+    <w:lvl w:ilvl="5" w:tentative="0">
       <w:start w:val="1"/>
       <w:numFmt w:val="lowerRoman"/>
       <w:lvlText w:val="%6."/>
@@ -2727,7 +2768,7 @@
         <w:ind w:left="2850" w:hanging="440"/>
       </w:pPr>
     </w:lvl>
-    <w:lvl w:ilvl="6" w:tplc="0409000F" w:tentative="1">
+    <w:lvl w:ilvl="6" w:tentative="0">
       <w:start w:val="1"/>
       <w:numFmt w:val="decimal"/>
       <w:lvlText w:val="%7."/>
@@ -2736,7 +2777,7 @@
         <w:ind w:left="3290" w:hanging="440"/>
       </w:pPr>
     </w:lvl>
-    <w:lvl w:ilvl="7" w:tplc="04090019" w:tentative="1">
+    <w:lvl w:ilvl="7" w:tentative="0">
       <w:start w:val="1"/>
       <w:numFmt w:val="lowerLetter"/>
       <w:lvlText w:val="%8)"/>
@@ -2745,7 +2786,7 @@
         <w:ind w:left="3730" w:hanging="440"/>
       </w:pPr>
     </w:lvl>
-    <w:lvl w:ilvl="8" w:tplc="0409001B" w:tentative="1">
+    <w:lvl w:ilvl="8" w:tentative="0">
       <w:start w:val="1"/>
       <w:numFmt w:val="lowerRoman"/>
       <w:lvlText w:val="%9."/>
@@ -2755,622 +2796,502 @@
       </w:pPr>
     </w:lvl>
   </w:abstractNum>
-  <w:abstractNum w:abstractNumId="1" w15:restartNumberingAfterBreak="0">
+  <w:abstractNum w:abstractNumId="1">
     <w:nsid w:val="7E5C639F"/>
     <w:multiLevelType w:val="multilevel"/>
-    <w:tmpl w:val="14A4403E"/>
-    <w:lvl w:ilvl="0">
+    <w:tmpl w:val="7E5C639F"/>
+    <w:lvl w:ilvl="0" w:tentative="0">
       <w:start w:val="1"/>
       <w:numFmt w:val="bullet"/>
       <w:lvlText w:val=""/>
       <w:lvlJc w:val="left"/>
       <w:pPr>
         <w:tabs>
-          <w:tab w:val="num" w:pos="720"/>
+          <w:tab w:val="left" w:pos="720"/>
         </w:tabs>
         <w:ind w:left="720" w:hanging="360"/>
       </w:pPr>
       <w:rPr>
-        <w:rFonts w:ascii="Symbol" w:hAnsi="Symbol" w:hint="default"/>
+        <w:rFonts w:hint="default" w:ascii="Symbol" w:hAnsi="Symbol"/>
         <w:sz w:val="20"/>
       </w:rPr>
     </w:lvl>
-    <w:lvl w:ilvl="1" w:tentative="1">
+    <w:lvl w:ilvl="1" w:tentative="0">
       <w:start w:val="1"/>
       <w:numFmt w:val="bullet"/>
       <w:lvlText w:val="o"/>
       <w:lvlJc w:val="left"/>
       <w:pPr>
         <w:tabs>
-          <w:tab w:val="num" w:pos="1440"/>
+          <w:tab w:val="left" w:pos="1440"/>
         </w:tabs>
         <w:ind w:left="1440" w:hanging="360"/>
       </w:pPr>
       <w:rPr>
-        <w:rFonts w:ascii="Courier New" w:hAnsi="Courier New" w:hint="default"/>
+        <w:rFonts w:hint="default" w:ascii="Courier New" w:hAnsi="Courier New"/>
         <w:sz w:val="20"/>
       </w:rPr>
     </w:lvl>
-    <w:lvl w:ilvl="2" w:tentative="1">
+    <w:lvl w:ilvl="2" w:tentative="0">
       <w:start w:val="1"/>
       <w:numFmt w:val="bullet"/>
       <w:lvlText w:val=""/>
       <w:lvlJc w:val="left"/>
       <w:pPr>
         <w:tabs>
-          <w:tab w:val="num" w:pos="2160"/>
+          <w:tab w:val="left" w:pos="2160"/>
         </w:tabs>
         <w:ind w:left="2160" w:hanging="360"/>
       </w:pPr>
       <w:rPr>
-        <w:rFonts w:ascii="Wingdings" w:hAnsi="Wingdings" w:hint="default"/>
+        <w:rFonts w:hint="default" w:ascii="Wingdings" w:hAnsi="Wingdings"/>
         <w:sz w:val="20"/>
       </w:rPr>
     </w:lvl>
-    <w:lvl w:ilvl="3" w:tentative="1">
+    <w:lvl w:ilvl="3" w:tentative="0">
       <w:start w:val="1"/>
       <w:numFmt w:val="bullet"/>
       <w:lvlText w:val=""/>
       <w:lvlJc w:val="left"/>
       <w:pPr>
         <w:tabs>
-          <w:tab w:val="num" w:pos="2880"/>
+          <w:tab w:val="left" w:pos="2880"/>
         </w:tabs>
         <w:ind w:left="2880" w:hanging="360"/>
       </w:pPr>
       <w:rPr>
-        <w:rFonts w:ascii="Wingdings" w:hAnsi="Wingdings" w:hint="default"/>
+        <w:rFonts w:hint="default" w:ascii="Wingdings" w:hAnsi="Wingdings"/>
         <w:sz w:val="20"/>
       </w:rPr>
     </w:lvl>
-    <w:lvl w:ilvl="4" w:tentative="1">
+    <w:lvl w:ilvl="4" w:tentative="0">
       <w:start w:val="1"/>
       <w:numFmt w:val="bullet"/>
       <w:lvlText w:val=""/>
       <w:lvlJc w:val="left"/>
       <w:pPr>
         <w:tabs>
-          <w:tab w:val="num" w:pos="3600"/>
+          <w:tab w:val="left" w:pos="3600"/>
         </w:tabs>
         <w:ind w:left="3600" w:hanging="360"/>
       </w:pPr>
       <w:rPr>
-        <w:rFonts w:ascii="Wingdings" w:hAnsi="Wingdings" w:hint="default"/>
+        <w:rFonts w:hint="default" w:ascii="Wingdings" w:hAnsi="Wingdings"/>
         <w:sz w:val="20"/>
       </w:rPr>
     </w:lvl>
-    <w:lvl w:ilvl="5" w:tentative="1">
+    <w:lvl w:ilvl="5" w:tentative="0">
       <w:start w:val="1"/>
       <w:numFmt w:val="bullet"/>
       <w:lvlText w:val=""/>
       <w:lvlJc w:val="left"/>
       <w:pPr>
         <w:tabs>
-          <w:tab w:val="num" w:pos="4320"/>
+          <w:tab w:val="left" w:pos="4320"/>
         </w:tabs>
         <w:ind w:left="4320" w:hanging="360"/>
       </w:pPr>
       <w:rPr>
-        <w:rFonts w:ascii="Wingdings" w:hAnsi="Wingdings" w:hint="default"/>
+        <w:rFonts w:hint="default" w:ascii="Wingdings" w:hAnsi="Wingdings"/>
         <w:sz w:val="20"/>
       </w:rPr>
     </w:lvl>
-    <w:lvl w:ilvl="6" w:tentative="1">
+    <w:lvl w:ilvl="6" w:tentative="0">
       <w:start w:val="1"/>
       <w:numFmt w:val="bullet"/>
       <w:lvlText w:val=""/>
       <w:lvlJc w:val="left"/>
       <w:pPr>
         <w:tabs>
-          <w:tab w:val="num" w:pos="5040"/>
+          <w:tab w:val="left" w:pos="5040"/>
         </w:tabs>
         <w:ind w:left="5040" w:hanging="360"/>
       </w:pPr>
       <w:rPr>
-        <w:rFonts w:ascii="Wingdings" w:hAnsi="Wingdings" w:hint="default"/>
+        <w:rFonts w:hint="default" w:ascii="Wingdings" w:hAnsi="Wingdings"/>
         <w:sz w:val="20"/>
       </w:rPr>
     </w:lvl>
-    <w:lvl w:ilvl="7" w:tentative="1">
+    <w:lvl w:ilvl="7" w:tentative="0">
       <w:start w:val="1"/>
       <w:numFmt w:val="bullet"/>
       <w:lvlText w:val=""/>
       <w:lvlJc w:val="left"/>
       <w:pPr>
         <w:tabs>
-          <w:tab w:val="num" w:pos="5760"/>
+          <w:tab w:val="left" w:pos="5760"/>
         </w:tabs>
         <w:ind w:left="5760" w:hanging="360"/>
       </w:pPr>
       <w:rPr>
-        <w:rFonts w:ascii="Wingdings" w:hAnsi="Wingdings" w:hint="default"/>
+        <w:rFonts w:hint="default" w:ascii="Wingdings" w:hAnsi="Wingdings"/>
         <w:sz w:val="20"/>
       </w:rPr>
     </w:lvl>
-    <w:lvl w:ilvl="8" w:tentative="1">
+    <w:lvl w:ilvl="8" w:tentative="0">
       <w:start w:val="1"/>
       <w:numFmt w:val="bullet"/>
       <w:lvlText w:val=""/>
       <w:lvlJc w:val="left"/>
       <w:pPr>
         <w:tabs>
-          <w:tab w:val="num" w:pos="6480"/>
+          <w:tab w:val="left" w:pos="6480"/>
         </w:tabs>
         <w:ind w:left="6480" w:hanging="360"/>
       </w:pPr>
       <w:rPr>
-        <w:rFonts w:ascii="Wingdings" w:hAnsi="Wingdings" w:hint="default"/>
+        <w:rFonts w:hint="default" w:ascii="Wingdings" w:hAnsi="Wingdings"/>
         <w:sz w:val="20"/>
       </w:rPr>
     </w:lvl>
   </w:abstractNum>
-  <w:num w:numId="1" w16cid:durableId="2145541229">
+  <w:num w:numId="1">
     <w:abstractNumId w:val="1"/>
   </w:num>
-  <w:num w:numId="2" w16cid:durableId="2077238056">
+  <w:num w:numId="2">
     <w:abstractNumId w:val="0"/>
   </w:num>
 </w:numbering>
 </file>
 
 <file path=word/styles.xml><?xml version="1.0" encoding="utf-8"?>
-<w:styles xmlns:mc="http://schemas.openxmlformats.org/markup-compatibility/2006" xmlns:r="http://schemas.openxmlformats.org/officeDocument/2006/relationships" xmlns:w="http://schemas.openxmlformats.org/wordprocessingml/2006/main" xmlns:w14="http://schemas.microsoft.com/office/word/2010/wordml" xmlns:w15="http://schemas.microsoft.com/office/word/2012/wordml" xmlns:w16cex="http://schemas.microsoft.com/office/word/2018/wordml/cex" xmlns:w16cid="http://schemas.microsoft.com/office/word/2016/wordml/cid" xmlns:w16="http://schemas.microsoft.com/office/word/2018/wordml" xmlns:w16du="http://schemas.microsoft.com/office/word/2023/wordml/word16du" xmlns:w16sdtdh="http://schemas.microsoft.com/office/word/2020/wordml/sdtdatahash" xmlns:w16sdtfl="http://schemas.microsoft.com/office/word/2024/wordml/sdtformatlock" xmlns:w16se="http://schemas.microsoft.com/office/word/2015/wordml/symex" mc:Ignorable="w14 w15 w16se w16cid w16 w16cex w16sdtdh w16sdtfl w16du">
+<w:styles xmlns:mc="http://schemas.openxmlformats.org/markup-compatibility/2006" xmlns:o="urn:schemas-microsoft-com:office:office" xmlns:r="http://schemas.openxmlformats.org/officeDocument/2006/relationships" xmlns:m="http://schemas.openxmlformats.org/officeDocument/2006/math" xmlns:v="urn:schemas-microsoft-com:vml" xmlns:w="http://schemas.openxmlformats.org/wordprocessingml/2006/main" xmlns:w14="http://schemas.microsoft.com/office/word/2010/wordml" xmlns:w10="urn:schemas-microsoft-com:office:word" xmlns:sl="http://schemas.openxmlformats.org/schemaLibrary/2006/main" xmlns:wpsCustomData="http://www.wps.cn/officeDocument/2013/wpsCustomData" mc:Ignorable="w14">
   <w:docDefaults>
     <w:rPrDefault>
       <w:rPr>
-        <w:rFonts w:asciiTheme="minorHAnsi" w:eastAsiaTheme="minorEastAsia" w:hAnsiTheme="minorHAnsi" w:cstheme="minorBidi"/>
-        <w:kern w:val="2"/>
-        <w:sz w:val="21"/>
-        <w:szCs w:val="22"/>
-        <w:lang w:val="en-US" w:eastAsia="zh-CN" w:bidi="ar-SA"/>
+        <w:rFonts w:asciiTheme="minorHAnsi" w:hAnsiTheme="minorHAnsi" w:eastAsiaTheme="minorEastAsia" w:cstheme="minorBidi"/>
       </w:rPr>
     </w:rPrDefault>
     <w:pPrDefault/>
   </w:docDefaults>
-  <w:latentStyles w:defLockedState="0" w:defUIPriority="99" w:defSemiHidden="0" w:defUnhideWhenUsed="0" w:defQFormat="0" w:count="376">
-    <w:lsdException w:name="Normal" w:uiPriority="0" w:qFormat="1"/>
-    <w:lsdException w:name="heading 1" w:uiPriority="9" w:qFormat="1"/>
-    <w:lsdException w:name="heading 2" w:semiHidden="1" w:uiPriority="9" w:unhideWhenUsed="1" w:qFormat="1"/>
-    <w:lsdException w:name="heading 3" w:semiHidden="1" w:uiPriority="9" w:unhideWhenUsed="1" w:qFormat="1"/>
-    <w:lsdException w:name="heading 4" w:semiHidden="1" w:uiPriority="9" w:unhideWhenUsed="1" w:qFormat="1"/>
-    <w:lsdException w:name="heading 5" w:semiHidden="1" w:uiPriority="9" w:unhideWhenUsed="1" w:qFormat="1"/>
-    <w:lsdException w:name="heading 6" w:semiHidden="1" w:uiPriority="9" w:unhideWhenUsed="1" w:qFormat="1"/>
-    <w:lsdException w:name="heading 7" w:semiHidden="1" w:uiPriority="9" w:unhideWhenUsed="1" w:qFormat="1"/>
-    <w:lsdException w:name="heading 8" w:semiHidden="1" w:uiPriority="9" w:unhideWhenUsed="1" w:qFormat="1"/>
-    <w:lsdException w:name="heading 9" w:semiHidden="1" w:uiPriority="9" w:unhideWhenUsed="1" w:qFormat="1"/>
-    <w:lsdException w:name="index 1" w:semiHidden="1" w:unhideWhenUsed="1"/>
-    <w:lsdException w:name="index 2" w:semiHidden="1" w:unhideWhenUsed="1"/>
-    <w:lsdException w:name="index 3" w:semiHidden="1" w:unhideWhenUsed="1"/>
-    <w:lsdException w:name="index 4" w:semiHidden="1" w:unhideWhenUsed="1"/>
-    <w:lsdException w:name="index 5" w:semiHidden="1" w:unhideWhenUsed="1"/>
-    <w:lsdException w:name="index 6" w:semiHidden="1" w:unhideWhenUsed="1"/>
-    <w:lsdException w:name="index 7" w:semiHidden="1" w:unhideWhenUsed="1"/>
-    <w:lsdException w:name="index 8" w:semiHidden="1" w:unhideWhenUsed="1"/>
-    <w:lsdException w:name="index 9" w:semiHidden="1" w:unhideWhenUsed="1"/>
-    <w:lsdException w:name="toc 1" w:semiHidden="1" w:uiPriority="39" w:unhideWhenUsed="1"/>
-    <w:lsdException w:name="toc 2" w:semiHidden="1" w:uiPriority="39" w:unhideWhenUsed="1"/>
-    <w:lsdException w:name="toc 3" w:semiHidden="1" w:uiPriority="39" w:unhideWhenUsed="1"/>
-    <w:lsdException w:name="toc 4" w:semiHidden="1" w:uiPriority="39" w:unhideWhenUsed="1"/>
-    <w:lsdException w:name="toc 5" w:semiHidden="1" w:uiPriority="39" w:unhideWhenUsed="1"/>
-    <w:lsdException w:name="toc 6" w:semiHidden="1" w:uiPriority="39" w:unhideWhenUsed="1"/>
-    <w:lsdException w:name="toc 7" w:semiHidden="1" w:uiPriority="39" w:unhideWhenUsed="1"/>
-    <w:lsdException w:name="toc 8" w:semiHidden="1" w:uiPriority="39" w:unhideWhenUsed="1"/>
-    <w:lsdException w:name="toc 9" w:semiHidden="1" w:uiPriority="39" w:unhideWhenUsed="1"/>
-    <w:lsdException w:name="Normal Indent" w:semiHidden="1" w:unhideWhenUsed="1"/>
-    <w:lsdException w:name="footnote text" w:semiHidden="1" w:unhideWhenUsed="1"/>
-    <w:lsdException w:name="annotation text" w:semiHidden="1" w:unhideWhenUsed="1"/>
-    <w:lsdException w:name="header" w:semiHidden="1" w:unhideWhenUsed="1"/>
-    <w:lsdException w:name="footer" w:semiHidden="1" w:unhideWhenUsed="1"/>
-    <w:lsdException w:name="index heading" w:semiHidden="1" w:unhideWhenUsed="1"/>
-    <w:lsdException w:name="caption" w:semiHidden="1" w:uiPriority="35" w:unhideWhenUsed="1" w:qFormat="1"/>
-    <w:lsdException w:name="table of figures" w:semiHidden="1" w:unhideWhenUsed="1"/>
-    <w:lsdException w:name="envelope address" w:semiHidden="1" w:unhideWhenUsed="1"/>
-    <w:lsdException w:name="envelope return" w:semiHidden="1" w:unhideWhenUsed="1"/>
-    <w:lsdException w:name="footnote reference" w:semiHidden="1" w:unhideWhenUsed="1"/>
-    <w:lsdException w:name="annotation reference" w:semiHidden="1" w:unhideWhenUsed="1"/>
-    <w:lsdException w:name="line number" w:semiHidden="1" w:unhideWhenUsed="1"/>
-    <w:lsdException w:name="page number" w:semiHidden="1" w:unhideWhenUsed="1"/>
-    <w:lsdException w:name="endnote reference" w:semiHidden="1" w:unhideWhenUsed="1"/>
-    <w:lsdException w:name="endnote text" w:semiHidden="1" w:unhideWhenUsed="1"/>
-    <w:lsdException w:name="table of authorities" w:semiHidden="1" w:unhideWhenUsed="1"/>
-    <w:lsdException w:name="macro" w:semiHidden="1" w:unhideWhenUsed="1"/>
-    <w:lsdException w:name="toa heading" w:semiHidden="1" w:unhideWhenUsed="1"/>
-    <w:lsdException w:name="List" w:semiHidden="1" w:unhideWhenUsed="1"/>
-    <w:lsdException w:name="List Bullet" w:semiHidden="1" w:unhideWhenUsed="1"/>
-    <w:lsdException w:name="List Number" w:semiHidden="1" w:unhideWhenUsed="1"/>
-    <w:lsdException w:name="List 2" w:semiHidden="1" w:unhideWhenUsed="1"/>
-    <w:lsdException w:name="List 3" w:semiHidden="1" w:unhideWhenUsed="1"/>
-    <w:lsdException w:name="List 4" w:semiHidden="1" w:unhideWhenUsed="1"/>
-    <w:lsdException w:name="List 5" w:semiHidden="1" w:unhideWhenUsed="1"/>
-    <w:lsdException w:name="List Bullet 2" w:semiHidden="1" w:unhideWhenUsed="1"/>
-    <w:lsdException w:name="List Bullet 3" w:semiHidden="1" w:unhideWhenUsed="1"/>
-    <w:lsdException w:name="List Bullet 4" w:semiHidden="1" w:unhideWhenUsed="1"/>
-    <w:lsdException w:name="List Bullet 5" w:semiHidden="1" w:unhideWhenUsed="1"/>
-    <w:lsdException w:name="List Number 2" w:semiHidden="1" w:unhideWhenUsed="1"/>
-    <w:lsdException w:name="List Number 3" w:semiHidden="1" w:unhideWhenUsed="1"/>
-    <w:lsdException w:name="List Number 4" w:semiHidden="1" w:unhideWhenUsed="1"/>
-    <w:lsdException w:name="List Number 5" w:semiHidden="1" w:unhideWhenUsed="1"/>
-    <w:lsdException w:name="Title" w:uiPriority="10" w:qFormat="1"/>
-    <w:lsdException w:name="Closing" w:semiHidden="1" w:unhideWhenUsed="1"/>
-    <w:lsdException w:name="Signature" w:semiHidden="1" w:unhideWhenUsed="1"/>
-    <w:lsdException w:name="Default Paragraph Font" w:semiHidden="1" w:uiPriority="1" w:unhideWhenUsed="1"/>
-    <w:lsdException w:name="Body Text" w:semiHidden="1" w:unhideWhenUsed="1"/>
-    <w:lsdException w:name="Body Text Indent" w:semiHidden="1" w:unhideWhenUsed="1"/>
-    <w:lsdException w:name="List Continue" w:semiHidden="1" w:unhideWhenUsed="1"/>
-    <w:lsdException w:name="List Continue 2" w:semiHidden="1" w:unhideWhenUsed="1"/>
-    <w:lsdException w:name="List Continue 3" w:semiHidden="1" w:unhideWhenUsed="1"/>
-    <w:lsdException w:name="List Continue 4" w:semiHidden="1" w:unhideWhenUsed="1"/>
-    <w:lsdException w:name="List Continue 5" w:semiHidden="1" w:unhideWhenUsed="1"/>
-    <w:lsdException w:name="Message Header" w:semiHidden="1" w:unhideWhenUsed="1"/>
-    <w:lsdException w:name="Subtitle" w:uiPriority="11" w:qFormat="1"/>
-    <w:lsdException w:name="Salutation" w:semiHidden="1" w:unhideWhenUsed="1"/>
-    <w:lsdException w:name="Date" w:semiHidden="1" w:unhideWhenUsed="1"/>
-    <w:lsdException w:name="Body Text First Indent" w:semiHidden="1" w:unhideWhenUsed="1"/>
-    <w:lsdException w:name="Body Text First Indent 2" w:semiHidden="1" w:unhideWhenUsed="1"/>
-    <w:lsdException w:name="Note Heading" w:semiHidden="1" w:unhideWhenUsed="1"/>
-    <w:lsdException w:name="Body Text 2" w:semiHidden="1" w:unhideWhenUsed="1"/>
-    <w:lsdException w:name="Body Text 3" w:semiHidden="1" w:unhideWhenUsed="1"/>
-    <w:lsdException w:name="Body Text Indent 2" w:semiHidden="1" w:unhideWhenUsed="1"/>
-    <w:lsdException w:name="Body Text Indent 3" w:semiHidden="1" w:unhideWhenUsed="1"/>
-    <w:lsdException w:name="Block Text" w:semiHidden="1" w:unhideWhenUsed="1"/>
-    <w:lsdException w:name="Hyperlink" w:semiHidden="1" w:unhideWhenUsed="1"/>
-    <w:lsdException w:name="FollowedHyperlink" w:semiHidden="1" w:unhideWhenUsed="1"/>
-    <w:lsdException w:name="Strong" w:uiPriority="22" w:qFormat="1"/>
-    <w:lsdException w:name="Emphasis" w:uiPriority="20" w:qFormat="1"/>
-    <w:lsdException w:name="Document Map" w:semiHidden="1" w:unhideWhenUsed="1"/>
-    <w:lsdException w:name="Plain Text" w:semiHidden="1" w:unhideWhenUsed="1"/>
-    <w:lsdException w:name="E-mail Signature" w:semiHidden="1" w:unhideWhenUsed="1"/>
-    <w:lsdException w:name="HTML Top of Form" w:semiHidden="1" w:unhideWhenUsed="1"/>
-    <w:lsdException w:name="HTML Bottom of Form" w:semiHidden="1" w:unhideWhenUsed="1"/>
-    <w:lsdException w:name="Normal (Web)" w:semiHidden="1" w:unhideWhenUsed="1"/>
-    <w:lsdException w:name="HTML Acronym" w:semiHidden="1" w:unhideWhenUsed="1"/>
-    <w:lsdException w:name="HTML Address" w:semiHidden="1" w:unhideWhenUsed="1"/>
-    <w:lsdException w:name="HTML Cite" w:semiHidden="1" w:unhideWhenUsed="1"/>
-    <w:lsdException w:name="HTML Code" w:semiHidden="1" w:unhideWhenUsed="1"/>
-    <w:lsdException w:name="HTML Definition" w:semiHidden="1" w:unhideWhenUsed="1"/>
-    <w:lsdException w:name="HTML Keyboard" w:semiHidden="1" w:unhideWhenUsed="1"/>
-    <w:lsdException w:name="HTML Preformatted" w:semiHidden="1" w:unhideWhenUsed="1"/>
-    <w:lsdException w:name="HTML Sample" w:semiHidden="1" w:unhideWhenUsed="1"/>
-    <w:lsdException w:name="HTML Typewriter" w:semiHidden="1" w:unhideWhenUsed="1"/>
-    <w:lsdException w:name="HTML Variable" w:semiHidden="1" w:unhideWhenUsed="1"/>
-    <w:lsdException w:name="Normal Table" w:semiHidden="1" w:unhideWhenUsed="1"/>
-    <w:lsdException w:name="annotation subject" w:semiHidden="1" w:unhideWhenUsed="1"/>
-    <w:lsdException w:name="No List" w:semiHidden="1" w:unhideWhenUsed="1"/>
-    <w:lsdException w:name="Outline List 1" w:semiHidden="1" w:unhideWhenUsed="1"/>
-    <w:lsdException w:name="Outline List 2" w:semiHidden="1" w:unhideWhenUsed="1"/>
-    <w:lsdException w:name="Outline List 3" w:semiHidden="1" w:unhideWhenUsed="1"/>
-    <w:lsdException w:name="Table Simple 1" w:semiHidden="1" w:unhideWhenUsed="1"/>
-    <w:lsdException w:name="Table Simple 2" w:semiHidden="1" w:unhideWhenUsed="1"/>
-    <w:lsdException w:name="Table Simple 3" w:semiHidden="1" w:unhideWhenUsed="1"/>
-    <w:lsdException w:name="Table Classic 1" w:semiHidden="1" w:unhideWhenUsed="1"/>
-    <w:lsdException w:name="Table Classic 2" w:semiHidden="1" w:unhideWhenUsed="1"/>
-    <w:lsdException w:name="Table Classic 3" w:semiHidden="1" w:unhideWhenUsed="1"/>
-    <w:lsdException w:name="Table Classic 4" w:semiHidden="1" w:unhideWhenUsed="1"/>
-    <w:lsdException w:name="Table Colorful 1" w:semiHidden="1" w:unhideWhenUsed="1"/>
-    <w:lsdException w:name="Table Colorful 2" w:semiHidden="1" w:unhideWhenUsed="1"/>
-    <w:lsdException w:name="Table Colorful 3" w:semiHidden="1" w:unhideWhenUsed="1"/>
-    <w:lsdException w:name="Table Columns 1" w:semiHidden="1" w:unhideWhenUsed="1"/>
-    <w:lsdException w:name="Table Columns 2" w:semiHidden="1" w:unhideWhenUsed="1"/>
-    <w:lsdException w:name="Table Columns 3" w:semiHidden="1" w:unhideWhenUsed="1"/>
-    <w:lsdException w:name="Table Columns 4" w:semiHidden="1" w:unhideWhenUsed="1"/>
-    <w:lsdException w:name="Table Columns 5" w:semiHidden="1" w:unhideWhenUsed="1"/>
-    <w:lsdException w:name="Table Grid 1" w:semiHidden="1" w:unhideWhenUsed="1"/>
-    <w:lsdException w:name="Table Grid 2" w:semiHidden="1" w:unhideWhenUsed="1"/>
-    <w:lsdException w:name="Table Grid 3" w:semiHidden="1" w:unhideWhenUsed="1"/>
-    <w:lsdException w:name="Table Grid 4" w:semiHidden="1" w:unhideWhenUsed="1"/>
-    <w:lsdException w:name="Table Grid 5" w:semiHidden="1" w:unhideWhenUsed="1"/>
-    <w:lsdException w:name="Table Grid 6" w:semiHidden="1" w:unhideWhenUsed="1"/>
-    <w:lsdException w:name="Table Grid 7" w:semiHidden="1" w:unhideWhenUsed="1"/>
-    <w:lsdException w:name="Table Grid 8" w:semiHidden="1" w:unhideWhenUsed="1"/>
-    <w:lsdException w:name="Table List 1" w:semiHidden="1" w:unhideWhenUsed="1"/>
-    <w:lsdException w:name="Table List 2" w:semiHidden="1" w:unhideWhenUsed="1"/>
-    <w:lsdException w:name="Table List 3" w:semiHidden="1" w:unhideWhenUsed="1"/>
-    <w:lsdException w:name="Table List 4" w:semiHidden="1" w:unhideWhenUsed="1"/>
-    <w:lsdException w:name="Table List 5" w:semiHidden="1" w:unhideWhenUsed="1"/>
-    <w:lsdException w:name="Table List 6" w:semiHidden="1" w:unhideWhenUsed="1"/>
-    <w:lsdException w:name="Table List 7" w:semiHidden="1" w:unhideWhenUsed="1"/>
-    <w:lsdException w:name="Table List 8" w:semiHidden="1" w:unhideWhenUsed="1"/>
-    <w:lsdException w:name="Table 3D effects 1" w:semiHidden="1" w:unhideWhenUsed="1"/>
-    <w:lsdException w:name="Table 3D effects 2" w:semiHidden="1" w:unhideWhenUsed="1"/>
-    <w:lsdException w:name="Table 3D effects 3" w:semiHidden="1" w:unhideWhenUsed="1"/>
-    <w:lsdException w:name="Table Contemporary" w:semiHidden="1" w:unhideWhenUsed="1"/>
-    <w:lsdException w:name="Table Elegant" w:semiHidden="1" w:unhideWhenUsed="1"/>
-    <w:lsdException w:name="Table Professional" w:semiHidden="1" w:unhideWhenUsed="1"/>
-    <w:lsdException w:name="Table Subtle 1" w:semiHidden="1" w:unhideWhenUsed="1"/>
-    <w:lsdException w:name="Table Subtle 2" w:semiHidden="1" w:unhideWhenUsed="1"/>
-    <w:lsdException w:name="Table Web 1" w:semiHidden="1" w:unhideWhenUsed="1"/>
-    <w:lsdException w:name="Table Web 2" w:semiHidden="1" w:unhideWhenUsed="1"/>
-    <w:lsdException w:name="Table Web 3" w:semiHidden="1" w:unhideWhenUsed="1"/>
-    <w:lsdException w:name="Balloon Text" w:semiHidden="1" w:unhideWhenUsed="1"/>
-    <w:lsdException w:name="Table Grid" w:uiPriority="39"/>
-    <w:lsdException w:name="Table Theme" w:semiHidden="1" w:unhideWhenUsed="1"/>
-    <w:lsdException w:name="Placeholder Text" w:semiHidden="1"/>
-    <w:lsdException w:name="No Spacing" w:uiPriority="1" w:qFormat="1"/>
-    <w:lsdException w:name="Light Shading" w:uiPriority="60"/>
-    <w:lsdException w:name="Light List" w:uiPriority="61"/>
-    <w:lsdException w:name="Light Grid" w:uiPriority="62"/>
-    <w:lsdException w:name="Medium Shading 1" w:uiPriority="63"/>
-    <w:lsdException w:name="Medium Shading 2" w:uiPriority="64"/>
-    <w:lsdException w:name="Medium List 1" w:uiPriority="65"/>
-    <w:lsdException w:name="Medium List 2" w:uiPriority="66"/>
-    <w:lsdException w:name="Medium Grid 1" w:uiPriority="67"/>
-    <w:lsdException w:name="Medium Grid 2" w:uiPriority="68"/>
-    <w:lsdException w:name="Medium Grid 3" w:uiPriority="69"/>
-    <w:lsdException w:name="Dark List" w:uiPriority="70"/>
-    <w:lsdException w:name="Colorful Shading" w:uiPriority="71"/>
-    <w:lsdException w:name="Colorful List" w:uiPriority="72"/>
-    <w:lsdException w:name="Colorful Grid" w:uiPriority="73"/>
-    <w:lsdException w:name="Light Shading Accent 1" w:uiPriority="60"/>
-    <w:lsdException w:name="Light List Accent 1" w:uiPriority="61"/>
-    <w:lsdException w:name="Light Grid Accent 1" w:uiPriority="62"/>
-    <w:lsdException w:name="Medium Shading 1 Accent 1" w:uiPriority="63"/>
-    <w:lsdException w:name="Medium Shading 2 Accent 1" w:uiPriority="64"/>
-    <w:lsdException w:name="Medium List 1 Accent 1" w:uiPriority="65"/>
-    <w:lsdException w:name="Revision" w:semiHidden="1"/>
-    <w:lsdException w:name="List Paragraph" w:uiPriority="34" w:qFormat="1"/>
-    <w:lsdException w:name="Quote" w:uiPriority="29" w:qFormat="1"/>
-    <w:lsdException w:name="Intense Quote" w:uiPriority="30" w:qFormat="1"/>
-    <w:lsdException w:name="Medium List 2 Accent 1" w:uiPriority="66"/>
-    <w:lsdException w:name="Medium Grid 1 Accent 1" w:uiPriority="67"/>
-    <w:lsdException w:name="Medium Grid 2 Accent 1" w:uiPriority="68"/>
-    <w:lsdException w:name="Medium Grid 3 Accent 1" w:uiPriority="69"/>
-    <w:lsdException w:name="Dark List Accent 1" w:uiPriority="70"/>
-    <w:lsdException w:name="Colorful Shading Accent 1" w:uiPriority="71"/>
-    <w:lsdException w:name="Colorful List Accent 1" w:uiPriority="72"/>
-    <w:lsdException w:name="Colorful Grid Accent 1" w:uiPriority="73"/>
-    <w:lsdException w:name="Light Shading Accent 2" w:uiPriority="60"/>
-    <w:lsdException w:name="Light List Accent 2" w:uiPriority="61"/>
-    <w:lsdException w:name="Light Grid Accent 2" w:uiPriority="62"/>
-    <w:lsdException w:name="Medium Shading 1 Accent 2" w:uiPriority="63"/>
-    <w:lsdException w:name="Medium Shading 2 Accent 2" w:uiPriority="64"/>
-    <w:lsdException w:name="Medium List 1 Accent 2" w:uiPriority="65"/>
-    <w:lsdException w:name="Medium List 2 Accent 2" w:uiPriority="66"/>
-    <w:lsdException w:name="Medium Grid 1 Accent 2" w:uiPriority="67"/>
-    <w:lsdException w:name="Medium Grid 2 Accent 2" w:uiPriority="68"/>
-    <w:lsdException w:name="Medium Grid 3 Accent 2" w:uiPriority="69"/>
-    <w:lsdException w:name="Dark List Accent 2" w:uiPriority="70"/>
-    <w:lsdException w:name="Colorful Shading Accent 2" w:uiPriority="71"/>
-    <w:lsdException w:name="Colorful List Accent 2" w:uiPriority="72"/>
-    <w:lsdException w:name="Colorful Grid Accent 2" w:uiPriority="73"/>
-    <w:lsdException w:name="Light Shading Accent 3" w:uiPriority="60"/>
-    <w:lsdException w:name="Light List Accent 3" w:uiPriority="61"/>
-    <w:lsdException w:name="Light Grid Accent 3" w:uiPriority="62"/>
-    <w:lsdException w:name="Medium Shading 1 Accent 3" w:uiPriority="63"/>
-    <w:lsdException w:name="Medium Shading 2 Accent 3" w:uiPriority="64"/>
-    <w:lsdException w:name="Medium List 1 Accent 3" w:uiPriority="65"/>
-    <w:lsdException w:name="Medium List 2 Accent 3" w:uiPriority="66"/>
-    <w:lsdException w:name="Medium Grid 1 Accent 3" w:uiPriority="67"/>
-    <w:lsdException w:name="Medium Grid 2 Accent 3" w:uiPriority="68"/>
-    <w:lsdException w:name="Medium Grid 3 Accent 3" w:uiPriority="69"/>
-    <w:lsdException w:name="Dark List Accent 3" w:uiPriority="70"/>
-    <w:lsdException w:name="Colorful Shading Accent 3" w:uiPriority="71"/>
-    <w:lsdException w:name="Colorful List Accent 3" w:uiPriority="72"/>
-    <w:lsdException w:name="Colorful Grid Accent 3" w:uiPriority="73"/>
-    <w:lsdException w:name="Light Shading Accent 4" w:uiPriority="60"/>
-    <w:lsdException w:name="Light List Accent 4" w:uiPriority="61"/>
-    <w:lsdException w:name="Light Grid Accent 4" w:uiPriority="62"/>
-    <w:lsdException w:name="Medium Shading 1 Accent 4" w:uiPriority="63"/>
-    <w:lsdException w:name="Medium Shading 2 Accent 4" w:uiPriority="64"/>
-    <w:lsdException w:name="Medium List 1 Accent 4" w:uiPriority="65"/>
-    <w:lsdException w:name="Medium List 2 Accent 4" w:uiPriority="66"/>
-    <w:lsdException w:name="Medium Grid 1 Accent 4" w:uiPriority="67"/>
-    <w:lsdException w:name="Medium Grid 2 Accent 4" w:uiPriority="68"/>
-    <w:lsdException w:name="Medium Grid 3 Accent 4" w:uiPriority="69"/>
-    <w:lsdException w:name="Dark List Accent 4" w:uiPriority="70"/>
-    <w:lsdException w:name="Colorful Shading Accent 4" w:uiPriority="71"/>
-    <w:lsdException w:name="Colorful List Accent 4" w:uiPriority="72"/>
-    <w:lsdException w:name="Colorful Grid Accent 4" w:uiPriority="73"/>
-    <w:lsdException w:name="Light Shading Accent 5" w:uiPriority="60"/>
-    <w:lsdException w:name="Light List Accent 5" w:uiPriority="61"/>
-    <w:lsdException w:name="Light Grid Accent 5" w:uiPriority="62"/>
-    <w:lsdException w:name="Medium Shading 1 Accent 5" w:uiPriority="63"/>
-    <w:lsdException w:name="Medium Shading 2 Accent 5" w:uiPriority="64"/>
-    <w:lsdException w:name="Medium List 1 Accent 5" w:uiPriority="65"/>
-    <w:lsdException w:name="Medium List 2 Accent 5" w:uiPriority="66"/>
-    <w:lsdException w:name="Medium Grid 1 Accent 5" w:uiPriority="67"/>
-    <w:lsdException w:name="Medium Grid 2 Accent 5" w:uiPriority="68"/>
-    <w:lsdException w:name="Medium Grid 3 Accent 5" w:uiPriority="69"/>
-    <w:lsdException w:name="Dark List Accent 5" w:uiPriority="70"/>
-    <w:lsdException w:name="Colorful Shading Accent 5" w:uiPriority="71"/>
-    <w:lsdException w:name="Colorful List Accent 5" w:uiPriority="72"/>
-    <w:lsdException w:name="Colorful Grid Accent 5" w:uiPriority="73"/>
-    <w:lsdException w:name="Light Shading Accent 6" w:uiPriority="60"/>
-    <w:lsdException w:name="Light List Accent 6" w:uiPriority="61"/>
-    <w:lsdException w:name="Light Grid Accent 6" w:uiPriority="62"/>
-    <w:lsdException w:name="Medium Shading 1 Accent 6" w:uiPriority="63"/>
-    <w:lsdException w:name="Medium Shading 2 Accent 6" w:uiPriority="64"/>
-    <w:lsdException w:name="Medium List 1 Accent 6" w:uiPriority="65"/>
-    <w:lsdException w:name="Medium List 2 Accent 6" w:uiPriority="66"/>
-    <w:lsdException w:name="Medium Grid 1 Accent 6" w:uiPriority="67"/>
-    <w:lsdException w:name="Medium Grid 2 Accent 6" w:uiPriority="68"/>
-    <w:lsdException w:name="Medium Grid 3 Accent 6" w:uiPriority="69"/>
-    <w:lsdException w:name="Dark List Accent 6" w:uiPriority="70"/>
-    <w:lsdException w:name="Colorful Shading Accent 6" w:uiPriority="71"/>
-    <w:lsdException w:name="Colorful List Accent 6" w:uiPriority="72"/>
-    <w:lsdException w:name="Colorful Grid Accent 6" w:uiPriority="73"/>
-    <w:lsdException w:name="Subtle Emphasis" w:uiPriority="19" w:qFormat="1"/>
-    <w:lsdException w:name="Intense Emphasis" w:uiPriority="21" w:qFormat="1"/>
-    <w:lsdException w:name="Subtle Reference" w:uiPriority="31" w:qFormat="1"/>
-    <w:lsdException w:name="Intense Reference" w:uiPriority="32" w:qFormat="1"/>
-    <w:lsdException w:name="Book Title" w:uiPriority="33" w:qFormat="1"/>
-    <w:lsdException w:name="Bibliography" w:semiHidden="1" w:uiPriority="37" w:unhideWhenUsed="1"/>
-    <w:lsdException w:name="TOC Heading" w:semiHidden="1" w:uiPriority="39" w:unhideWhenUsed="1" w:qFormat="1"/>
-    <w:lsdException w:name="Plain Table 1" w:uiPriority="41"/>
-    <w:lsdException w:name="Plain Table 2" w:uiPriority="42"/>
-    <w:lsdException w:name="Plain Table 3" w:uiPriority="43"/>
-    <w:lsdException w:name="Plain Table 4" w:uiPriority="44"/>
-    <w:lsdException w:name="Plain Table 5" w:uiPriority="45"/>
-    <w:lsdException w:name="Grid Table Light" w:uiPriority="40"/>
-    <w:lsdException w:name="Grid Table 1 Light" w:uiPriority="46"/>
-    <w:lsdException w:name="Grid Table 2" w:uiPriority="47"/>
-    <w:lsdException w:name="Grid Table 3" w:uiPriority="48"/>
-    <w:lsdException w:name="Grid Table 4" w:uiPriority="49"/>
-    <w:lsdException w:name="Grid Table 5 Dark" w:uiPriority="50"/>
-    <w:lsdException w:name="Grid Table 6 Colorful" w:uiPriority="51"/>
-    <w:lsdException w:name="Grid Table 7 Colorful" w:uiPriority="52"/>
-    <w:lsdException w:name="Grid Table 1 Light Accent 1" w:uiPriority="46"/>
-    <w:lsdException w:name="Grid Table 2 Accent 1" w:uiPriority="47"/>
-    <w:lsdException w:name="Grid Table 3 Accent 1" w:uiPriority="48"/>
-    <w:lsdException w:name="Grid Table 4 Accent 1" w:uiPriority="49"/>
-    <w:lsdException w:name="Grid Table 5 Dark Accent 1" w:uiPriority="50"/>
-    <w:lsdException w:name="Grid Table 6 Colorful Accent 1" w:uiPriority="51"/>
-    <w:lsdException w:name="Grid Table 7 Colorful Accent 1" w:uiPriority="52"/>
-    <w:lsdException w:name="Grid Table 1 Light Accent 2" w:uiPriority="46"/>
-    <w:lsdException w:name="Grid Table 2 Accent 2" w:uiPriority="47"/>
-    <w:lsdException w:name="Grid Table 3 Accent 2" w:uiPriority="48"/>
-    <w:lsdException w:name="Grid Table 4 Accent 2" w:uiPriority="49"/>
-    <w:lsdException w:name="Grid Table 5 Dark Accent 2" w:uiPriority="50"/>
-    <w:lsdException w:name="Grid Table 6 Colorful Accent 2" w:uiPriority="51"/>
-    <w:lsdException w:name="Grid Table 7 Colorful Accent 2" w:uiPriority="52"/>
-    <w:lsdException w:name="Grid Table 1 Light Accent 3" w:uiPriority="46"/>
-    <w:lsdException w:name="Grid Table 2 Accent 3" w:uiPriority="47"/>
-    <w:lsdException w:name="Grid Table 3 Accent 3" w:uiPriority="48"/>
-    <w:lsdException w:name="Grid Table 4 Accent 3" w:uiPriority="49"/>
-    <w:lsdException w:name="Grid Table 5 Dark Accent 3" w:uiPriority="50"/>
-    <w:lsdException w:name="Grid Table 6 Colorful Accent 3" w:uiPriority="51"/>
-    <w:lsdException w:name="Grid Table 7 Colorful Accent 3" w:uiPriority="52"/>
-    <w:lsdException w:name="Grid Table 1 Light Accent 4" w:uiPriority="46"/>
-    <w:lsdException w:name="Grid Table 2 Accent 4" w:uiPriority="47"/>
-    <w:lsdException w:name="Grid Table 3 Accent 4" w:uiPriority="48"/>
-    <w:lsdException w:name="Grid Table 4 Accent 4" w:uiPriority="49"/>
-    <w:lsdException w:name="Grid Table 5 Dark Accent 4" w:uiPriority="50"/>
-    <w:lsdException w:name="Grid Table 6 Colorful Accent 4" w:uiPriority="51"/>
-    <w:lsdException w:name="Grid Table 7 Colorful Accent 4" w:uiPriority="52"/>
-    <w:lsdException w:name="Grid Table 1 Light Accent 5" w:uiPriority="46"/>
-    <w:lsdException w:name="Grid Table 2 Accent 5" w:uiPriority="47"/>
-    <w:lsdException w:name="Grid Table 3 Accent 5" w:uiPriority="48"/>
-    <w:lsdException w:name="Grid Table 4 Accent 5" w:uiPriority="49"/>
-    <w:lsdException w:name="Grid Table 5 Dark Accent 5" w:uiPriority="50"/>
-    <w:lsdException w:name="Grid Table 6 Colorful Accent 5" w:uiPriority="51"/>
-    <w:lsdException w:name="Grid Table 7 Colorful Accent 5" w:uiPriority="52"/>
-    <w:lsdException w:name="Grid Table 1 Light Accent 6" w:uiPriority="46"/>
-    <w:lsdException w:name="Grid Table 2 Accent 6" w:uiPriority="47"/>
-    <w:lsdException w:name="Grid Table 3 Accent 6" w:uiPriority="48"/>
-    <w:lsdException w:name="Grid Table 4 Accent 6" w:uiPriority="49"/>
-    <w:lsdException w:name="Grid Table 5 Dark Accent 6" w:uiPriority="50"/>
-    <w:lsdException w:name="Grid Table 6 Colorful Accent 6" w:uiPriority="51"/>
-    <w:lsdException w:name="Grid Table 7 Colorful Accent 6" w:uiPriority="52"/>
-    <w:lsdException w:name="List Table 1 Light" w:uiPriority="46"/>
-    <w:lsdException w:name="List Table 2" w:uiPriority="47"/>
-    <w:lsdException w:name="List Table 3" w:uiPriority="48"/>
-    <w:lsdException w:name="List Table 4" w:uiPriority="49"/>
-    <w:lsdException w:name="List Table 5 Dark" w:uiPriority="50"/>
-    <w:lsdException w:name="List Table 6 Colorful" w:uiPriority="51"/>
-    <w:lsdException w:name="List Table 7 Colorful" w:uiPriority="52"/>
-    <w:lsdException w:name="List Table 1 Light Accent 1" w:uiPriority="46"/>
-    <w:lsdException w:name="List Table 2 Accent 1" w:uiPriority="47"/>
-    <w:lsdException w:name="List Table 3 Accent 1" w:uiPriority="48"/>
-    <w:lsdException w:name="List Table 4 Accent 1" w:uiPriority="49"/>
-    <w:lsdException w:name="List Table 5 Dark Accent 1" w:uiPriority="50"/>
-    <w:lsdException w:name="List Table 6 Colorful Accent 1" w:uiPriority="51"/>
-    <w:lsdException w:name="List Table 7 Colorful Accent 1" w:uiPriority="52"/>
-    <w:lsdException w:name="List Table 1 Light Accent 2" w:uiPriority="46"/>
-    <w:lsdException w:name="List Table 2 Accent 2" w:uiPriority="47"/>
-    <w:lsdException w:name="List Table 3 Accent 2" w:uiPriority="48"/>
-    <w:lsdException w:name="List Table 4 Accent 2" w:uiPriority="49"/>
-    <w:lsdException w:name="List Table 5 Dark Accent 2" w:uiPriority="50"/>
-    <w:lsdException w:name="List Table 6 Colorful Accent 2" w:uiPriority="51"/>
-    <w:lsdException w:name="List Table 7 Colorful Accent 2" w:uiPriority="52"/>
-    <w:lsdException w:name="List Table 1 Light Accent 3" w:uiPriority="46"/>
-    <w:lsdException w:name="List Table 2 Accent 3" w:uiPriority="47"/>
-    <w:lsdException w:name="List Table 3 Accent 3" w:uiPriority="48"/>
-    <w:lsdException w:name="List Table 4 Accent 3" w:uiPriority="49"/>
-    <w:lsdException w:name="List Table 5 Dark Accent 3" w:uiPriority="50"/>
-    <w:lsdException w:name="List Table 6 Colorful Accent 3" w:uiPriority="51"/>
-    <w:lsdException w:name="List Table 7 Colorful Accent 3" w:uiPriority="52"/>
-    <w:lsdException w:name="List Table 1 Light Accent 4" w:uiPriority="46"/>
-    <w:lsdException w:name="List Table 2 Accent 4" w:uiPriority="47"/>
-    <w:lsdException w:name="List Table 3 Accent 4" w:uiPriority="48"/>
-    <w:lsdException w:name="List Table 4 Accent 4" w:uiPriority="49"/>
-    <w:lsdException w:name="List Table 5 Dark Accent 4" w:uiPriority="50"/>
-    <w:lsdException w:name="List Table 6 Colorful Accent 4" w:uiPriority="51"/>
-    <w:lsdException w:name="List Table 7 Colorful Accent 4" w:uiPriority="52"/>
-    <w:lsdException w:name="List Table 1 Light Accent 5" w:uiPriority="46"/>
-    <w:lsdException w:name="List Table 2 Accent 5" w:uiPriority="47"/>
-    <w:lsdException w:name="List Table 3 Accent 5" w:uiPriority="48"/>
-    <w:lsdException w:name="List Table 4 Accent 5" w:uiPriority="49"/>
-    <w:lsdException w:name="List Table 5 Dark Accent 5" w:uiPriority="50"/>
-    <w:lsdException w:name="List Table 6 Colorful Accent 5" w:uiPriority="51"/>
-    <w:lsdException w:name="List Table 7 Colorful Accent 5" w:uiPriority="52"/>
-    <w:lsdException w:name="List Table 1 Light Accent 6" w:uiPriority="46"/>
-    <w:lsdException w:name="List Table 2 Accent 6" w:uiPriority="47"/>
-    <w:lsdException w:name="List Table 3 Accent 6" w:uiPriority="48"/>
-    <w:lsdException w:name="List Table 4 Accent 6" w:uiPriority="49"/>
-    <w:lsdException w:name="List Table 5 Dark Accent 6" w:uiPriority="50"/>
-    <w:lsdException w:name="List Table 6 Colorful Accent 6" w:uiPriority="51"/>
-    <w:lsdException w:name="List Table 7 Colorful Accent 6" w:uiPriority="52"/>
-    <w:lsdException w:name="Mention" w:semiHidden="1" w:unhideWhenUsed="1"/>
-    <w:lsdException w:name="Smart Hyperlink" w:semiHidden="1" w:unhideWhenUsed="1"/>
-    <w:lsdException w:name="Hashtag" w:semiHidden="1" w:unhideWhenUsed="1"/>
-    <w:lsdException w:name="Unresolved Mention" w:semiHidden="1" w:unhideWhenUsed="1"/>
-    <w:lsdException w:name="Smart Link" w:semiHidden="1" w:unhideWhenUsed="1"/>
+  <w:latentStyles w:count="260" w:defQFormat="0" w:defUnhideWhenUsed="1" w:defSemiHidden="1" w:defUIPriority="99" w:defLockedState="0">
+    <w:lsdException w:qFormat="1" w:unhideWhenUsed="0" w:uiPriority="0" w:semiHidden="0" w:name="Normal"/>
+    <w:lsdException w:qFormat="1" w:unhideWhenUsed="0" w:uiPriority="9" w:semiHidden="0" w:name="heading 1"/>
+    <w:lsdException w:qFormat="1" w:uiPriority="9" w:semiHidden="0" w:name="heading 2"/>
+    <w:lsdException w:qFormat="1" w:uiPriority="9" w:name="heading 3"/>
+    <w:lsdException w:qFormat="1" w:uiPriority="9" w:name="heading 4"/>
+    <w:lsdException w:qFormat="1" w:uiPriority="9" w:name="heading 5"/>
+    <w:lsdException w:qFormat="1" w:uiPriority="9" w:name="heading 6"/>
+    <w:lsdException w:qFormat="1" w:uiPriority="9" w:name="heading 7"/>
+    <w:lsdException w:qFormat="1" w:uiPriority="9" w:name="heading 8"/>
+    <w:lsdException w:qFormat="1" w:uiPriority="9" w:name="heading 9"/>
+    <w:lsdException w:uiPriority="99" w:name="index 1"/>
+    <w:lsdException w:uiPriority="99" w:name="index 2"/>
+    <w:lsdException w:uiPriority="99" w:name="index 3"/>
+    <w:lsdException w:uiPriority="99" w:name="index 4"/>
+    <w:lsdException w:uiPriority="99" w:name="index 5"/>
+    <w:lsdException w:uiPriority="99" w:name="index 6"/>
+    <w:lsdException w:uiPriority="99" w:name="index 7"/>
+    <w:lsdException w:uiPriority="99" w:name="index 8"/>
+    <w:lsdException w:uiPriority="99" w:name="index 9"/>
+    <w:lsdException w:uiPriority="39" w:name="toc 1"/>
+    <w:lsdException w:uiPriority="39" w:name="toc 2"/>
+    <w:lsdException w:uiPriority="39" w:name="toc 3"/>
+    <w:lsdException w:uiPriority="39" w:name="toc 4"/>
+    <w:lsdException w:uiPriority="39" w:name="toc 5"/>
+    <w:lsdException w:uiPriority="39" w:name="toc 6"/>
+    <w:lsdException w:uiPriority="39" w:name="toc 7"/>
+    <w:lsdException w:uiPriority="39" w:name="toc 8"/>
+    <w:lsdException w:uiPriority="39" w:name="toc 9"/>
+    <w:lsdException w:uiPriority="99" w:name="Normal Indent"/>
+    <w:lsdException w:uiPriority="99" w:name="footnote text"/>
+    <w:lsdException w:uiPriority="99" w:name="annotation text"/>
+    <w:lsdException w:qFormat="1" w:uiPriority="99" w:semiHidden="0" w:name="header"/>
+    <w:lsdException w:qFormat="1" w:uiPriority="99" w:semiHidden="0" w:name="footer"/>
+    <w:lsdException w:uiPriority="99" w:name="index heading"/>
+    <w:lsdException w:qFormat="1" w:uiPriority="35" w:name="caption"/>
+    <w:lsdException w:uiPriority="99" w:name="table of figures"/>
+    <w:lsdException w:uiPriority="99" w:name="envelope address"/>
+    <w:lsdException w:uiPriority="99" w:name="envelope return"/>
+    <w:lsdException w:uiPriority="99" w:name="footnote reference"/>
+    <w:lsdException w:uiPriority="99" w:name="annotation reference"/>
+    <w:lsdException w:uiPriority="99" w:name="line number"/>
+    <w:lsdException w:uiPriority="99" w:name="page number"/>
+    <w:lsdException w:uiPriority="99" w:name="endnote reference"/>
+    <w:lsdException w:uiPriority="99" w:name="endnote text"/>
+    <w:lsdException w:uiPriority="99" w:name="table of authorities"/>
+    <w:lsdException w:uiPriority="99" w:name="macro"/>
+    <w:lsdException w:uiPriority="99" w:name="toa heading"/>
+    <w:lsdException w:uiPriority="99" w:name="List"/>
+    <w:lsdException w:uiPriority="99" w:name="List Bullet"/>
+    <w:lsdException w:uiPriority="99" w:name="List Number"/>
+    <w:lsdException w:uiPriority="99" w:name="List 2"/>
+    <w:lsdException w:uiPriority="99" w:name="List 3"/>
+    <w:lsdException w:uiPriority="99" w:name="List 4"/>
+    <w:lsdException w:uiPriority="99" w:name="List 5"/>
+    <w:lsdException w:uiPriority="99" w:name="List Bullet 2"/>
+    <w:lsdException w:uiPriority="99" w:name="List Bullet 3"/>
+    <w:lsdException w:uiPriority="99" w:name="List Bullet 4"/>
+    <w:lsdException w:uiPriority="99" w:name="List Bullet 5"/>
+    <w:lsdException w:uiPriority="99" w:name="List Number 2"/>
+    <w:lsdException w:uiPriority="99" w:name="List Number 3"/>
+    <w:lsdException w:uiPriority="99" w:name="List Number 4"/>
+    <w:lsdException w:uiPriority="99" w:name="List Number 5"/>
+    <w:lsdException w:qFormat="1" w:unhideWhenUsed="0" w:uiPriority="10" w:semiHidden="0" w:name="Title"/>
+    <w:lsdException w:uiPriority="99" w:name="Closing"/>
+    <w:lsdException w:uiPriority="99" w:name="Signature"/>
+    <w:lsdException w:qFormat="1" w:uiPriority="1" w:name="Default Paragraph Font"/>
+    <w:lsdException w:uiPriority="99" w:name="Body Text"/>
+    <w:lsdException w:uiPriority="99" w:name="Body Text Indent"/>
+    <w:lsdException w:uiPriority="99" w:name="List Continue"/>
+    <w:lsdException w:uiPriority="99" w:name="List Continue 2"/>
+    <w:lsdException w:uiPriority="99" w:name="List Continue 3"/>
+    <w:lsdException w:uiPriority="99" w:name="List Continue 4"/>
+    <w:lsdException w:uiPriority="99" w:name="List Continue 5"/>
+    <w:lsdException w:uiPriority="99" w:name="Message Header"/>
+    <w:lsdException w:qFormat="1" w:unhideWhenUsed="0" w:uiPriority="11" w:semiHidden="0" w:name="Subtitle"/>
+    <w:lsdException w:uiPriority="99" w:name="Salutation"/>
+    <w:lsdException w:uiPriority="99" w:name="Date"/>
+    <w:lsdException w:uiPriority="99" w:name="Body Text First Indent"/>
+    <w:lsdException w:uiPriority="99" w:name="Body Text First Indent 2"/>
+    <w:lsdException w:uiPriority="99" w:name="Note Heading"/>
+    <w:lsdException w:uiPriority="99" w:name="Body Text 2"/>
+    <w:lsdException w:uiPriority="99" w:name="Body Text 3"/>
+    <w:lsdException w:uiPriority="99" w:name="Body Text Indent 2"/>
+    <w:lsdException w:uiPriority="99" w:name="Body Text Indent 3"/>
+    <w:lsdException w:uiPriority="99" w:name="Block Text"/>
+    <w:lsdException w:uiPriority="99" w:name="Hyperlink"/>
+    <w:lsdException w:uiPriority="99" w:name="FollowedHyperlink"/>
+    <w:lsdException w:qFormat="1" w:unhideWhenUsed="0" w:uiPriority="22" w:semiHidden="0" w:name="Strong"/>
+    <w:lsdException w:qFormat="1" w:unhideWhenUsed="0" w:uiPriority="20" w:semiHidden="0" w:name="Emphasis"/>
+    <w:lsdException w:uiPriority="99" w:name="Document Map"/>
+    <w:lsdException w:uiPriority="99" w:name="Plain Text"/>
+    <w:lsdException w:uiPriority="99" w:name="E-mail Signature"/>
+    <w:lsdException w:uiPriority="99" w:name="Normal (Web)"/>
+    <w:lsdException w:uiPriority="99" w:name="HTML Acronym"/>
+    <w:lsdException w:uiPriority="99" w:name="HTML Address"/>
+    <w:lsdException w:uiPriority="99" w:name="HTML Cite"/>
+    <w:lsdException w:uiPriority="99" w:name="HTML Code"/>
+    <w:lsdException w:uiPriority="99" w:name="HTML Definition"/>
+    <w:lsdException w:uiPriority="99" w:name="HTML Keyboard"/>
+    <w:lsdException w:uiPriority="99" w:name="HTML Preformatted"/>
+    <w:lsdException w:uiPriority="99" w:name="HTML Sample"/>
+    <w:lsdException w:uiPriority="99" w:name="HTML Typewriter"/>
+    <w:lsdException w:uiPriority="99" w:name="HTML Variable"/>
+    <w:lsdException w:qFormat="1" w:uiPriority="99" w:name="Normal Table"/>
+    <w:lsdException w:uiPriority="99" w:name="annotation subject"/>
+    <w:lsdException w:uiPriority="99" w:name="Table Simple 1"/>
+    <w:lsdException w:uiPriority="99" w:name="Table Simple 2"/>
+    <w:lsdException w:uiPriority="99" w:name="Table Simple 3"/>
+    <w:lsdException w:uiPriority="99" w:name="Table Classic 1"/>
+    <w:lsdException w:uiPriority="99" w:name="Table Classic 2"/>
+    <w:lsdException w:uiPriority="99" w:name="Table Classic 3"/>
+    <w:lsdException w:uiPriority="99" w:name="Table Classic 4"/>
+    <w:lsdException w:uiPriority="99" w:name="Table Colorful 1"/>
+    <w:lsdException w:uiPriority="99" w:name="Table Colorful 2"/>
+    <w:lsdException w:uiPriority="99" w:name="Table Colorful 3"/>
+    <w:lsdException w:uiPriority="99" w:name="Table Columns 1"/>
+    <w:lsdException w:uiPriority="99" w:name="Table Columns 2"/>
+    <w:lsdException w:uiPriority="99" w:name="Table Columns 3"/>
+    <w:lsdException w:uiPriority="99" w:name="Table Columns 4"/>
+    <w:lsdException w:uiPriority="99" w:name="Table Columns 5"/>
+    <w:lsdException w:uiPriority="99" w:name="Table Grid 1"/>
+    <w:lsdException w:uiPriority="99" w:name="Table Grid 2"/>
+    <w:lsdException w:uiPriority="99" w:name="Table Grid 3"/>
+    <w:lsdException w:uiPriority="99" w:name="Table Grid 4"/>
+    <w:lsdException w:uiPriority="99" w:name="Table Grid 5"/>
+    <w:lsdException w:uiPriority="99" w:name="Table Grid 6"/>
+    <w:lsdException w:uiPriority="99" w:name="Table Grid 7"/>
+    <w:lsdException w:uiPriority="99" w:name="Table Grid 8"/>
+    <w:lsdException w:uiPriority="99" w:name="Table List 1"/>
+    <w:lsdException w:uiPriority="99" w:name="Table List 2"/>
+    <w:lsdException w:uiPriority="99" w:name="Table List 3"/>
+    <w:lsdException w:uiPriority="99" w:name="Table List 4"/>
+    <w:lsdException w:uiPriority="99" w:name="Table List 5"/>
+    <w:lsdException w:uiPriority="99" w:name="Table List 6"/>
+    <w:lsdException w:uiPriority="99" w:name="Table List 7"/>
+    <w:lsdException w:uiPriority="99" w:name="Table List 8"/>
+    <w:lsdException w:uiPriority="99" w:name="Table 3D effects 1"/>
+    <w:lsdException w:uiPriority="99" w:name="Table 3D effects 2"/>
+    <w:lsdException w:uiPriority="99" w:name="Table 3D effects 3"/>
+    <w:lsdException w:uiPriority="99" w:name="Table Contemporary"/>
+    <w:lsdException w:uiPriority="99" w:name="Table Elegant"/>
+    <w:lsdException w:uiPriority="99" w:name="Table Professional"/>
+    <w:lsdException w:uiPriority="99" w:name="Table Subtle 1"/>
+    <w:lsdException w:uiPriority="99" w:name="Table Subtle 2"/>
+    <w:lsdException w:uiPriority="99" w:name="Table Web 1"/>
+    <w:lsdException w:uiPriority="99" w:name="Table Web 2"/>
+    <w:lsdException w:uiPriority="99" w:name="Table Web 3"/>
+    <w:lsdException w:uiPriority="99" w:name="Balloon Text"/>
+    <w:lsdException w:qFormat="1" w:unhideWhenUsed="0" w:uiPriority="39" w:semiHidden="0" w:name="Table Grid"/>
+    <w:lsdException w:uiPriority="99" w:name="Table Theme"/>
+    <w:lsdException w:unhideWhenUsed="0" w:uiPriority="60" w:semiHidden="0" w:name="Light Shading"/>
+    <w:lsdException w:unhideWhenUsed="0" w:uiPriority="61" w:semiHidden="0" w:name="Light List"/>
+    <w:lsdException w:unhideWhenUsed="0" w:uiPriority="62" w:semiHidden="0" w:name="Light Grid"/>
+    <w:lsdException w:unhideWhenUsed="0" w:uiPriority="63" w:semiHidden="0" w:name="Medium Shading 1"/>
+    <w:lsdException w:unhideWhenUsed="0" w:uiPriority="64" w:semiHidden="0" w:name="Medium Shading 2"/>
+    <w:lsdException w:unhideWhenUsed="0" w:uiPriority="65" w:semiHidden="0" w:name="Medium List 1"/>
+    <w:lsdException w:unhideWhenUsed="0" w:uiPriority="66" w:semiHidden="0" w:name="Medium List 2"/>
+    <w:lsdException w:unhideWhenUsed="0" w:uiPriority="67" w:semiHidden="0" w:name="Medium Grid 1"/>
+    <w:lsdException w:unhideWhenUsed="0" w:uiPriority="68" w:semiHidden="0" w:name="Medium Grid 2"/>
+    <w:lsdException w:unhideWhenUsed="0" w:uiPriority="69" w:semiHidden="0" w:name="Medium Grid 3"/>
+    <w:lsdException w:unhideWhenUsed="0" w:uiPriority="70" w:semiHidden="0" w:name="Dark List"/>
+    <w:lsdException w:unhideWhenUsed="0" w:uiPriority="71" w:semiHidden="0" w:name="Colorful Shading"/>
+    <w:lsdException w:unhideWhenUsed="0" w:uiPriority="72" w:semiHidden="0" w:name="Colorful List"/>
+    <w:lsdException w:unhideWhenUsed="0" w:uiPriority="73" w:semiHidden="0" w:name="Colorful Grid"/>
+    <w:lsdException w:unhideWhenUsed="0" w:uiPriority="60" w:semiHidden="0" w:name="Light Shading Accent 1"/>
+    <w:lsdException w:unhideWhenUsed="0" w:uiPriority="61" w:semiHidden="0" w:name="Light List Accent 1"/>
+    <w:lsdException w:unhideWhenUsed="0" w:uiPriority="62" w:semiHidden="0" w:name="Light Grid Accent 1"/>
+    <w:lsdException w:unhideWhenUsed="0" w:uiPriority="63" w:semiHidden="0" w:name="Medium Shading 1 Accent 1"/>
+    <w:lsdException w:unhideWhenUsed="0" w:uiPriority="64" w:semiHidden="0" w:name="Medium Shading 2 Accent 1"/>
+    <w:lsdException w:unhideWhenUsed="0" w:uiPriority="65" w:semiHidden="0" w:name="Medium List 1 Accent 1"/>
+    <w:lsdException w:qFormat="1" w:unhideWhenUsed="0" w:uiPriority="34" w:semiHidden="0" w:name="List Paragraph"/>
+    <w:lsdException w:qFormat="1" w:unhideWhenUsed="0" w:uiPriority="29" w:semiHidden="0" w:name="Quote"/>
+    <w:lsdException w:qFormat="1" w:unhideWhenUsed="0" w:uiPriority="30" w:semiHidden="0" w:name="Intense Quote"/>
+    <w:lsdException w:unhideWhenUsed="0" w:uiPriority="66" w:semiHidden="0" w:name="Medium List 2 Accent 1"/>
+    <w:lsdException w:unhideWhenUsed="0" w:uiPriority="67" w:semiHidden="0" w:name="Medium Grid 1 Accent 1"/>
+    <w:lsdException w:unhideWhenUsed="0" w:uiPriority="68" w:semiHidden="0" w:name="Medium Grid 2 Accent 1"/>
+    <w:lsdException w:unhideWhenUsed="0" w:uiPriority="69" w:semiHidden="0" w:name="Medium Grid 3 Accent 1"/>
+    <w:lsdException w:unhideWhenUsed="0" w:uiPriority="70" w:semiHidden="0" w:name="Dark List Accent 1"/>
+    <w:lsdException w:unhideWhenUsed="0" w:uiPriority="71" w:semiHidden="0" w:name="Colorful Shading Accent 1"/>
+    <w:lsdException w:unhideWhenUsed="0" w:uiPriority="72" w:semiHidden="0" w:name="Colorful List Accent 1"/>
+    <w:lsdException w:unhideWhenUsed="0" w:uiPriority="73" w:semiHidden="0" w:name="Colorful Grid Accent 1"/>
+    <w:lsdException w:unhideWhenUsed="0" w:uiPriority="60" w:semiHidden="0" w:name="Light Shading Accent 2"/>
+    <w:lsdException w:unhideWhenUsed="0" w:uiPriority="61" w:semiHidden="0" w:name="Light List Accent 2"/>
+    <w:lsdException w:unhideWhenUsed="0" w:uiPriority="62" w:semiHidden="0" w:name="Light Grid Accent 2"/>
+    <w:lsdException w:unhideWhenUsed="0" w:uiPriority="63" w:semiHidden="0" w:name="Medium Shading 1 Accent 2"/>
+    <w:lsdException w:unhideWhenUsed="0" w:uiPriority="64" w:semiHidden="0" w:name="Medium Shading 2 Accent 2"/>
+    <w:lsdException w:unhideWhenUsed="0" w:uiPriority="65" w:semiHidden="0" w:name="Medium List 1 Accent 2"/>
+    <w:lsdException w:unhideWhenUsed="0" w:uiPriority="66" w:semiHidden="0" w:name="Medium List 2 Accent 2"/>
+    <w:lsdException w:unhideWhenUsed="0" w:uiPriority="67" w:semiHidden="0" w:name="Medium Grid 1 Accent 2"/>
+    <w:lsdException w:unhideWhenUsed="0" w:uiPriority="68" w:semiHidden="0" w:name="Medium Grid 2 Accent 2"/>
+    <w:lsdException w:unhideWhenUsed="0" w:uiPriority="69" w:semiHidden="0" w:name="Medium Grid 3 Accent 2"/>
+    <w:lsdException w:unhideWhenUsed="0" w:uiPriority="70" w:semiHidden="0" w:name="Dark List Accent 2"/>
+    <w:lsdException w:unhideWhenUsed="0" w:uiPriority="71" w:semiHidden="0" w:name="Colorful Shading Accent 2"/>
+    <w:lsdException w:unhideWhenUsed="0" w:uiPriority="72" w:semiHidden="0" w:name="Colorful List Accent 2"/>
+    <w:lsdException w:unhideWhenUsed="0" w:uiPriority="73" w:semiHidden="0" w:name="Colorful Grid Accent 2"/>
+    <w:lsdException w:unhideWhenUsed="0" w:uiPriority="60" w:semiHidden="0" w:name="Light Shading Accent 3"/>
+    <w:lsdException w:unhideWhenUsed="0" w:uiPriority="61" w:semiHidden="0" w:name="Light List Accent 3"/>
+    <w:lsdException w:unhideWhenUsed="0" w:uiPriority="62" w:semiHidden="0" w:name="Light Grid Accent 3"/>
+    <w:lsdException w:unhideWhenUsed="0" w:uiPriority="63" w:semiHidden="0" w:name="Medium Shading 1 Accent 3"/>
+    <w:lsdException w:unhideWhenUsed="0" w:uiPriority="64" w:semiHidden="0" w:name="Medium Shading 2 Accent 3"/>
+    <w:lsdException w:unhideWhenUsed="0" w:uiPriority="65" w:semiHidden="0" w:name="Medium List 1 Accent 3"/>
+    <w:lsdException w:unhideWhenUsed="0" w:uiPriority="66" w:semiHidden="0" w:name="Medium List 2 Accent 3"/>
+    <w:lsdException w:unhideWhenUsed="0" w:uiPriority="67" w:semiHidden="0" w:name="Medium Grid 1 Accent 3"/>
+    <w:lsdException w:unhideWhenUsed="0" w:uiPriority="68" w:semiHidden="0" w:name="Medium Grid 2 Accent 3"/>
+    <w:lsdException w:unhideWhenUsed="0" w:uiPriority="69" w:semiHidden="0" w:name="Medium Grid 3 Accent 3"/>
+    <w:lsdException w:unhideWhenUsed="0" w:uiPriority="70" w:semiHidden="0" w:name="Dark List Accent 3"/>
+    <w:lsdException w:unhideWhenUsed="0" w:uiPriority="71" w:semiHidden="0" w:name="Colorful Shading Accent 3"/>
+    <w:lsdException w:unhideWhenUsed="0" w:uiPriority="72" w:semiHidden="0" w:name="Colorful List Accent 3"/>
+    <w:lsdException w:unhideWhenUsed="0" w:uiPriority="73" w:semiHidden="0" w:name="Colorful Grid Accent 3"/>
+    <w:lsdException w:unhideWhenUsed="0" w:uiPriority="60" w:semiHidden="0" w:name="Light Shading Accent 4"/>
+    <w:lsdException w:unhideWhenUsed="0" w:uiPriority="61" w:semiHidden="0" w:name="Light List Accent 4"/>
+    <w:lsdException w:unhideWhenUsed="0" w:uiPriority="62" w:semiHidden="0" w:name="Light Grid Accent 4"/>
+    <w:lsdException w:unhideWhenUsed="0" w:uiPriority="63" w:semiHidden="0" w:name="Medium Shading 1 Accent 4"/>
+    <w:lsdException w:unhideWhenUsed="0" w:uiPriority="64" w:semiHidden="0" w:name="Medium Shading 2 Accent 4"/>
+    <w:lsdException w:unhideWhenUsed="0" w:uiPriority="65" w:semiHidden="0" w:name="Medium List 1 Accent 4"/>
+    <w:lsdException w:unhideWhenUsed="0" w:uiPriority="66" w:semiHidden="0" w:name="Medium List 2 Accent 4"/>
+    <w:lsdException w:unhideWhenUsed="0" w:uiPriority="67" w:semiHidden="0" w:name="Medium Grid 1 Accent 4"/>
+    <w:lsdException w:unhideWhenUsed="0" w:uiPriority="68" w:semiHidden="0" w:name="Medium Grid 2 Accent 4"/>
+    <w:lsdException w:unhideWhenUsed="0" w:uiPriority="69" w:semiHidden="0" w:name="Medium Grid 3 Accent 4"/>
+    <w:lsdException w:unhideWhenUsed="0" w:uiPriority="70" w:semiHidden="0" w:name="Dark List Accent 4"/>
+    <w:lsdException w:unhideWhenUsed="0" w:uiPriority="71" w:semiHidden="0" w:name="Colorful Shading Accent 4"/>
+    <w:lsdException w:unhideWhenUsed="0" w:uiPriority="72" w:semiHidden="0" w:name="Colorful List Accent 4"/>
+    <w:lsdException w:unhideWhenUsed="0" w:uiPriority="73" w:semiHidden="0" w:name="Colorful Grid Accent 4"/>
+    <w:lsdException w:unhideWhenUsed="0" w:uiPriority="60" w:semiHidden="0" w:name="Light Shading Accent 5"/>
+    <w:lsdException w:unhideWhenUsed="0" w:uiPriority="61" w:semiHidden="0" w:name="Light List Accent 5"/>
+    <w:lsdException w:unhideWhenUsed="0" w:uiPriority="62" w:semiHidden="0" w:name="Light Grid Accent 5"/>
+    <w:lsdException w:unhideWhenUsed="0" w:uiPriority="63" w:semiHidden="0" w:name="Medium Shading 1 Accent 5"/>
+    <w:lsdException w:unhideWhenUsed="0" w:uiPriority="64" w:semiHidden="0" w:name="Medium Shading 2 Accent 5"/>
+    <w:lsdException w:unhideWhenUsed="0" w:uiPriority="65" w:semiHidden="0" w:name="Medium List 1 Accent 5"/>
+    <w:lsdException w:unhideWhenUsed="0" w:uiPriority="66" w:semiHidden="0" w:name="Medium List 2 Accent 5"/>
+    <w:lsdException w:unhideWhenUsed="0" w:uiPriority="67" w:semiHidden="0" w:name="Medium Grid 1 Accent 5"/>
+    <w:lsdException w:unhideWhenUsed="0" w:uiPriority="68" w:semiHidden="0" w:name="Medium Grid 2 Accent 5"/>
+    <w:lsdException w:unhideWhenUsed="0" w:uiPriority="69" w:semiHidden="0" w:name="Medium Grid 3 Accent 5"/>
+    <w:lsdException w:unhideWhenUsed="0" w:uiPriority="70" w:semiHidden="0" w:name="Dark List Accent 5"/>
+    <w:lsdException w:unhideWhenUsed="0" w:uiPriority="71" w:semiHidden="0" w:name="Colorful Shading Accent 5"/>
+    <w:lsdException w:unhideWhenUsed="0" w:uiPriority="72" w:semiHidden="0" w:name="Colorful List Accent 5"/>
+    <w:lsdException w:unhideWhenUsed="0" w:uiPriority="73" w:semiHidden="0" w:name="Colorful Grid Accent 5"/>
+    <w:lsdException w:unhideWhenUsed="0" w:uiPriority="60" w:semiHidden="0" w:name="Light Shading Accent 6"/>
+    <w:lsdException w:unhideWhenUsed="0" w:uiPriority="61" w:semiHidden="0" w:name="Light List Accent 6"/>
+    <w:lsdException w:unhideWhenUsed="0" w:uiPriority="62" w:semiHidden="0" w:name="Light Grid Accent 6"/>
+    <w:lsdException w:unhideWhenUsed="0" w:uiPriority="63" w:semiHidden="0" w:name="Medium Shading 1 Accent 6"/>
+    <w:lsdException w:unhideWhenUsed="0" w:uiPriority="64" w:semiHidden="0" w:name="Medium Shading 2 Accent 6"/>
+    <w:lsdException w:unhideWhenUsed="0" w:uiPriority="65" w:semiHidden="0" w:name="Medium List 1 Accent 6"/>
+    <w:lsdException w:unhideWhenUsed="0" w:uiPriority="66" w:semiHidden="0" w:name="Medium List 2 Accent 6"/>
+    <w:lsdException w:unhideWhenUsed="0" w:uiPriority="67" w:semiHidden="0" w:name="Medium Grid 1 Accent 6"/>
+    <w:lsdException w:unhideWhenUsed="0" w:uiPriority="68" w:semiHidden="0" w:name="Medium Grid 2 Accent 6"/>
+    <w:lsdException w:unhideWhenUsed="0" w:uiPriority="69" w:semiHidden="0" w:name="Medium Grid 3 Accent 6"/>
+    <w:lsdException w:unhideWhenUsed="0" w:uiPriority="70" w:semiHidden="0" w:name="Dark List Accent 6"/>
+    <w:lsdException w:unhideWhenUsed="0" w:uiPriority="71" w:semiHidden="0" w:name="Colorful Shading Accent 6"/>
+    <w:lsdException w:unhideWhenUsed="0" w:uiPriority="72" w:semiHidden="0" w:name="Colorful List Accent 6"/>
+    <w:lsdException w:unhideWhenUsed="0" w:uiPriority="73" w:semiHidden="0" w:name="Colorful Grid Accent 6"/>
   </w:latentStyles>
-  <w:style w:type="paragraph" w:default="1" w:styleId="a">
+  <w:style w:type="paragraph" w:default="1" w:styleId="1">
     <w:name w:val="Normal"/>
     <w:qFormat/>
-    <w:rsid w:val="00C32861"/>
+    <w:uiPriority w:val="0"/>
     <w:pPr>
       <w:widowControl w:val="0"/>
       <w:jc w:val="both"/>
     </w:pPr>
+    <w:rPr>
+      <w:rFonts w:asciiTheme="minorHAnsi" w:hAnsiTheme="minorHAnsi" w:eastAsiaTheme="minorEastAsia" w:cstheme="minorBidi"/>
+      <w:kern w:val="2"/>
+      <w:sz w:val="21"/>
+      <w:szCs w:val="22"/>
+      <w:lang w:val="en-US" w:eastAsia="zh-CN" w:bidi="ar-SA"/>
+    </w:rPr>
   </w:style>
-  <w:style w:type="paragraph" w:styleId="1">
+  <w:style w:type="paragraph" w:styleId="2">
     <w:name w:val="heading 1"/>
-    <w:basedOn w:val="a"/>
-    <w:next w:val="a"/>
-    <w:link w:val="10"/>
+    <w:basedOn w:val="1"/>
+    <w:next w:val="1"/>
+    <w:link w:val="18"/>
+    <w:qFormat/>
     <w:uiPriority w:val="9"/>
-    <w:qFormat/>
-    <w:rsid w:val="00F4304B"/>
     <w:pPr>
       <w:keepNext/>
       <w:keepLines/>
       <w:spacing w:before="480" w:after="80"/>
-      <w:ind w:leftChars="100" w:left="100" w:rightChars="100" w:right="100"/>
+      <w:ind w:left="100" w:leftChars="100" w:right="100" w:rightChars="100"/>
       <w:jc w:val="left"/>
       <w:outlineLvl w:val="0"/>
     </w:pPr>
     <w:rPr>
-      <w:rFonts w:asciiTheme="majorHAnsi" w:eastAsia="宋体" w:hAnsiTheme="majorHAnsi" w:cstheme="majorBidi"/>
+      <w:rFonts w:eastAsia="宋体" w:asciiTheme="majorHAnsi" w:hAnsiTheme="majorHAnsi" w:cstheme="majorBidi"/>
       <w:color w:val="EE0000"/>
       <w:sz w:val="28"/>
       <w:szCs w:val="48"/>
     </w:rPr>
   </w:style>
-  <w:style w:type="paragraph" w:styleId="2">
+  <w:style w:type="paragraph" w:styleId="3">
     <w:name w:val="heading 2"/>
-    <w:basedOn w:val="a"/>
-    <w:next w:val="a"/>
-    <w:link w:val="20"/>
-    <w:uiPriority w:val="9"/>
+    <w:basedOn w:val="1"/>
+    <w:next w:val="1"/>
+    <w:link w:val="19"/>
     <w:unhideWhenUsed/>
     <w:qFormat/>
-    <w:rsid w:val="00C42A14"/>
+    <w:uiPriority w:val="9"/>
     <w:pPr>
       <w:keepNext/>
       <w:keepLines/>
       <w:spacing w:before="160" w:after="80"/>
-      <w:ind w:leftChars="100" w:left="1680" w:rightChars="100" w:right="100"/>
+      <w:ind w:left="1680" w:leftChars="100" w:right="100" w:rightChars="100"/>
       <w:jc w:val="left"/>
       <w:outlineLvl w:val="1"/>
     </w:pPr>
     <w:rPr>
-      <w:rFonts w:asciiTheme="majorHAnsi" w:eastAsia="宋体" w:hAnsiTheme="majorHAnsi" w:cstheme="majorBidi"/>
+      <w:rFonts w:eastAsia="宋体" w:asciiTheme="majorHAnsi" w:hAnsiTheme="majorHAnsi" w:cstheme="majorBidi"/>
       <w:color w:val="4472C4" w:themeColor="accent1"/>
       <w:sz w:val="28"/>
       <w:szCs w:val="40"/>
+      <w14:textFill>
+        <w14:solidFill>
+          <w14:schemeClr w14:val="accent1"/>
+        </w14:solidFill>
+      </w14:textFill>
     </w:rPr>
   </w:style>
-  <w:style w:type="paragraph" w:styleId="3">
+  <w:style w:type="paragraph" w:styleId="4">
     <w:name w:val="heading 3"/>
-    <w:basedOn w:val="a"/>
-    <w:next w:val="a"/>
-    <w:link w:val="30"/>
-    <w:uiPriority w:val="9"/>
+    <w:basedOn w:val="1"/>
+    <w:next w:val="1"/>
+    <w:link w:val="20"/>
     <w:semiHidden/>
     <w:unhideWhenUsed/>
     <w:qFormat/>
-    <w:rsid w:val="00C17AA2"/>
+    <w:uiPriority w:val="9"/>
     <w:pPr>
       <w:keepNext/>
       <w:keepLines/>
@@ -3378,22 +3299,21 @@
       <w:outlineLvl w:val="2"/>
     </w:pPr>
     <w:rPr>
-      <w:rFonts w:asciiTheme="majorHAnsi" w:eastAsiaTheme="majorEastAsia" w:hAnsiTheme="majorHAnsi" w:cstheme="majorBidi"/>
-      <w:color w:val="2F5496" w:themeColor="accent1" w:themeShade="BF"/>
+      <w:rFonts w:asciiTheme="majorHAnsi" w:hAnsiTheme="majorHAnsi" w:eastAsiaTheme="majorEastAsia" w:cstheme="majorBidi"/>
+      <w:color w:val="2F5597" w:themeColor="accent1" w:themeShade="BF"/>
       <w:sz w:val="32"/>
       <w:szCs w:val="32"/>
     </w:rPr>
   </w:style>
-  <w:style w:type="paragraph" w:styleId="4">
+  <w:style w:type="paragraph" w:styleId="5">
     <w:name w:val="heading 4"/>
-    <w:basedOn w:val="a"/>
-    <w:next w:val="a"/>
-    <w:link w:val="40"/>
-    <w:uiPriority w:val="9"/>
+    <w:basedOn w:val="1"/>
+    <w:next w:val="1"/>
+    <w:link w:val="21"/>
     <w:semiHidden/>
     <w:unhideWhenUsed/>
     <w:qFormat/>
-    <w:rsid w:val="00C17AA2"/>
+    <w:uiPriority w:val="9"/>
     <w:pPr>
       <w:keepNext/>
       <w:keepLines/>
@@ -3402,21 +3322,20 @@
     </w:pPr>
     <w:rPr>
       <w:rFonts w:cstheme="majorBidi"/>
-      <w:color w:val="2F5496" w:themeColor="accent1" w:themeShade="BF"/>
+      <w:color w:val="2F5597" w:themeColor="accent1" w:themeShade="BF"/>
       <w:sz w:val="28"/>
       <w:szCs w:val="28"/>
     </w:rPr>
   </w:style>
-  <w:style w:type="paragraph" w:styleId="5">
+  <w:style w:type="paragraph" w:styleId="6">
     <w:name w:val="heading 5"/>
-    <w:basedOn w:val="a"/>
-    <w:next w:val="a"/>
-    <w:link w:val="50"/>
-    <w:uiPriority w:val="9"/>
+    <w:basedOn w:val="1"/>
+    <w:next w:val="1"/>
+    <w:link w:val="22"/>
     <w:semiHidden/>
     <w:unhideWhenUsed/>
     <w:qFormat/>
-    <w:rsid w:val="00C17AA2"/>
+    <w:uiPriority w:val="9"/>
     <w:pPr>
       <w:keepNext/>
       <w:keepLines/>
@@ -3425,21 +3344,20 @@
     </w:pPr>
     <w:rPr>
       <w:rFonts w:cstheme="majorBidi"/>
-      <w:color w:val="2F5496" w:themeColor="accent1" w:themeShade="BF"/>
+      <w:color w:val="2F5597" w:themeColor="accent1" w:themeShade="BF"/>
       <w:sz w:val="24"/>
       <w:szCs w:val="24"/>
     </w:rPr>
   </w:style>
-  <w:style w:type="paragraph" w:styleId="6">
+  <w:style w:type="paragraph" w:styleId="7">
     <w:name w:val="heading 6"/>
-    <w:basedOn w:val="a"/>
-    <w:next w:val="a"/>
-    <w:link w:val="60"/>
-    <w:uiPriority w:val="9"/>
+    <w:basedOn w:val="1"/>
+    <w:next w:val="1"/>
+    <w:link w:val="23"/>
     <w:semiHidden/>
     <w:unhideWhenUsed/>
     <w:qFormat/>
-    <w:rsid w:val="00C17AA2"/>
+    <w:uiPriority w:val="9"/>
     <w:pPr>
       <w:keepNext/>
       <w:keepLines/>
@@ -3450,19 +3368,18 @@
       <w:rFonts w:cstheme="majorBidi"/>
       <w:b/>
       <w:bCs/>
-      <w:color w:val="2F5496" w:themeColor="accent1" w:themeShade="BF"/>
+      <w:color w:val="2F5597" w:themeColor="accent1" w:themeShade="BF"/>
     </w:rPr>
   </w:style>
-  <w:style w:type="paragraph" w:styleId="7">
+  <w:style w:type="paragraph" w:styleId="8">
     <w:name w:val="heading 7"/>
-    <w:basedOn w:val="a"/>
-    <w:next w:val="a"/>
-    <w:link w:val="70"/>
-    <w:uiPriority w:val="9"/>
+    <w:basedOn w:val="1"/>
+    <w:next w:val="1"/>
+    <w:link w:val="24"/>
     <w:semiHidden/>
     <w:unhideWhenUsed/>
     <w:qFormat/>
-    <w:rsid w:val="00C17AA2"/>
+    <w:uiPriority w:val="9"/>
     <w:pPr>
       <w:keepNext/>
       <w:keepLines/>
@@ -3474,18 +3391,25 @@
       <w:b/>
       <w:bCs/>
       <w:color w:val="595959" w:themeColor="text1" w:themeTint="A6"/>
+      <w14:textFill>
+        <w14:solidFill>
+          <w14:schemeClr w14:val="tx1">
+            <w14:lumMod w14:val="65000"/>
+            <w14:lumOff w14:val="35000"/>
+          </w14:schemeClr>
+        </w14:solidFill>
+      </w14:textFill>
     </w:rPr>
   </w:style>
-  <w:style w:type="paragraph" w:styleId="8">
+  <w:style w:type="paragraph" w:styleId="9">
     <w:name w:val="heading 8"/>
-    <w:basedOn w:val="a"/>
-    <w:next w:val="a"/>
-    <w:link w:val="80"/>
-    <w:uiPriority w:val="9"/>
+    <w:basedOn w:val="1"/>
+    <w:next w:val="1"/>
+    <w:link w:val="25"/>
     <w:semiHidden/>
     <w:unhideWhenUsed/>
     <w:qFormat/>
-    <w:rsid w:val="00C17AA2"/>
+    <w:uiPriority w:val="9"/>
     <w:pPr>
       <w:keepNext/>
       <w:keepLines/>
@@ -3494,18 +3418,25 @@
     <w:rPr>
       <w:rFonts w:cstheme="majorBidi"/>
       <w:color w:val="595959" w:themeColor="text1" w:themeTint="A6"/>
+      <w14:textFill>
+        <w14:solidFill>
+          <w14:schemeClr w14:val="tx1">
+            <w14:lumMod w14:val="65000"/>
+            <w14:lumOff w14:val="35000"/>
+          </w14:schemeClr>
+        </w14:solidFill>
+      </w14:textFill>
     </w:rPr>
   </w:style>
-  <w:style w:type="paragraph" w:styleId="9">
+  <w:style w:type="paragraph" w:styleId="10">
     <w:name w:val="heading 9"/>
-    <w:basedOn w:val="a"/>
-    <w:next w:val="a"/>
-    <w:link w:val="90"/>
-    <w:uiPriority w:val="9"/>
+    <w:basedOn w:val="1"/>
+    <w:next w:val="1"/>
+    <w:link w:val="26"/>
     <w:semiHidden/>
     <w:unhideWhenUsed/>
     <w:qFormat/>
-    <w:rsid w:val="00C17AA2"/>
+    <w:uiPriority w:val="9"/>
     <w:pPr>
       <w:keepNext/>
       <w:keepLines/>
@@ -3514,21 +3445,30 @@
     <w:rPr>
       <w:rFonts w:eastAsiaTheme="majorEastAsia" w:cstheme="majorBidi"/>
       <w:color w:val="595959" w:themeColor="text1" w:themeTint="A6"/>
+      <w14:textFill>
+        <w14:solidFill>
+          <w14:schemeClr w14:val="tx1">
+            <w14:lumMod w14:val="65000"/>
+            <w14:lumOff w14:val="35000"/>
+          </w14:schemeClr>
+        </w14:solidFill>
+      </w14:textFill>
     </w:rPr>
   </w:style>
-  <w:style w:type="character" w:default="1" w:styleId="a0">
+  <w:style w:type="character" w:default="1" w:styleId="17">
     <w:name w:val="Default Paragraph Font"/>
-    <w:uiPriority w:val="1"/>
     <w:semiHidden/>
     <w:unhideWhenUsed/>
+    <w:qFormat/>
+    <w:uiPriority w:val="1"/>
   </w:style>
-  <w:style w:type="table" w:default="1" w:styleId="a1">
+  <w:style w:type="table" w:default="1" w:styleId="15">
     <w:name w:val="Normal Table"/>
-    <w:uiPriority w:val="99"/>
     <w:semiHidden/>
     <w:unhideWhenUsed/>
+    <w:qFormat/>
+    <w:uiPriority w:val="99"/>
     <w:tblPr>
-      <w:tblInd w:w="0" w:type="dxa"/>
       <w:tblCellMar>
         <w:top w:w="0" w:type="dxa"/>
         <w:left w:w="108" w:type="dxa"/>
@@ -3537,313 +3477,33 @@
       </w:tblCellMar>
     </w:tblPr>
   </w:style>
-  <w:style w:type="numbering" w:default="1" w:styleId="a2">
-    <w:name w:val="No List"/>
+  <w:style w:type="paragraph" w:styleId="11">
+    <w:name w:val="footer"/>
+    <w:basedOn w:val="1"/>
+    <w:link w:val="37"/>
+    <w:unhideWhenUsed/>
+    <w:qFormat/>
     <w:uiPriority w:val="99"/>
-    <w:semiHidden/>
-    <w:unhideWhenUsed/>
-  </w:style>
-  <w:style w:type="character" w:customStyle="1" w:styleId="10">
-    <w:name w:val="标题 1 字符"/>
-    <w:basedOn w:val="a0"/>
-    <w:link w:val="1"/>
-    <w:uiPriority w:val="9"/>
-    <w:rsid w:val="00F4304B"/>
+    <w:pPr>
+      <w:tabs>
+        <w:tab w:val="center" w:pos="4153"/>
+        <w:tab w:val="right" w:pos="8306"/>
+      </w:tabs>
+      <w:snapToGrid w:val="0"/>
+      <w:jc w:val="left"/>
+    </w:pPr>
     <w:rPr>
-      <w:rFonts w:asciiTheme="majorHAnsi" w:eastAsia="宋体" w:hAnsiTheme="majorHAnsi" w:cstheme="majorBidi"/>
-      <w:color w:val="EE0000"/>
-      <w:sz w:val="28"/>
-      <w:szCs w:val="48"/>
+      <w:sz w:val="18"/>
+      <w:szCs w:val="18"/>
     </w:rPr>
   </w:style>
-  <w:style w:type="character" w:customStyle="1" w:styleId="20">
-    <w:name w:val="标题 2 字符"/>
-    <w:basedOn w:val="a0"/>
-    <w:link w:val="2"/>
-    <w:uiPriority w:val="9"/>
-    <w:rsid w:val="00C42A14"/>
-    <w:rPr>
-      <w:rFonts w:asciiTheme="majorHAnsi" w:eastAsia="宋体" w:hAnsiTheme="majorHAnsi" w:cstheme="majorBidi"/>
-      <w:color w:val="4472C4" w:themeColor="accent1"/>
-      <w:sz w:val="28"/>
-      <w:szCs w:val="40"/>
-    </w:rPr>
-  </w:style>
-  <w:style w:type="character" w:customStyle="1" w:styleId="30">
-    <w:name w:val="标题 3 字符"/>
-    <w:basedOn w:val="a0"/>
-    <w:link w:val="3"/>
-    <w:uiPriority w:val="9"/>
-    <w:semiHidden/>
-    <w:rsid w:val="00C17AA2"/>
-    <w:rPr>
-      <w:rFonts w:asciiTheme="majorHAnsi" w:eastAsiaTheme="majorEastAsia" w:hAnsiTheme="majorHAnsi" w:cstheme="majorBidi"/>
-      <w:color w:val="2F5496" w:themeColor="accent1" w:themeShade="BF"/>
-      <w:sz w:val="32"/>
-      <w:szCs w:val="32"/>
-    </w:rPr>
-  </w:style>
-  <w:style w:type="character" w:customStyle="1" w:styleId="40">
-    <w:name w:val="标题 4 字符"/>
-    <w:basedOn w:val="a0"/>
-    <w:link w:val="4"/>
-    <w:uiPriority w:val="9"/>
-    <w:semiHidden/>
-    <w:rsid w:val="00C17AA2"/>
-    <w:rPr>
-      <w:rFonts w:cstheme="majorBidi"/>
-      <w:color w:val="2F5496" w:themeColor="accent1" w:themeShade="BF"/>
-      <w:sz w:val="28"/>
-      <w:szCs w:val="28"/>
-    </w:rPr>
-  </w:style>
-  <w:style w:type="character" w:customStyle="1" w:styleId="50">
-    <w:name w:val="标题 5 字符"/>
-    <w:basedOn w:val="a0"/>
-    <w:link w:val="5"/>
-    <w:uiPriority w:val="9"/>
-    <w:semiHidden/>
-    <w:rsid w:val="00C17AA2"/>
-    <w:rPr>
-      <w:rFonts w:cstheme="majorBidi"/>
-      <w:color w:val="2F5496" w:themeColor="accent1" w:themeShade="BF"/>
-      <w:sz w:val="24"/>
-      <w:szCs w:val="24"/>
-    </w:rPr>
-  </w:style>
-  <w:style w:type="character" w:customStyle="1" w:styleId="60">
-    <w:name w:val="标题 6 字符"/>
-    <w:basedOn w:val="a0"/>
-    <w:link w:val="6"/>
-    <w:uiPriority w:val="9"/>
-    <w:semiHidden/>
-    <w:rsid w:val="00C17AA2"/>
-    <w:rPr>
-      <w:rFonts w:cstheme="majorBidi"/>
-      <w:b/>
-      <w:bCs/>
-      <w:color w:val="2F5496" w:themeColor="accent1" w:themeShade="BF"/>
-    </w:rPr>
-  </w:style>
-  <w:style w:type="character" w:customStyle="1" w:styleId="70">
-    <w:name w:val="标题 7 字符"/>
-    <w:basedOn w:val="a0"/>
-    <w:link w:val="7"/>
-    <w:uiPriority w:val="9"/>
-    <w:semiHidden/>
-    <w:rsid w:val="00C17AA2"/>
-    <w:rPr>
-      <w:rFonts w:cstheme="majorBidi"/>
-      <w:b/>
-      <w:bCs/>
-      <w:color w:val="595959" w:themeColor="text1" w:themeTint="A6"/>
-    </w:rPr>
-  </w:style>
-  <w:style w:type="character" w:customStyle="1" w:styleId="80">
-    <w:name w:val="标题 8 字符"/>
-    <w:basedOn w:val="a0"/>
-    <w:link w:val="8"/>
-    <w:uiPriority w:val="9"/>
-    <w:semiHidden/>
-    <w:rsid w:val="00C17AA2"/>
-    <w:rPr>
-      <w:rFonts w:cstheme="majorBidi"/>
-      <w:color w:val="595959" w:themeColor="text1" w:themeTint="A6"/>
-    </w:rPr>
-  </w:style>
-  <w:style w:type="character" w:customStyle="1" w:styleId="90">
-    <w:name w:val="标题 9 字符"/>
-    <w:basedOn w:val="a0"/>
-    <w:link w:val="9"/>
-    <w:uiPriority w:val="9"/>
-    <w:semiHidden/>
-    <w:rsid w:val="00C17AA2"/>
-    <w:rPr>
-      <w:rFonts w:eastAsiaTheme="majorEastAsia" w:cstheme="majorBidi"/>
-      <w:color w:val="595959" w:themeColor="text1" w:themeTint="A6"/>
-    </w:rPr>
-  </w:style>
-  <w:style w:type="paragraph" w:styleId="a3">
-    <w:name w:val="Title"/>
-    <w:basedOn w:val="a"/>
-    <w:next w:val="a"/>
-    <w:link w:val="a4"/>
-    <w:uiPriority w:val="10"/>
+  <w:style w:type="paragraph" w:styleId="12">
+    <w:name w:val="header"/>
+    <w:basedOn w:val="1"/>
+    <w:link w:val="36"/>
+    <w:unhideWhenUsed/>
     <w:qFormat/>
-    <w:rsid w:val="00C17AA2"/>
-    <w:pPr>
-      <w:spacing w:after="80"/>
-      <w:contextualSpacing/>
-      <w:jc w:val="center"/>
-    </w:pPr>
-    <w:rPr>
-      <w:rFonts w:asciiTheme="majorHAnsi" w:eastAsiaTheme="majorEastAsia" w:hAnsiTheme="majorHAnsi" w:cstheme="majorBidi"/>
-      <w:spacing w:val="-10"/>
-      <w:kern w:val="28"/>
-      <w:sz w:val="56"/>
-      <w:szCs w:val="56"/>
-    </w:rPr>
-  </w:style>
-  <w:style w:type="character" w:customStyle="1" w:styleId="a4">
-    <w:name w:val="标题 字符"/>
-    <w:basedOn w:val="a0"/>
-    <w:link w:val="a3"/>
-    <w:uiPriority w:val="10"/>
-    <w:rsid w:val="00C17AA2"/>
-    <w:rPr>
-      <w:rFonts w:asciiTheme="majorHAnsi" w:eastAsiaTheme="majorEastAsia" w:hAnsiTheme="majorHAnsi" w:cstheme="majorBidi"/>
-      <w:spacing w:val="-10"/>
-      <w:kern w:val="28"/>
-      <w:sz w:val="56"/>
-      <w:szCs w:val="56"/>
-    </w:rPr>
-  </w:style>
-  <w:style w:type="paragraph" w:styleId="a5">
-    <w:name w:val="Subtitle"/>
-    <w:basedOn w:val="a"/>
-    <w:next w:val="a"/>
-    <w:link w:val="a6"/>
-    <w:uiPriority w:val="11"/>
-    <w:qFormat/>
-    <w:rsid w:val="00C17AA2"/>
-    <w:pPr>
-      <w:numPr>
-        <w:ilvl w:val="1"/>
-      </w:numPr>
-      <w:spacing w:after="160"/>
-      <w:jc w:val="center"/>
-    </w:pPr>
-    <w:rPr>
-      <w:rFonts w:asciiTheme="majorHAnsi" w:eastAsiaTheme="majorEastAsia" w:hAnsiTheme="majorHAnsi" w:cstheme="majorBidi"/>
-      <w:color w:val="595959" w:themeColor="text1" w:themeTint="A6"/>
-      <w:spacing w:val="15"/>
-      <w:sz w:val="28"/>
-      <w:szCs w:val="28"/>
-    </w:rPr>
-  </w:style>
-  <w:style w:type="character" w:customStyle="1" w:styleId="a6">
-    <w:name w:val="副标题 字符"/>
-    <w:basedOn w:val="a0"/>
-    <w:link w:val="a5"/>
-    <w:uiPriority w:val="11"/>
-    <w:rsid w:val="00C17AA2"/>
-    <w:rPr>
-      <w:rFonts w:asciiTheme="majorHAnsi" w:eastAsiaTheme="majorEastAsia" w:hAnsiTheme="majorHAnsi" w:cstheme="majorBidi"/>
-      <w:color w:val="595959" w:themeColor="text1" w:themeTint="A6"/>
-      <w:spacing w:val="15"/>
-      <w:sz w:val="28"/>
-      <w:szCs w:val="28"/>
-    </w:rPr>
-  </w:style>
-  <w:style w:type="paragraph" w:styleId="a7">
-    <w:name w:val="Quote"/>
-    <w:basedOn w:val="a"/>
-    <w:next w:val="a"/>
-    <w:link w:val="a8"/>
-    <w:uiPriority w:val="29"/>
-    <w:qFormat/>
-    <w:rsid w:val="00C17AA2"/>
-    <w:pPr>
-      <w:spacing w:before="160" w:after="160"/>
-      <w:jc w:val="center"/>
-    </w:pPr>
-    <w:rPr>
-      <w:i/>
-      <w:iCs/>
-      <w:color w:val="404040" w:themeColor="text1" w:themeTint="BF"/>
-    </w:rPr>
-  </w:style>
-  <w:style w:type="character" w:customStyle="1" w:styleId="a8">
-    <w:name w:val="引用 字符"/>
-    <w:basedOn w:val="a0"/>
-    <w:link w:val="a7"/>
-    <w:uiPriority w:val="29"/>
-    <w:rsid w:val="00C17AA2"/>
-    <w:rPr>
-      <w:i/>
-      <w:iCs/>
-      <w:color w:val="404040" w:themeColor="text1" w:themeTint="BF"/>
-    </w:rPr>
-  </w:style>
-  <w:style w:type="paragraph" w:styleId="a9">
-    <w:name w:val="List Paragraph"/>
-    <w:basedOn w:val="a"/>
-    <w:uiPriority w:val="34"/>
-    <w:qFormat/>
-    <w:rsid w:val="00C17AA2"/>
-    <w:pPr>
-      <w:ind w:left="720"/>
-      <w:contextualSpacing/>
-    </w:pPr>
-  </w:style>
-  <w:style w:type="character" w:styleId="aa">
-    <w:name w:val="Intense Emphasis"/>
-    <w:basedOn w:val="a0"/>
-    <w:uiPriority w:val="21"/>
-    <w:qFormat/>
-    <w:rsid w:val="00C17AA2"/>
-    <w:rPr>
-      <w:i/>
-      <w:iCs/>
-      <w:color w:val="2F5496" w:themeColor="accent1" w:themeShade="BF"/>
-    </w:rPr>
-  </w:style>
-  <w:style w:type="paragraph" w:styleId="ab">
-    <w:name w:val="Intense Quote"/>
-    <w:basedOn w:val="a"/>
-    <w:next w:val="a"/>
-    <w:link w:val="ac"/>
-    <w:uiPriority w:val="30"/>
-    <w:qFormat/>
-    <w:rsid w:val="00C17AA2"/>
-    <w:pPr>
-      <w:pBdr>
-        <w:top w:val="single" w:sz="4" w:space="10" w:color="2F5496" w:themeColor="accent1" w:themeShade="BF"/>
-        <w:bottom w:val="single" w:sz="4" w:space="10" w:color="2F5496" w:themeColor="accent1" w:themeShade="BF"/>
-      </w:pBdr>
-      <w:spacing w:before="360" w:after="360"/>
-      <w:ind w:left="864" w:right="864"/>
-      <w:jc w:val="center"/>
-    </w:pPr>
-    <w:rPr>
-      <w:i/>
-      <w:iCs/>
-      <w:color w:val="2F5496" w:themeColor="accent1" w:themeShade="BF"/>
-    </w:rPr>
-  </w:style>
-  <w:style w:type="character" w:customStyle="1" w:styleId="ac">
-    <w:name w:val="明显引用 字符"/>
-    <w:basedOn w:val="a0"/>
-    <w:link w:val="ab"/>
-    <w:uiPriority w:val="30"/>
-    <w:rsid w:val="00C17AA2"/>
-    <w:rPr>
-      <w:i/>
-      <w:iCs/>
-      <w:color w:val="2F5496" w:themeColor="accent1" w:themeShade="BF"/>
-    </w:rPr>
-  </w:style>
-  <w:style w:type="character" w:styleId="ad">
-    <w:name w:val="Intense Reference"/>
-    <w:basedOn w:val="a0"/>
-    <w:uiPriority w:val="32"/>
-    <w:qFormat/>
-    <w:rsid w:val="00C17AA2"/>
-    <w:rPr>
-      <w:b/>
-      <w:bCs/>
-      <w:smallCaps/>
-      <w:color w:val="2F5496" w:themeColor="accent1" w:themeShade="BF"/>
-      <w:spacing w:val="5"/>
-    </w:rPr>
-  </w:style>
-  <w:style w:type="paragraph" w:styleId="ae">
-    <w:name w:val="header"/>
-    <w:basedOn w:val="a"/>
-    <w:link w:val="af"/>
     <w:uiPriority w:val="99"/>
-    <w:unhideWhenUsed/>
-    <w:rsid w:val="002617AA"/>
     <w:pPr>
       <w:tabs>
         <w:tab w:val="center" w:pos="4153"/>
@@ -3857,93 +3517,425 @@
       <w:szCs w:val="18"/>
     </w:rPr>
   </w:style>
-  <w:style w:type="character" w:customStyle="1" w:styleId="af">
+  <w:style w:type="paragraph" w:styleId="13">
+    <w:name w:val="Subtitle"/>
+    <w:basedOn w:val="1"/>
+    <w:next w:val="1"/>
+    <w:link w:val="28"/>
+    <w:qFormat/>
+    <w:uiPriority w:val="11"/>
+    <w:pPr>
+      <w:spacing w:after="160"/>
+      <w:jc w:val="center"/>
+    </w:pPr>
+    <w:rPr>
+      <w:rFonts w:asciiTheme="majorHAnsi" w:hAnsiTheme="majorHAnsi" w:eastAsiaTheme="majorEastAsia" w:cstheme="majorBidi"/>
+      <w:color w:val="595959" w:themeColor="text1" w:themeTint="A6"/>
+      <w:spacing w:val="15"/>
+      <w:sz w:val="28"/>
+      <w:szCs w:val="28"/>
+      <w14:textFill>
+        <w14:solidFill>
+          <w14:schemeClr w14:val="tx1">
+            <w14:lumMod w14:val="65000"/>
+            <w14:lumOff w14:val="35000"/>
+          </w14:schemeClr>
+        </w14:solidFill>
+      </w14:textFill>
+    </w:rPr>
+  </w:style>
+  <w:style w:type="paragraph" w:styleId="14">
+    <w:name w:val="Title"/>
+    <w:basedOn w:val="1"/>
+    <w:next w:val="1"/>
+    <w:link w:val="27"/>
+    <w:qFormat/>
+    <w:uiPriority w:val="10"/>
+    <w:pPr>
+      <w:spacing w:after="80"/>
+      <w:contextualSpacing/>
+      <w:jc w:val="center"/>
+    </w:pPr>
+    <w:rPr>
+      <w:rFonts w:asciiTheme="majorHAnsi" w:hAnsiTheme="majorHAnsi" w:eastAsiaTheme="majorEastAsia" w:cstheme="majorBidi"/>
+      <w:spacing w:val="-10"/>
+      <w:kern w:val="28"/>
+      <w:sz w:val="56"/>
+      <w:szCs w:val="56"/>
+    </w:rPr>
+  </w:style>
+  <w:style w:type="table" w:styleId="16">
+    <w:name w:val="Table Grid"/>
+    <w:basedOn w:val="15"/>
+    <w:qFormat/>
+    <w:uiPriority w:val="39"/>
+    <w:tblPr>
+      <w:tblBorders>
+        <w:top w:val="single" w:color="auto" w:sz="4" w:space="0"/>
+        <w:left w:val="single" w:color="auto" w:sz="4" w:space="0"/>
+        <w:bottom w:val="single" w:color="auto" w:sz="4" w:space="0"/>
+        <w:right w:val="single" w:color="auto" w:sz="4" w:space="0"/>
+        <w:insideH w:val="single" w:color="auto" w:sz="4" w:space="0"/>
+        <w:insideV w:val="single" w:color="auto" w:sz="4" w:space="0"/>
+      </w:tblBorders>
+    </w:tblPr>
+  </w:style>
+  <w:style w:type="character" w:customStyle="1" w:styleId="18">
+    <w:name w:val="标题 1 字符"/>
+    <w:basedOn w:val="17"/>
+    <w:link w:val="2"/>
+    <w:qFormat/>
+    <w:uiPriority w:val="9"/>
+    <w:rPr>
+      <w:rFonts w:eastAsia="宋体" w:asciiTheme="majorHAnsi" w:hAnsiTheme="majorHAnsi" w:cstheme="majorBidi"/>
+      <w:color w:val="EE0000"/>
+      <w:sz w:val="28"/>
+      <w:szCs w:val="48"/>
+    </w:rPr>
+  </w:style>
+  <w:style w:type="character" w:customStyle="1" w:styleId="19">
+    <w:name w:val="标题 2 字符"/>
+    <w:basedOn w:val="17"/>
+    <w:link w:val="3"/>
+    <w:qFormat/>
+    <w:uiPriority w:val="9"/>
+    <w:rPr>
+      <w:rFonts w:eastAsia="宋体" w:asciiTheme="majorHAnsi" w:hAnsiTheme="majorHAnsi" w:cstheme="majorBidi"/>
+      <w:color w:val="4472C4" w:themeColor="accent1"/>
+      <w:sz w:val="28"/>
+      <w:szCs w:val="40"/>
+      <w14:textFill>
+        <w14:solidFill>
+          <w14:schemeClr w14:val="accent1"/>
+        </w14:solidFill>
+      </w14:textFill>
+    </w:rPr>
+  </w:style>
+  <w:style w:type="character" w:customStyle="1" w:styleId="20">
+    <w:name w:val="标题 3 字符"/>
+    <w:basedOn w:val="17"/>
+    <w:link w:val="4"/>
+    <w:semiHidden/>
+    <w:qFormat/>
+    <w:uiPriority w:val="9"/>
+    <w:rPr>
+      <w:rFonts w:asciiTheme="majorHAnsi" w:hAnsiTheme="majorHAnsi" w:eastAsiaTheme="majorEastAsia" w:cstheme="majorBidi"/>
+      <w:color w:val="2F5597" w:themeColor="accent1" w:themeShade="BF"/>
+      <w:sz w:val="32"/>
+      <w:szCs w:val="32"/>
+    </w:rPr>
+  </w:style>
+  <w:style w:type="character" w:customStyle="1" w:styleId="21">
+    <w:name w:val="标题 4 字符"/>
+    <w:basedOn w:val="17"/>
+    <w:link w:val="5"/>
+    <w:semiHidden/>
+    <w:qFormat/>
+    <w:uiPriority w:val="9"/>
+    <w:rPr>
+      <w:rFonts w:cstheme="majorBidi"/>
+      <w:color w:val="2F5597" w:themeColor="accent1" w:themeShade="BF"/>
+      <w:sz w:val="28"/>
+      <w:szCs w:val="28"/>
+    </w:rPr>
+  </w:style>
+  <w:style w:type="character" w:customStyle="1" w:styleId="22">
+    <w:name w:val="标题 5 字符"/>
+    <w:basedOn w:val="17"/>
+    <w:link w:val="6"/>
+    <w:semiHidden/>
+    <w:qFormat/>
+    <w:uiPriority w:val="9"/>
+    <w:rPr>
+      <w:rFonts w:cstheme="majorBidi"/>
+      <w:color w:val="2F5597" w:themeColor="accent1" w:themeShade="BF"/>
+      <w:sz w:val="24"/>
+      <w:szCs w:val="24"/>
+    </w:rPr>
+  </w:style>
+  <w:style w:type="character" w:customStyle="1" w:styleId="23">
+    <w:name w:val="标题 6 字符"/>
+    <w:basedOn w:val="17"/>
+    <w:link w:val="7"/>
+    <w:semiHidden/>
+    <w:qFormat/>
+    <w:uiPriority w:val="9"/>
+    <w:rPr>
+      <w:rFonts w:cstheme="majorBidi"/>
+      <w:b/>
+      <w:bCs/>
+      <w:color w:val="2F5597" w:themeColor="accent1" w:themeShade="BF"/>
+    </w:rPr>
+  </w:style>
+  <w:style w:type="character" w:customStyle="1" w:styleId="24">
+    <w:name w:val="标题 7 字符"/>
+    <w:basedOn w:val="17"/>
+    <w:link w:val="8"/>
+    <w:semiHidden/>
+    <w:qFormat/>
+    <w:uiPriority w:val="9"/>
+    <w:rPr>
+      <w:rFonts w:cstheme="majorBidi"/>
+      <w:b/>
+      <w:bCs/>
+      <w:color w:val="595959" w:themeColor="text1" w:themeTint="A6"/>
+      <w14:textFill>
+        <w14:solidFill>
+          <w14:schemeClr w14:val="tx1">
+            <w14:lumMod w14:val="65000"/>
+            <w14:lumOff w14:val="35000"/>
+          </w14:schemeClr>
+        </w14:solidFill>
+      </w14:textFill>
+    </w:rPr>
+  </w:style>
+  <w:style w:type="character" w:customStyle="1" w:styleId="25">
+    <w:name w:val="标题 8 字符"/>
+    <w:basedOn w:val="17"/>
+    <w:link w:val="9"/>
+    <w:semiHidden/>
+    <w:qFormat/>
+    <w:uiPriority w:val="9"/>
+    <w:rPr>
+      <w:rFonts w:cstheme="majorBidi"/>
+      <w:color w:val="595959" w:themeColor="text1" w:themeTint="A6"/>
+      <w14:textFill>
+        <w14:solidFill>
+          <w14:schemeClr w14:val="tx1">
+            <w14:lumMod w14:val="65000"/>
+            <w14:lumOff w14:val="35000"/>
+          </w14:schemeClr>
+        </w14:solidFill>
+      </w14:textFill>
+    </w:rPr>
+  </w:style>
+  <w:style w:type="character" w:customStyle="1" w:styleId="26">
+    <w:name w:val="标题 9 字符"/>
+    <w:basedOn w:val="17"/>
+    <w:link w:val="10"/>
+    <w:semiHidden/>
+    <w:qFormat/>
+    <w:uiPriority w:val="9"/>
+    <w:rPr>
+      <w:rFonts w:eastAsiaTheme="majorEastAsia" w:cstheme="majorBidi"/>
+      <w:color w:val="595959" w:themeColor="text1" w:themeTint="A6"/>
+      <w14:textFill>
+        <w14:solidFill>
+          <w14:schemeClr w14:val="tx1">
+            <w14:lumMod w14:val="65000"/>
+            <w14:lumOff w14:val="35000"/>
+          </w14:schemeClr>
+        </w14:solidFill>
+      </w14:textFill>
+    </w:rPr>
+  </w:style>
+  <w:style w:type="character" w:customStyle="1" w:styleId="27">
+    <w:name w:val="标题 字符"/>
+    <w:basedOn w:val="17"/>
+    <w:link w:val="14"/>
+    <w:qFormat/>
+    <w:uiPriority w:val="10"/>
+    <w:rPr>
+      <w:rFonts w:asciiTheme="majorHAnsi" w:hAnsiTheme="majorHAnsi" w:eastAsiaTheme="majorEastAsia" w:cstheme="majorBidi"/>
+      <w:spacing w:val="-10"/>
+      <w:kern w:val="28"/>
+      <w:sz w:val="56"/>
+      <w:szCs w:val="56"/>
+    </w:rPr>
+  </w:style>
+  <w:style w:type="character" w:customStyle="1" w:styleId="28">
+    <w:name w:val="副标题 字符"/>
+    <w:basedOn w:val="17"/>
+    <w:link w:val="13"/>
+    <w:qFormat/>
+    <w:uiPriority w:val="11"/>
+    <w:rPr>
+      <w:rFonts w:asciiTheme="majorHAnsi" w:hAnsiTheme="majorHAnsi" w:eastAsiaTheme="majorEastAsia" w:cstheme="majorBidi"/>
+      <w:color w:val="595959" w:themeColor="text1" w:themeTint="A6"/>
+      <w:spacing w:val="15"/>
+      <w:sz w:val="28"/>
+      <w:szCs w:val="28"/>
+      <w14:textFill>
+        <w14:solidFill>
+          <w14:schemeClr w14:val="tx1">
+            <w14:lumMod w14:val="65000"/>
+            <w14:lumOff w14:val="35000"/>
+          </w14:schemeClr>
+        </w14:solidFill>
+      </w14:textFill>
+    </w:rPr>
+  </w:style>
+  <w:style w:type="paragraph" w:styleId="29">
+    <w:name w:val="Quote"/>
+    <w:basedOn w:val="1"/>
+    <w:next w:val="1"/>
+    <w:link w:val="30"/>
+    <w:qFormat/>
+    <w:uiPriority w:val="29"/>
+    <w:pPr>
+      <w:spacing w:before="160" w:after="160"/>
+      <w:jc w:val="center"/>
+    </w:pPr>
+    <w:rPr>
+      <w:i/>
+      <w:iCs/>
+      <w:color w:val="404040" w:themeColor="text1" w:themeTint="BF"/>
+      <w14:textFill>
+        <w14:solidFill>
+          <w14:schemeClr w14:val="tx1">
+            <w14:lumMod w14:val="75000"/>
+            <w14:lumOff w14:val="25000"/>
+          </w14:schemeClr>
+        </w14:solidFill>
+      </w14:textFill>
+    </w:rPr>
+  </w:style>
+  <w:style w:type="character" w:customStyle="1" w:styleId="30">
+    <w:name w:val="引用 字符"/>
+    <w:basedOn w:val="17"/>
+    <w:link w:val="29"/>
+    <w:qFormat/>
+    <w:uiPriority w:val="29"/>
+    <w:rPr>
+      <w:i/>
+      <w:iCs/>
+      <w:color w:val="404040" w:themeColor="text1" w:themeTint="BF"/>
+      <w14:textFill>
+        <w14:solidFill>
+          <w14:schemeClr w14:val="tx1">
+            <w14:lumMod w14:val="75000"/>
+            <w14:lumOff w14:val="25000"/>
+          </w14:schemeClr>
+        </w14:solidFill>
+      </w14:textFill>
+    </w:rPr>
+  </w:style>
+  <w:style w:type="paragraph" w:styleId="31">
+    <w:name w:val="List Paragraph"/>
+    <w:basedOn w:val="1"/>
+    <w:qFormat/>
+    <w:uiPriority w:val="34"/>
+    <w:pPr>
+      <w:ind w:left="720"/>
+      <w:contextualSpacing/>
+    </w:pPr>
+  </w:style>
+  <w:style w:type="character" w:customStyle="1" w:styleId="32">
+    <w:name w:val="Intense Emphasis"/>
+    <w:basedOn w:val="17"/>
+    <w:qFormat/>
+    <w:uiPriority w:val="21"/>
+    <w:rPr>
+      <w:i/>
+      <w:iCs/>
+      <w:color w:val="2F5597" w:themeColor="accent1" w:themeShade="BF"/>
+    </w:rPr>
+  </w:style>
+  <w:style w:type="paragraph" w:styleId="33">
+    <w:name w:val="Intense Quote"/>
+    <w:basedOn w:val="1"/>
+    <w:next w:val="1"/>
+    <w:link w:val="34"/>
+    <w:qFormat/>
+    <w:uiPriority w:val="30"/>
+    <w:pPr>
+      <w:pBdr>
+        <w:top w:val="single" w:color="2F5496" w:themeColor="accent1" w:themeShade="BF" w:sz="4" w:space="10"/>
+        <w:bottom w:val="single" w:color="2F5496" w:themeColor="accent1" w:themeShade="BF" w:sz="4" w:space="10"/>
+      </w:pBdr>
+      <w:spacing w:before="360" w:after="360"/>
+      <w:ind w:left="864" w:right="864"/>
+      <w:jc w:val="center"/>
+    </w:pPr>
+    <w:rPr>
+      <w:i/>
+      <w:iCs/>
+      <w:color w:val="2F5597" w:themeColor="accent1" w:themeShade="BF"/>
+    </w:rPr>
+  </w:style>
+  <w:style w:type="character" w:customStyle="1" w:styleId="34">
+    <w:name w:val="明显引用 字符"/>
+    <w:basedOn w:val="17"/>
+    <w:link w:val="33"/>
+    <w:qFormat/>
+    <w:uiPriority w:val="30"/>
+    <w:rPr>
+      <w:i/>
+      <w:iCs/>
+      <w:color w:val="2F5597" w:themeColor="accent1" w:themeShade="BF"/>
+    </w:rPr>
+  </w:style>
+  <w:style w:type="character" w:customStyle="1" w:styleId="35">
+    <w:name w:val="Intense Reference"/>
+    <w:basedOn w:val="17"/>
+    <w:qFormat/>
+    <w:uiPriority w:val="32"/>
+    <w:rPr>
+      <w:b/>
+      <w:bCs/>
+      <w:smallCaps/>
+      <w:color w:val="2F5597" w:themeColor="accent1" w:themeShade="BF"/>
+      <w:spacing w:val="5"/>
+    </w:rPr>
+  </w:style>
+  <w:style w:type="character" w:customStyle="1" w:styleId="36">
     <w:name w:val="页眉 字符"/>
-    <w:basedOn w:val="a0"/>
-    <w:link w:val="ae"/>
+    <w:basedOn w:val="17"/>
+    <w:link w:val="12"/>
+    <w:qFormat/>
     <w:uiPriority w:val="99"/>
-    <w:rsid w:val="002617AA"/>
     <w:rPr>
       <w:sz w:val="18"/>
       <w:szCs w:val="18"/>
     </w:rPr>
   </w:style>
-  <w:style w:type="paragraph" w:styleId="af0">
-    <w:name w:val="footer"/>
-    <w:basedOn w:val="a"/>
-    <w:link w:val="af1"/>
+  <w:style w:type="character" w:customStyle="1" w:styleId="37">
+    <w:name w:val="页脚 字符"/>
+    <w:basedOn w:val="17"/>
+    <w:link w:val="11"/>
+    <w:qFormat/>
     <w:uiPriority w:val="99"/>
-    <w:unhideWhenUsed/>
-    <w:rsid w:val="002617AA"/>
-    <w:pPr>
-      <w:tabs>
-        <w:tab w:val="center" w:pos="4153"/>
-        <w:tab w:val="right" w:pos="8306"/>
-      </w:tabs>
-      <w:snapToGrid w:val="0"/>
-      <w:jc w:val="left"/>
-    </w:pPr>
     <w:rPr>
       <w:sz w:val="18"/>
       <w:szCs w:val="18"/>
     </w:rPr>
   </w:style>
-  <w:style w:type="character" w:customStyle="1" w:styleId="af1">
-    <w:name w:val="页脚 字符"/>
-    <w:basedOn w:val="a0"/>
-    <w:link w:val="af0"/>
+  <w:style w:type="paragraph" w:customStyle="1" w:styleId="38">
+    <w:name w:val="Revision"/>
+    <w:hidden/>
+    <w:semiHidden/>
+    <w:qFormat/>
     <w:uiPriority w:val="99"/>
-    <w:rsid w:val="002617AA"/>
     <w:rPr>
-      <w:sz w:val="18"/>
-      <w:szCs w:val="18"/>
+      <w:rFonts w:asciiTheme="minorHAnsi" w:hAnsiTheme="minorHAnsi" w:eastAsiaTheme="minorEastAsia" w:cstheme="minorBidi"/>
+      <w:kern w:val="2"/>
+      <w:sz w:val="21"/>
+      <w:szCs w:val="22"/>
+      <w:lang w:val="en-US" w:eastAsia="zh-CN" w:bidi="ar-SA"/>
     </w:rPr>
   </w:style>
-  <w:style w:type="paragraph" w:styleId="af2">
-    <w:name w:val="Revision"/>
-    <w:hidden/>
-    <w:uiPriority w:val="99"/>
-    <w:semiHidden/>
-    <w:rsid w:val="00267CA5"/>
-  </w:style>
-  <w:style w:type="paragraph" w:customStyle="1" w:styleId="11">
+  <w:style w:type="paragraph" w:customStyle="1" w:styleId="39">
     <w:name w:val="我的样式1"/>
-    <w:basedOn w:val="1"/>
-    <w:next w:val="2"/>
-    <w:link w:val="12"/>
+    <w:basedOn w:val="2"/>
+    <w:next w:val="3"/>
+    <w:link w:val="40"/>
     <w:qFormat/>
-    <w:rsid w:val="00DF5496"/>
+    <w:uiPriority w:val="0"/>
     <w:pPr>
       <w:ind w:left="210" w:right="210"/>
     </w:pPr>
   </w:style>
-  <w:style w:type="character" w:customStyle="1" w:styleId="12">
+  <w:style w:type="character" w:customStyle="1" w:styleId="40">
     <w:name w:val="我的样式1 字符"/>
-    <w:basedOn w:val="10"/>
-    <w:link w:val="11"/>
-    <w:rsid w:val="00DF5496"/>
+    <w:basedOn w:val="18"/>
+    <w:link w:val="39"/>
+    <w:uiPriority w:val="0"/>
     <w:rPr>
-      <w:rFonts w:asciiTheme="majorHAnsi" w:eastAsia="宋体" w:hAnsiTheme="majorHAnsi" w:cstheme="majorBidi"/>
+      <w:rFonts w:eastAsia="宋体" w:asciiTheme="majorHAnsi" w:hAnsiTheme="majorHAnsi" w:cstheme="majorBidi"/>
       <w:color w:val="EE0000"/>
       <w:sz w:val="28"/>
       <w:szCs w:val="48"/>
     </w:rPr>
-  </w:style>
-  <w:style w:type="table" w:styleId="af3">
-    <w:name w:val="Table Grid"/>
-    <w:basedOn w:val="a1"/>
-    <w:uiPriority w:val="39"/>
-    <w:rsid w:val="00233543"/>
-    <w:tblPr>
-      <w:tblBorders>
-        <w:top w:val="single" w:sz="4" w:space="0" w:color="auto"/>
-        <w:left w:val="single" w:sz="4" w:space="0" w:color="auto"/>
-        <w:bottom w:val="single" w:sz="4" w:space="0" w:color="auto"/>
-        <w:right w:val="single" w:sz="4" w:space="0" w:color="auto"/>
-        <w:insideH w:val="single" w:sz="4" w:space="0" w:color="auto"/>
-        <w:insideV w:val="single" w:sz="4" w:space="0" w:color="auto"/>
-      </w:tblBorders>
-    </w:tblPr>
   </w:style>
 </w:styles>
 </file>
@@ -3991,7 +3983,7 @@
     </a:clrScheme>
     <a:fontScheme name="Office">
       <a:majorFont>
-        <a:latin typeface="等线 Light" panose="020F0302020204030204"/>
+        <a:latin typeface="等线 Light"/>
         <a:ea typeface=""/>
         <a:cs typeface=""/>
         <a:font script="Jpan" typeface="游ゴシック Light"/>
@@ -4024,26 +4016,9 @@
         <a:font script="Viet" typeface="Times New Roman"/>
         <a:font script="Uigh" typeface="Microsoft Uighur"/>
         <a:font script="Geor" typeface="Sylfaen"/>
-        <a:font script="Armn" typeface="Arial"/>
-        <a:font script="Bugi" typeface="Leelawadee UI"/>
-        <a:font script="Bopo" typeface="Microsoft JhengHei"/>
-        <a:font script="Java" typeface="Javanese Text"/>
-        <a:font script="Lisu" typeface="Segoe UI"/>
-        <a:font script="Mymr" typeface="Myanmar Text"/>
-        <a:font script="Nkoo" typeface="Ebrima"/>
-        <a:font script="Olck" typeface="Nirmala UI"/>
-        <a:font script="Osma" typeface="Ebrima"/>
-        <a:font script="Phag" typeface="Phagspa"/>
-        <a:font script="Syrn" typeface="Estrangelo Edessa"/>
-        <a:font script="Syrj" typeface="Estrangelo Edessa"/>
-        <a:font script="Syre" typeface="Estrangelo Edessa"/>
-        <a:font script="Sora" typeface="Nirmala UI"/>
-        <a:font script="Tale" typeface="Microsoft Tai Le"/>
-        <a:font script="Talu" typeface="Microsoft New Tai Lue"/>
-        <a:font script="Tfng" typeface="Ebrima"/>
       </a:majorFont>
       <a:minorFont>
-        <a:latin typeface="等线" panose="020F0502020204030204"/>
+        <a:latin typeface="等线"/>
         <a:ea typeface=""/>
         <a:cs typeface=""/>
         <a:font script="Jpan" typeface="游明朝"/>
@@ -4076,23 +4051,6 @@
         <a:font script="Viet" typeface="Arial"/>
         <a:font script="Uigh" typeface="Microsoft Uighur"/>
         <a:font script="Geor" typeface="Sylfaen"/>
-        <a:font script="Armn" typeface="Arial"/>
-        <a:font script="Bugi" typeface="Leelawadee UI"/>
-        <a:font script="Bopo" typeface="Microsoft JhengHei"/>
-        <a:font script="Java" typeface="Javanese Text"/>
-        <a:font script="Lisu" typeface="Segoe UI"/>
-        <a:font script="Mymr" typeface="Myanmar Text"/>
-        <a:font script="Nkoo" typeface="Ebrima"/>
-        <a:font script="Olck" typeface="Nirmala UI"/>
-        <a:font script="Osma" typeface="Ebrima"/>
-        <a:font script="Phag" typeface="Phagspa"/>
-        <a:font script="Syrn" typeface="Estrangelo Edessa"/>
-        <a:font script="Syrj" typeface="Estrangelo Edessa"/>
-        <a:font script="Syre" typeface="Estrangelo Edessa"/>
-        <a:font script="Sora" typeface="Nirmala UI"/>
-        <a:font script="Tale" typeface="Microsoft Tai Le"/>
-        <a:font script="Talu" typeface="Microsoft New Tai Lue"/>
-        <a:font script="Tfng" typeface="Ebrima"/>
       </a:minorFont>
     </a:fontScheme>
     <a:fmtScheme name="Office">
@@ -4234,12 +4192,6 @@
     </a:fmtScheme>
   </a:themeElements>
   <a:objectDefaults/>
-  <a:extraClrSchemeLst/>
-  <a:extLst>
-    <a:ext uri="{05A4C25C-085E-4340-85A3-A5531E510DB2}">
-      <thm15:themeFamily xmlns:thm15="http://schemas.microsoft.com/office/thememl/2012/main" name="Office Theme" id="{62F939B6-93AF-4DB8-9C6B-D6C7DFDC589F}" vid="{4A3C46E8-61CC-4603-A589-7422A47A8E4A}"/>
-    </a:ext>
-  </a:extLst>
 </a:theme>
 </file>
 
@@ -4249,8 +4201,6 @@
 
 <file path=customXml/itemProps1.xml><?xml version="1.0" encoding="utf-8"?>
 <ds:datastoreItem xmlns:ds="http://schemas.openxmlformats.org/officeDocument/2006/customXml" ds:itemID="{27192931-3417-4878-BA4B-E2E77FC3CEAF}">
-  <ds:schemaRefs>
-    <ds:schemaRef ds:uri="http://schemas.openxmlformats.org/officeDocument/2006/bibliography"/>
-  </ds:schemaRefs>
+  <ds:schemaRefs/>
 </ds:datastoreItem>
 </file>
</xml_diff>